<commit_message>
Docs: Beilagen A1.1 (Mitwirkungspflichten) and A1.2 (Abnahmevorschrift)
Filed next to the other tender annexes, indexed, and reflected in the
Lösungskonzept 6.4 (iteration/final acceptance, change requests, customer
contributions) and the criteria test README.

Co-Authored-By: Claude Opus 5 (1M context) <noreply@anthropic.com>
Claude-Session: https://claude.ai/code/session_0172UcBLUHFyT2AYz2qd9NbJ
</commit_message>
<xml_diff>
--- a/docs/anforderungskatalog/C2-Loesungskonzept-SLIM.docx
+++ b/docs/anforderungskatalog/C2-Loesungskonzept-SLIM.docx
@@ -1158,7 +1158,7 @@
         <w:t xml:space="preserve">Stammdaten (slm 36):</w:t>
       </w:r>
       <w:r>
-        <w:t xml:space="preserve"> Initialimport aus B1.6 «Areal_Grundlagen» und B1.7 Waffenliste per CSV/Excel in einen Prüfbereich (Staging-Tabellen); Abgleich über Koordinationsabschnitt-Nr., Stellungsraum-Name und Waffe/Kaliber; Prüfbericht mit Zeilenbezug; Übernahme erst nach fehlerfreiem Lauf. Datenqualität und Volumen werden mit der Auftraggeberin an den Originaldaten vorab geprüft [OFFEN: Testdaten].</w:t>
+        <w:t xml:space="preserve"> Initialimport aus B1.6 «Areal_Grundlagen» und B1.7 Waffenliste per CSV/Excel in einen Prüfbereich (Staging-Tabellen); Abgleich über Koordinationsabschnitt-Nr., Stellungsraum-Name und Waffe/Kaliber; Prüfbericht mit Zeilenbezug; Übernahme erst nach fehlerfreiem Lauf. Datenqualität und Volumen werden mit der Auftraggeberin an den Originaldaten vorab geprüft (Testdaten gemäss Mitwirkungspflichten A1.1, Ziffer 6).</w:t>
       </w:r>
     </w:p>
     <w:p>
@@ -2051,7 +2051,39 @@
         <w:spacing w:after="120"/>
       </w:pPr>
       <w:r>
-        <w:t xml:space="preserve">Benutzerhandbuch deutsch online und als PDF (Upload in der erweiterten Konfiguration); kontextsensitive Hilfe über Info-Elemente an jeder Maske aus den Übersetzungsressourcen, Anzeige unter zwei Sekunden; technische Dokumentation (Architektur, Datenmodell, Berechnung, Berechtigungen, Betrieb) im Repository, mit jedem Release nachgeführt; rollenbezogene Trainerschulung (Umfang gemäss FAQ 36/38). Abnahme: jede B1-Anforderung ist mit Prüfschritten als Testfall hinterlegt; die Kontrollwerte der Berechnung sind bereits als Tests erbracht.</w:t>
+        <w:t xml:space="preserve">Benutzerhandbuch deutsch online und als PDF (Upload in der erweiterten Konfiguration); kontextsensitive Hilfe über Info-Elemente an jeder Maske aus den Übersetzungsressourcen, Anzeige unter zwei Sekunden; technische Dokumentation (Architektur, Datenmodell, Berechnung, Berechtigungen, Betrieb) im Repository, mit jedem Release nachgeführt; rollenbezogene Trainerschulung (Umfang gemäss FAQ 36/38). </w:t>
+      </w:r>
+      <w:r>
+        <w:rPr>
+          <w:b/>
+          <w:bCs/>
+        </w:rPr>
+        <w:t xml:space="preserve">Abnahme (Beilage A1.2):</w:t>
+      </w:r>
+      <w:r>
+        <w:t xml:space="preserve"> Die Entwicklung läuft in Sprints von zwei bis drei Wochen mit formeller Iterationsabnahme: Vor dem Sprint Review liefert die Anbieterin die Zusammenfassung der umgesetzten Anforderungen, die Testfälle (aus den im Refinement vereinbarten Akzeptanzkriterien) und die Testprotokolle und stellt den Stand auf dem Akzeptanzsystem mit produktionsnahen Daten bereit; die Auftraggeberin protokolliert je Testobjekt abgenommen / bedingt / nicht abgenommen, Nachbesserungen erfolgen in der vereinbarten Frist. Jede B1-Anforderung ist heute schon als Testfall mit Prüfschritten hinterlegt (automatisierte End-to-End-Fälle je </w:t>
+      </w:r>
+      <w:r>
+        <w:rPr>
+          <w:rFonts w:ascii="Consolas" w:cs="Consolas" w:eastAsia="Consolas" w:hAnsi="Consolas"/>
+          <w:sz w:val="20"/>
+          <w:szCs w:val="20"/>
+          <w:shd w:fill="F2F2F2" w:val="clear"/>
+        </w:rPr>
+        <w:t xml:space="preserve">slm</w:t>
+      </w:r>
+      <w:r>
+        <w:t xml:space="preserve">-Nummer, die Kontrollwerte der Berechnung als Tests erbracht); die Schlussabnahme stützt sich auf das vollständige, aus diesen Fällen erzeugte Abnahmetestprotokoll. Abweichungen von B1 laufen ausschliesslich über den Change-Request-Prozess der Beilage (Auswirkungsanalyse Aufwand, Kosten, Termine, Risiken; Entscheid der Auftraggeberin); ein Q-Ansprechpartner der Anbieterin steht dem Qualitätsmanager der Auftraggeberin gegenüber. </w:t>
+      </w:r>
+      <w:r>
+        <w:rPr>
+          <w:b/>
+          <w:bCs/>
+        </w:rPr>
+        <w:t xml:space="preserve">Mitwirkung (Beilage A1.1):</w:t>
+      </w:r>
+      <w:r>
+        <w:t xml:space="preserve"> Das Konzept setzt die dort zugesagten Beiträge voraus – SPOC, Testdaten und Referenzfälle, Fachbestätigungen (Kapitel 4.3), Mitarbeit an Handbuch, Schulung, Migrations- und Testkonzept, Sprint Planning und Reviews.</w:t>
       </w:r>
     </w:p>
     <w:p>

</xml_diff>

<commit_message>
Fachregel O8: zero-weight rule only for Σ weights = 0, refuse option, no-source warning
distributeShots: even split only when every weight is 0 (partial zeros keep
the ratio), configurable onZeroWeights 'equal' | 'refuse', 'no-source'
warning when a combination has no source (quantity must be shown as nicht
zuordenbar, never dropped). Concept 4.2 sentence per the decision log.

Co-Authored-By: Claude Opus 5 (1M context) <noreply@anthropic.com>
Claude-Session: https://claude.ai/code/session_0172UcBLUHFyT2AYz2qd9NbJ
</commit_message>
<xml_diff>
--- a/docs/anforderungskatalog/C2-Loesungskonzept-SLIM.docx
+++ b/docs/anforderungskatalog/C2-Loesungskonzept-SLIM.docx
@@ -1480,7 +1480,17 @@
         <w:spacing w:after="40"/>
       </w:pPr>
       <w:r>
-        <w:t xml:space="preserve">Verteilung auf Quellen: jede Kombination Stellungsraum × Waffe kennt ihre Quellen des Zustands mit Gewicht (Kapitel 2.3); die Schusszahlen aus Schritt 2 werden im Verhältnis dieser Gewichte auf die Quellen (Schusslinien) verteilt – eine Kombination mit genau einer Quelle erhält alles. Sind alle Gewichte einer Kombination null (keine Betriebsdaten in der Grundlage), wird gleichverteilt und der Fall im Prüfbericht des Zustands gemeldet.</w:t>
+        <w:t xml:space="preserve">Verteilung auf Quellen: jede Kombination Stellungsraum × Waffe kennt ihre Quellen des Zustands mit Gewicht (Kapitel 2.3); die Schusszahlen aus Schritt 2 werden im Verhältnis dieser Gewichte auf die Quellen (Schusslinien) verteilt – eine Kombination mit genau einer Quelle erhält alles. Kombinationen ohne Gewicht in den Betriebsdaten werden gleichverteilt und im Berechnungsstand als Annahme gekennzeichnet; Kombinationen ohne Quelle werden als nicht zuordenbar ausgewiesen (Bestätigung durch KOMZ Lärm im Refinement; Verhalten Gleichverteilung/Verweigern konfigurierbar). </w:t>
+      </w:r>
+      <w:r>
+        <w:rPr>
+          <w:i/>
+          <w:iCs/>
+        </w:rPr>
+        <w:t xml:space="preserve">Prototyp:</w:t>
+      </w:r>
+      <w:r>
+        <w:t xml:space="preserve"> Verteilungsschritt im Kern umgesetzt und getestet, inkl. Dezimalmengen.</w:t>
       </w:r>
     </w:p>
     <w:p>

</xml_diff>

<commit_message>
Fachregel O8 final: refuse by default, released Ersatzregel, «nicht beurteilbar» carried to the UI
- distributeShots: Σ weights = 0 → refused (default); 'equal' only with a
  documented release (reference + date, carried in the result), flagged
  substituteRule; no-source warning
- NoiseState 'incomplete': never a colour, outranks every colour in the
  aggregation; no lower-bound («gesichert rot») rule — not provable for
  Anhang 7 (−7·log M, half-days)
- Assessment/simulation flag receivers whose usages the Zustand does not
  cover (missingSources), counts.incomplete; UI: striped pins, outline
  badge, counter tile, hint with the missing combinations, legends, i18n
- Tests: kernel default refusal + release, traffic light, assessment O8
  (WLR row removed → E4 incomplete, others untouched)

Co-Authored-By: Claude Opus 5 (1M context) <noreply@anthropic.com>
Claude-Session: https://claude.ai/code/session_0172UcBLUHFyT2AYz2qd9NbJ
</commit_message>
<xml_diff>
--- a/docs/anforderungskatalog/C2-Loesungskonzept-SLIM.docx
+++ b/docs/anforderungskatalog/C2-Loesungskonzept-SLIM.docx
@@ -1480,7 +1480,7 @@
         <w:spacing w:after="40"/>
       </w:pPr>
       <w:r>
-        <w:t xml:space="preserve">Verteilung auf Quellen: jede Kombination Stellungsraum × Waffe kennt ihre Quellen des Zustands mit Gewicht (Kapitel 2.3); die Schusszahlen aus Schritt 2 werden im Verhältnis dieser Gewichte auf die Quellen (Schusslinien) verteilt – eine Kombination mit genau einer Quelle erhält alles. Kombinationen ohne Gewicht in den Betriebsdaten werden gleichverteilt und im Berechnungsstand als Annahme gekennzeichnet; Kombinationen ohne Quelle werden als nicht zuordenbar ausgewiesen (Bestätigung durch KOMZ Lärm im Refinement; Verhalten Gleichverteilung/Verweigern konfigurierbar). </w:t>
+        <w:t xml:space="preserve">Verteilung auf Quellen: jede Kombination Stellungsraum × Waffe kennt ihre Quellen des Zustands mit Gewicht (Kapitel 2.3); die Schusszahlen aus Schritt 2 werden im Verhältnis dieser Gewichte auf die Quellen (Schusslinien) verteilt – eine Kombination mit genau einer Quelle erhält alles. Bei nicht verteilbaren oder nicht zuordenbaren positiven Schusszahlen wird die betroffene Gesamtbeurteilung als unvollständig und nicht abschliessend beurteilbar gekennzeichnet (Status «nicht beurteilbar» ohne Ampelfarbe, mit Prüfhinweis auf die betroffenen Kombinationen und den Zustand). Teilberechnungen können ergänzend angezeigt werden, werden jedoch nicht als gültige Gesamtbeurteilung ausgewiesen. Eine Gleichverteilung ist ausschliesslich nach dokumentierter Freigabe durch KOMZ Lärm zulässig (Parameter nur zusammen mit Referenz und Datum des Fachentscheids setzbar, Referenz wird im Berechnungsstand mitgeführt, Ergebnis trägt das Kennzeichen «Ersatzregel angewendet»); die Import-Validierung meldet Kombinationen mit Quellen, aber ohne Betriebsdaten bereits beim FGDB-Import. </w:t>
       </w:r>
       <w:r>
         <w:rPr>
@@ -1490,7 +1490,7 @@
         <w:t xml:space="preserve">Prototyp:</w:t>
       </w:r>
       <w:r>
-        <w:t xml:space="preserve"> Verteilungsschritt im Kern umgesetzt und getestet, inkl. Dezimalmengen.</w:t>
+        <w:t xml:space="preserve"> Verteilungsschritt, Verweigern als Standard, Status «nicht beurteilbar» bis in Detailmaske, Zähler und Export umgesetzt und getestet.</w:t>
       </w:r>
     </w:p>
     <w:p>

</xml_diff>

<commit_message>
Add Anlagenabgrenzung and adjust Sicherung concept according to FAQ
- Clarify Anlagenabgrenzung calculation basis in the documentation for Schiessplatz.
- Enhance Sicherung concept for completeness and consistency, ensuring system state, application version, and infrastructure configurations are comprehensively backed up.
- Include new FAQ references to establish context clarity and detail the methodology for data handling and reporting.
</commit_message>
<xml_diff>
--- a/docs/anforderungskatalog/C2-Loesungskonzept-SLIM.docx
+++ b/docs/anforderungskatalog/C2-Loesungskonzept-SLIM.docx
@@ -783,7 +783,17 @@
         <w:t xml:space="preserve">Berechnungsstand</w:t>
       </w:r>
       <w:r>
-        <w:t xml:space="preserve"> (Masken 5.18–5.21 «Berechnungen») jedes fachlich relevante Ergebnis unveränderbar: Zeitraum, Zustand, Parameter (Feiertagskalender, Grenzwerte, Ampelschwellen, Jahre der Mittelung), die verwendeten Nutzungen als vollständige Kopie (ID, Datum, Beginn, Ende, Nutzungsart, Stellungsraum, Waffe/Kaliber, Kategorie, Schusszahl, Herkunft), die Quellen mit ihren Gewichten, die WLR-Werte und Empfangspunkte (ES, Baujahr) des Zustands, Softwareversion des Berechnungskerns, Ergebnisse je Empfangspunkt, Ersteller und Zeitpunkt. Berechnungsstände sind unveränderbar (kein Update/Delete auf Datenbankebene, nur Archivieren); Zustände, Quellengewichte und WLR-Werte werden nach der Freigabe nicht mehr geändert, sondern als neuer Zustand importiert. Ein Berechnungsstand lässt sich später mit derselben Kernversion aus der eigenen Kopie nachrechnen (Prüfsumme über alle Eingaben) und mit dem aktuellen Stand vergleichen; er ist die Grundlage für MGDM-Stände und Exporte. Stellungsräume lassen sich zu Anlagen gruppieren; die Beurteilung erfolgt wahlweise je Anlage oder platzweit (B1 7.3, Abgrenzung im Refinement zu entscheiden). Jede Tabelle trägt </w:t>
+        <w:t xml:space="preserve"> (Masken 5.18–5.21 «Berechnungen») jedes fachlich relevante Ergebnis unveränderbar: Zeitraum, Zustand, Parameter (Feiertagskalender, Grenzwerte, Ampelschwellen, Jahre der Mittelung), die verwendeten Nutzungen als vollständige Kopie (ID, Datum, Beginn, Ende, Nutzungsart, Stellungsraum, Waffe/Kaliber, Kategorie, Schusszahl, Herkunft), die Quellen mit ihren Gewichten, die WLR-Werte und Empfangspunkte (ES, Baujahr) des Zustands, Softwareversion des Berechnungskerns, Ergebnisse je Empfangspunkt, Ersteller und Zeitpunkt. Berechnungsstände sind unveränderbar (kein Update/Delete auf Datenbankebene, nur Archivieren); Zustände, Quellengewichte und WLR-Werte werden nach der Freigabe nicht mehr geändert, sondern als neuer Zustand importiert. Ein Berechnungsstand lässt sich später mit derselben Kernversion aus der eigenen Kopie nachrechnen (Prüfsumme über alle Eingaben) und mit dem aktuellen Stand vergleichen; er ist die Grundlage für MGDM-Stände und Exporte. </w:t>
+      </w:r>
+      <w:r>
+        <w:rPr>
+          <w:b/>
+          <w:bCs/>
+        </w:rPr>
+        <w:t xml:space="preserve">Anlagenabgrenzung (B1 7.3, FAQ 93):</w:t>
+      </w:r>
+      <w:r>
+        <w:t xml:space="preserve"> Angebotsbasis ist die platzweite Berechnung aller Nutzungen und Anlagenteile eines Schiessplatzes. Zusätzliche getrennte Berechnungen für einzelne Anlagen sind nicht Bestandteil dieser Angebotsbasis; sie werden als Erweiterung unter LP5 behandelt. Eine freie Benutzerwahl zwischen anlagenweiser und platzweiter Beurteilung wird im Grundumfang nicht zugesagt. Jede Tabelle trägt </w:t>
       </w:r>
       <w:r>
         <w:rPr>
@@ -1465,7 +1475,7 @@
         <w:spacing w:after="40"/>
       </w:pPr>
       <w:r>
-        <w:t xml:space="preserve">Beurteilungspegel je Empfangspunkt (LSV): Anhang 9 (LSV Anhang 9 Ziffer 31) mit LAE1 = energetisches Mittel der Tag-Quellen + 10·log(Schuss Tag), LAE2 analog für den Abend, Lr = 10·log(10^(0.1·LAE1) + 10^(0.1·(LAE2 + K1))) − 10·log(T) + K2 mit K1 = 5 (Abendzuschlag), K2 = 15, T = Bezugszeit (Jahresstunden der Werktage); Anhang 7 mit Li je Waffenkategorie als energetischem Mittel, Ki = 10·log(Dw + 3·Ds) + 3·log(M) − 44, Lri = Li + Ki und Lr als energetischer Summe über die Kategorien. Leere Quellen und Nullfälle werden explizit behandelt (Marker «keine Energie» statt −∞).</w:t>
+        <w:t xml:space="preserve">Beurteilungspegel je Empfangspunkt (LSV): Anhang 9 gemäss Beilage B1.4, Formelblatt A9X: LAE1 = GEMW(M_Tag, LAE_Day) + 10·log10(Σ M_Tag); LAE2 = GEMW(M_Ausserhalb, LAE_Eve) + 10·log10(Σ M_Ausserhalb) + 5; Lr = 10·log10(10^(0.1·LAE1) + 10^(0.1·LAE2)) − 10·log10(T / 1 s) + 15. GEMW ist das mit den Schusszahlen gewichtete energetische Mittel über die Quellen; M_Tag und M_Ausserhalb sind die auf die Quellen verteilten mittleren jährlichen Schusszahlen innerhalb bzw. ausserhalb Werktag. Die feste Bezugszeit beträgt T = 52 × 5 × 12 × 3600 s = 11’232’000 s. Alle Logarithmen haben Basis 10; der Zuschlag für Schüsse ausserhalb Werktag (+5 dB) ist bereits in LAE2 enthalten und wird nicht nochmals addiert. Anhang 7 mit Li je Waffenkategorie als energetischem Mittel, Ki = 10·log(Dw + 3·Ds) + 3·log(M) − 44, Lri = Li + Ki und Lr als energetischer Summe über die Kategorien. Leere Quellen und Nullfälle werden explizit behandelt (Marker «keine Energie» statt −∞).</w:t>
       </w:r>
     </w:p>
     <w:p>
@@ -1529,7 +1539,7 @@
         <w:spacing w:after="120"/>
       </w:pPr>
       <w:r>
-        <w:t xml:space="preserve">Der Berechnungskern wird gegen die Formelblätter A9X/A7X der Beilage B1.4 getestet – gemäss FAQ 19 die verbindliche Umsetzungsvorlage – und zwar für alle zwölf Empfangspunkte je Anhang (Stand 21.09.2026). Sollwerte sind die Werte des Formelblatts; Toleranz: auf 0.1 dB gerundet identisch, ungerundet &lt; 10⁻⁶ dB gegen die gespeicherten Excel-Werte. Auszug (gerundet, in Klammern ungerundet):</w:t>
+        <w:t xml:space="preserve">Verbindliche Umsetzungsvorlage sind gemäss FAQ 19 die Formelblätter A9X/A7X der Beilage B1.4. Die automatisierten Kern-Tests prüfen zwölf Empfangspunkte je Anhang gegen hinterlegte Referenzwerte (Stand 21.09.2026); bei Anhang 7 verwendet der Standardtest für E8 den abweichenden Kernel-Wert 28.0 statt des A7X-Werts 28.1. Die Prüfungen umfassen gerundete Werte sowie einzelne ungerundete Kontrollwerte; eine durchgängige Übereinstimmung aller Excel-Werte innerhalb 10⁻⁶ dB ist damit nicht nachgewiesen. Auszug (Soll des Formelblatts / aktueller Kernstandard):</w:t>
       </w:r>
     </w:p>
     <w:tbl>
@@ -1837,7 +1847,7 @@
                 <w:sz w:val="19"/>
                 <w:szCs w:val="19"/>
               </w:rPr>
-              <w:t xml:space="preserve">28.1 / 28.0 (28.0803 / 28.0463, Sonderfall)</w:t>
+              <w:t xml:space="preserve">28.1 / 28.0 (rund 28.080 / 28.0463; offene Abweichung)</w:t>
             </w:r>
           </w:p>
         </w:tc>
@@ -1860,17 +1870,84 @@
         <w:t xml:space="preserve">Anhang 9:</w:t>
       </w:r>
       <w:r>
-        <w:t xml:space="preserve"> LAE1, LAE2 und Lr stimmen für alle zwölf Empfangspunkte mit dem Formelblatt überein (der sonARMS-Kernel selbst, Blatt A9p, zeigt für E8 14.3 dB, weil er Quellen unter seiner Relevanzschwelle weglässt; massgebend ist das Formelblatt). </w:t>
-      </w:r>
+        <w:t xml:space="preserve"> Die Tests vergleichen LAE1 und LAE2 auf zwei Dezimalstellen und Lr auf eine Dezimalstelle für alle zwölf Empfangspunkte mit den Referenzwerten aus A9X. Bei E8 beträgt Lr 14.5 dB; das Kernel-Ausgabeblatt A9p zeigt abweichend 14.3 dB.</w:t>
+      </w:r>
+    </w:p>
+    <w:p>
+      <w:pPr>
+        <w:spacing w:after="120"/>
+      </w:pPr>
       <w:r>
         <w:rPr>
           <w:b/>
           <w:bCs/>
         </w:rPr>
-        <w:t xml:space="preserve">Anhang 7:</w:t>
-      </w:r>
-      <w:r>
-        <w:t xml:space="preserve"> Li, Lri und Lr stimmen für elf Empfangspunkte überein; bei E8 liefert der Kern 28.046 dB, das Formelblatt 28.080 dB (Differenz 0.034 dB; angezeigt 28.0 gegenüber 28.1). Ursache, numerisch nachvollzogen: Das Formelblatt schreibt für die fünf Waffenkategorien ohne Schüsse (b–f) 0 dB in die Lri-Zellen und summiert diese energetisch mit – 28.046 dB entsprechen 637.7 Energieeinheiten, plus fünfmal 10^0 = 642.7 Einheiten = 28.080 dB, exakt der Excel-Wert; der sonARMS-Kernel (Blatt A7p) lässt leere Kategorien weg und zeigt 28.0. Beide Lesarten sind im Kern als Parameter hinterlegt und getestet (Standard heute: Lesart des Kernels, Marker «keine Energie»; Umschalten auf die Formelblatt-Lesart ohne Codeänderung); bei lauten Empfangspunkten ist der Effekt unsichtbar. Die Fachstelle bestätigt die massgebende Lesart im Refinement, die Abnahmetoleranz (absolute Abweichung je Wert) wird mit ihr festgelegt und in den Tests hinterlegt. Zweite Stufe: 25 Rechenfälle am synthetischen Testplatz S laufen durch die ganze Kette (Datenbank → Betriebsdaten → Verteilung → Pegel → Anzeige und Ampel), jeder Sollwert aus einer Handrechnung mit unabhängiger Gegenrechnung – Trennung 12:00, Halbtage (2 h = ½, 2 h 01 = 1), Feiertage ganz und halb, Mehrfachnutzung im Halbtag, gemischte Baujahre (PW nur aus den Stellungsräumen nach 1985), fehlende Quellen, Schusszahl null, Jahresmittel ohne vorzeitige Rundung, metamorphe Prüfungen (Anhang 9: ×10 Schuss = +10 dB, Abend +5 dB; Anhang 7: ×10 Schuss bei gleichen Halbtagen = +3 dB) und die Rundungsgrenze 60.4/60.5 aus dem ungerundeten Wert. Jeder weitere Referenzfall der Auftraggeberin wird als Test aufgenommen; die Fachverantwortlichen bestätigen die Resultate vor der Abnahme. </w:t>
+        <w:t xml:space="preserve">Anhang 7 – verbindliche Referenzvariante:</w:t>
+      </w:r>
+      <w:r>
+        <w:t xml:space="preserve"> Für Angebot, Umsetzung und Abnahme gilt A7X gemäss FAQ 19. Bei E8 ist damit rund 28.080 dB, angezeigt 28.1 dB, der Sollwert. A7X summiert die Lri-Zellen der fünf leeren Waffenkategorien b–f mit je 0 dB energetisch mit. Diese Referenzvariante wird im Kern durch </w:t>
+      </w:r>
+      <w:r>
+        <w:rPr>
+          <w:rFonts w:ascii="Consolas" w:cs="Consolas" w:eastAsia="Consolas" w:hAnsi="Consolas"/>
+          <w:sz w:val="20"/>
+          <w:szCs w:val="20"/>
+          <w:shd w:fill="F2F2F2" w:val="clear"/>
+        </w:rPr>
+        <w:t xml:space="preserve">emptyCategories: zero</w:t>
+      </w:r>
+      <w:r>
+        <w:t xml:space="preserve"> abgebildet; der vorhandene E8-Test bestätigt die Anzeige 28.1 dB.</w:t>
+      </w:r>
+    </w:p>
+    <w:p>
+      <w:pPr>
+        <w:spacing w:after="120"/>
+      </w:pPr>
+      <w:r>
+        <w:rPr>
+          <w:b/>
+          <w:bCs/>
+        </w:rPr>
+        <w:t xml:space="preserve">Aktueller Prototyp-Stand:</w:t>
+      </w:r>
+      <w:r>
+        <w:t xml:space="preserve"> Der Anwendungsservice verwendet weiterhin den Kernstandard </w:t>
+      </w:r>
+      <w:r>
+        <w:rPr>
+          <w:rFonts w:ascii="Consolas" w:cs="Consolas" w:eastAsia="Consolas" w:hAnsi="Consolas"/>
+          <w:sz w:val="20"/>
+          <w:szCs w:val="20"/>
+          <w:shd w:fill="F2F2F2" w:val="clear"/>
+        </w:rPr>
+        <w:t xml:space="preserve">skip</w:t>
+      </w:r>
+      <w:r>
+        <w:t xml:space="preserve">, der leere Kategorien aus der Summe auslässt und bei E8 28.0463 dB, angezeigt 28.0 dB, liefert. Das ist eine offene Abweichung zur verbindlichen Referenzvariante und keine gleichwertige, frei wählbare Erfüllungsvariante. Vor Abnahme muss die Referenzvariante durchgängig im Anwendungsservice verwendet und durch Referenztests nachgewiesen werden. Bei den übrigen elf Empfangspunkten stimmen die Lr-Anzeigen auf eine Dezimale überein; eine ungerundete Identität wird nicht behauptet.</w:t>
+      </w:r>
+    </w:p>
+    <w:p>
+      <w:pPr>
+        <w:spacing w:after="120"/>
+      </w:pPr>
+      <w:r>
+        <w:rPr>
+          <w:b/>
+          <w:bCs/>
+        </w:rPr>
+        <w:t xml:space="preserve">Fachentscheid:</w:t>
+      </w:r>
+      <w:r>
+        <w:t xml:space="preserve"> Ein Fachentscheid ist ausschliesslich erforderlich, wenn die Auftraggeberin die von A7X abweichende Behandlung leerer Kategorien zulassen will. Er muss die freigegebene Regel, betroffene Fälle, Sollwerte und Abnahmetoleranzen dokumentieren und über das vereinbarte Änderungsverfahren verbindlich werden. Bis dahin bleibt A7X ohne Wahlvorbehalt massgebend; der E8-Nachweis des Prototyps ist offen.</w:t>
+      </w:r>
+    </w:p>
+    <w:p>
+      <w:pPr>
+        <w:spacing w:after="120"/>
+      </w:pPr>
+      <w:r>
+        <w:t xml:space="preserve">Zweite Stufe: 25 Rechenfälle am synthetischen Testplatz S laufen durch die ganze Kette (Datenbank → Betriebsdaten → Verteilung → Pegel → Anzeige und Ampel), jeder Sollwert aus einer Handrechnung mit unabhängiger Gegenrechnung – Trennung 12:00, Halbtage (2 h = ½, 2 h 01 = 1), Feiertage ganz und halb, Mehrfachnutzung im Halbtag, gemischte Baujahre (PW nur aus den Stellungsräumen nach 1985), fehlende Quellen, Schusszahl null, Jahresmittel ohne vorzeitige Rundung, metamorphe Prüfungen (Anhang 9: ×10 Schuss = +10 dB, Abend +5 dB; Anhang 7: ×10 Schuss bei gleichen Halbtagen = +3 dB) und die Rundungsgrenze 60.4/60.5 aus dem ungerundeten Wert. Jeder weitere Referenzfall der Auftraggeberin wird als Test aufgenommen; die Fachverantwortlichen bestätigen die Resultate vor der Abnahme. </w:t>
       </w:r>
       <w:r>
         <w:rPr>
@@ -2424,7 +2501,7 @@
         <w:spacing w:after="120"/>
       </w:pPr>
       <w:r>
-        <w:t xml:space="preserve">Ergonomie: einheitliche Masken (Design System), Fehlermeldungen mit Behebung, Tastaturbedienung (Kapitel 5). Betrieb: 99 % Mo–Fr 07–19 Uhr, genehmigte Wartungsfenster, Sicherung und Monitoring nach 2.5. Support: 1st Level durch die Trainer der Auftraggeberin (2–15 Personen, FAQ 20), 2nd/3rd Level durch die Anbieterin Mo–Fr 08–17 Uhr [OFFEN: Standort 3rd Level (E-Kriterium) benennen], Reaktion innerhalb vier Stunden, Behebungsbeginn innerhalb 24 Stunden, Behebung bei erheblichen Störungen in der Regel innerhalb 48 Stunden; Schweregrade (FAQ 4): kritisch = Produktion nicht nutzbar, hoch = Kernfunktion gestört ohne Umgehung, mittel = Umgehung vorhanden, niedrig = kosmetisch – mit abgestuften Reaktions- und Behebungszeiten; Meldeweg über Ticketsystem und Hotline, Stellvertretung im Support, Incident-/Problem-/Change-Prozess, Vor-Ort-Einsatz in Bern innerhalb eines Arbeitstags (Teil B 2.6.2/2.8); die Verfügbarkeit von 99 % wird monatlich gemessen und berichtet. Informationsschutz: Si001 wird in einer Kontrollübersicht auf die Massnahmen aus 2.4/2.5 abgebildet (Zugriffsrechte-Prozess, Anmeldemittel, Protokollierung, Break-Glass – Vorlagen aus einem bestehenden Bundesprojekt, für SLIM angepasst); Schweiz-Nachweis (E1/E5, FAQ 39–41/49): Das separate Datenhaltungskonzept inventarisiert alle Dienste mit Projekt- oder Fachdaten – Repository, CI/CD, Container-Registry, Logs und Monitoring, E-Mail-Versand, Fehlertracking, Druckdienst, Demo, allfällige KI-Werkzeuge – mit Standort und Datenkategorie; Fach-, Betriebs- und Personendaten bleiben ausschliesslich in der Schweiz. Quellcode-Repository und CI/CD enthalten weder Fach- noch Personendaten (der Demo-Datensatz ist synthetisch) und dürfen gemäss FAQ 39–41 ausserhalb liegen, wenn das Konzept dies ausweist [OFFEN: Standort des Repositories für die Betriebsphase festlegen – GitHub Enterprise (EU) oder Schweizer Git-Hosting]; Werkzeuge ausserhalb der Schweiz nur ohne Fach- und Personendaten und gemäss diesem Konzept.</w:t>
+        <w:t xml:space="preserve">Ergonomie: einheitliche Masken (Design System), Fehlermeldungen mit Behebung, Tastaturbedienung (Kapitel 5). Betrieb: 99 % Mo–Fr 07–19 Uhr, genehmigte Wartungsfenster, Sicherung und Monitoring nach 2.5. Support: 1st Level durch die Trainer der Auftraggeberin (2–15 Personen, FAQ 20), 2nd/3rd Level durch die Anbieterin Mo–Fr 08–17 Uhr [OFFEN: Standort 3rd Level (E-Kriterium) benennen], Reaktion innerhalb vier Stunden, Behebungsbeginn innerhalb 24 Stunden, Behebung bei erheblichen Störungen in der Regel innerhalb 48 Stunden; Schweregrade (FAQ 4): kritisch = Produktion nicht nutzbar, hoch = Kernfunktion gestört ohne Umgehung, mittel = Umgehung vorhanden, niedrig = kosmetisch – mit abgestuften Reaktions- und Behebungszeiten; Meldeweg über Ticketsystem und Hotline, Stellvertretung im Support, Incident-/Problem-/Change-Prozess, Vor-Ort-Einsatz in Bern innerhalb eines Arbeitstags (Teil B 2.6.2/2.8); die Verfügbarkeit von 99 % wird monatlich gemessen und berichtet. Informationsschutz: Si001 wird in einer Kontrollübersicht auf die Massnahmen aus 2.4/2.5 abgebildet (Zugriffsrechte-Prozess, Anmeldemittel, Protokollierung, Break-Glass – Vorlagen aus einem bestehenden Bundesprojekt, für SLIM angepasst); Schweiz-Nachweis (E1/E5, FAQ 39–41 und 49): Das separate Datenhaltungskonzept inventarisiert alle Dienste mit Applikations- oder Projektdaten – Repository, Projektdokumentation, CI/CD, Container-Registry, Logs und Monitoring, E-Mail-Versand, Ticketsystem, Fehlertracking, Druckdienst, Demo und allfällige KI-Werkzeuge – mit Datenkategorien, Datenflüssen, Verarbeitungs- und Speicherstandorten sowie Unterauftragnehmern. Für das angebotene Umsetzungskonzept wird die umfassende Standortvorgabe aus FAQ 49 zugrunde gelegt: Applikations- und Projektdaten werden ausschliesslich auf Informatiksystemen in der Schweiz gespeichert und bearbeitet, einschliesslich Quellcode, Build-Artefakten, Rand- und Metadaten, Zwischenspeicherung, Protokollierung, Telemetrie, Support und Backups, soweit diese einen Applikations- oder Projektbezug haben. Eine Cloud-Region «Europa/EU» genügt dafür nicht; synthetische Demo-Daten begründen keine pauschale Ausnahme für Repository oder CI/CD. Aus FAQ 39–41 wird daher keine generelle Freigabe ausländischer Dienste abgeleitet; eine abweichende Auslegung ist vor deren Einplanung mit der Auftraggeberin zu klären. Werkzeuge ausserhalb der Schweiz kommen nur für Vorgänge ohne jeglichen Bezug zu Applikations- oder Projektdaten in Betracht; E5 schafft auch für KI keine Ausnahme. [OFFEN: Dienste, Anbieter, Schweizer Verarbeitungs- und Speicherstandorte sowie Nachweise für die gesamte Entwicklungs- und Betriebskette vor Abgabe festlegen; bestehende Prototyp-Werkzeuge dagegen prüfen und erforderliche Umstellungen ausweisen.]</w:t>
       </w:r>
     </w:p>
     <w:p>
@@ -2488,7 +2565,7 @@
         <w:spacing w:after="120"/>
       </w:pPr>
       <w:r>
-        <w:t xml:space="preserve">Der Machbarkeitsnachweis stützt sich nicht auf Absichtserklärungen, sondern auf den lauffähigen Prototyp, der aus denselben Bausteinen besteht wie die angebotene Lösung (Angular, NestJS, TypeORM, galaxy-Plattform, Berechnungskern): Stand 21.09.2026 sind Anmeldung (2FA vorhanden, in der Demo nicht aktiviert), Rollen und Objektregeln, Übersicht Schiessplätze mit berechneten Ampeln, die Masken 5.11 Schusszahlen, 5.12 Details und 5.13 Simulation, die Datenverwaltung 5.14–5.16, 5.18–5.21 (inkl. Import mit Prüfbericht und Zeiger aktuell/MGDM) und 5.22–5.25, das Datenmodell nach B1 Kapitel 10, der Berechnungslauf, Benutzerverwaltung und Logbuch umgesetzt; der Berechnungskern reproduziert die Kontrollwerte der Beilage B1.4 und die Rechenfälle durch die Kette (Kapitel 4.3); die automatisierten Tests (Kapitel 6.1) und ein reproduzierbarer Setup-Wizard laufen bei jedem Build. Nicht umgesetzte Masken sind in der Oberfläche als «In Vorbereitung» gekennzeichnet; der Umsetzungsstand je Anforderung steht in der Matrix (Kapitel 7, Status P). Die Risiken der verbleibenden Arbeit sind dadurch eingegrenzt:</w:t>
+        <w:t xml:space="preserve">Der Machbarkeitsnachweis stützt sich nicht auf Absichtserklärungen, sondern auf den lauffähigen Prototyp, der aus denselben Bausteinen besteht wie die angebotene Lösung (Angular, NestJS, TypeORM, galaxy-Plattform, Berechnungskern): Stand 21.09.2026 sind Anmeldung (2FA vorhanden, in der Demo nicht aktiviert), Rollen und Objektregeln, Übersicht Schiessplätze mit berechneten Ampeln, die Masken 5.11 Schusszahlen, 5.12 Details und 5.13 Simulation, die Datenverwaltung 5.14–5.16, 5.18–5.21 (inkl. Import mit Prüfbericht und Zeiger aktuell/MGDM) und 5.22–5.25, das Datenmodell nach B1 Kapitel 10, der Berechnungslauf, Benutzerverwaltung und Logbuch umgesetzt; der Nachweisstand des Berechnungskerns gegen Beilage B1.4, die offene A7X-Abweichung bei E8 und die Rechenfälle durch die Kette sind in Kapitel 4.3 ausgewiesen; die automatisierten Tests (Kapitel 6.1) und ein reproduzierbarer Setup-Wizard laufen bei jedem Build. Nicht umgesetzte Masken sind in der Oberfläche als «In Vorbereitung» gekennzeichnet; der Umsetzungsstand je Anforderung steht in der Matrix (Kapitel 7, Status P). Die Risiken der verbleibenden Arbeit sind dadurch eingegrenzt:</w:t>
       </w:r>
     </w:p>
     <w:tbl>
@@ -2606,7 +2683,7 @@
                 <w:sz w:val="19"/>
                 <w:szCs w:val="19"/>
               </w:rPr>
-              <w:t xml:space="preserve">Lese-/Schreibprobe mit dem B1.2-Schema vor Abgabe; Rückfall: Export über PostGIS-Views + GeoPackage, FGDB-Konvertierung durch FME der Auftraggeberin</w:t>
+              <w:t xml:space="preserve">Lese-/Schreibprobe mit dem B1.2-Schema vor Abgabe, einschliesslich Domänen, Beziehungen, Geometrien und Identifikatoren. Bei Lücken stellt die Anbieterin einen geeigneten Konvertierungsweg bereit und weist den vollständigen FGDB-Import/-Export nach; Werkzeug, Lizenzen, Betrieb und Aufwand sind vor Abgabe zu konkretisieren. Die FME-Workbench der Auftraggeberin dient der fachlichen Validierung gemäss 3.2; eine zusätzliche Konvertierungsleistung wird nicht vorausgesetzt. GeoPackage oder ein anderes Austauschformat ersetzt FGDB nur nach ausdrücklicher Vereinbarung mit der Auftraggeberin über den Change-Request-Prozess.</w:t>
             </w:r>
           </w:p>
         </w:tc>
@@ -2731,7 +2808,7 @@
                 <w:sz w:val="19"/>
                 <w:szCs w:val="19"/>
               </w:rPr>
-              <w:t xml:space="preserve">Fachliche Regeln (Lesart E8, Anlagenabgrenzung 7.3, Ersatzregel der Verteilung)</w:t>
+              <w:t xml:space="preserve">Referenzabweichung E8, Ersatzregel der Verteilung und zusätzliche Anlagenberechnungen</w:t>
             </w:r>
           </w:p>
         </w:tc>
@@ -2753,7 +2830,7 @@
                 <w:sz w:val="19"/>
                 <w:szCs w:val="19"/>
               </w:rPr>
-              <w:t xml:space="preserve">Bestätigung durch die Fachstelle im Refinement; beide E8-Lesarten als Parameter mit Test hinterlegt, Ersatzregel nur mit dokumentierter Freigabe</w:t>
+              <w:t xml:space="preserve">A7X ist gemäss FAQ 19 verbindlich; E8-Abweichung des Anwendungsstandards vor Abnahme beheben und gemäss 4.3 nachweisen, abweichende Behandlung und Ersatzregel nur mit dokumentiertem Entscheid; Angebotsbasis gemäss FAQ 93 ist die platzweite Berechnung, zusätzliche getrennte Anlagenberechnungen werden unter LP5 behandelt (2.3)</w:t>
             </w:r>
           </w:p>
         </w:tc>
@@ -4172,7 +4249,7 @@
                 <w:sz w:val="17"/>
                 <w:szCs w:val="17"/>
               </w:rPr>
-              <w:t xml:space="preserve">P (Zuordnung LP1a/LP1b K)</w:t>
+              <w:t xml:space="preserve">P (LP1b gemäss FAQ 117)</w:t>
             </w:r>
           </w:p>
         </w:tc>
@@ -6125,7 +6202,7 @@
                 <w:sz w:val="17"/>
                 <w:szCs w:val="17"/>
               </w:rPr>
-              <w:t xml:space="preserve">P</w:t>
+              <w:t xml:space="preserve">Teilweise im Prototyp nachgewiesen; A7X-Referenzvariante verbindlich, E8-Abweichung im Anwendungsstandard offen (4.3)</w:t>
             </w:r>
           </w:p>
         </w:tc>

</xml_diff>

<commit_message>
Add C2-offene-angaben.md and update Dockerfile for secret management
- Introduced `C2-offene-angaben.md` to document open items before submission, offering a comprehensive checklist and FAQ correlation for clarity.
- Updated `Dockerfile` to improve secret handling by using BuildKit for appending `npm_token` during install phase without leaving traces in the image history.
- Removed redundant ARG declarations for secrets in `Dockerfile` to adhere to best practices.
</commit_message>
<xml_diff>
--- a/docs/anforderungskatalog/C2-Loesungskonzept-SLIM.docx
+++ b/docs/anforderungskatalog/C2-Loesungskonzept-SLIM.docx
@@ -566,7 +566,7 @@
                 <w:sz w:val="19"/>
                 <w:szCs w:val="19"/>
               </w:rPr>
-              <w:t xml:space="preserve">Lesen und Schreiben von File-Geodatabases nach dem Schema B1.2 sowie Excel mit Standardbibliotheken; Lese-/Schreibprobe mit dem B1.2-Schema vor Abgabe</w:t>
+              <w:t xml:space="preserve">Lesen und Schreiben von File-Geodatabases nach dem Schema B1.2 sowie Excel mit Standardbibliotheken; Lese-/Schreibprobe vor Abgabe mit den verfügbaren Referenzdaten; endgültiges Schema gemäss FAQ 99 im Projekt festlegen und anschliessend vollständig prüfen</w:t>
             </w:r>
           </w:p>
         </w:tc>
@@ -998,7 +998,7 @@
         <w:t xml:space="preserve">/api</w:t>
       </w:r>
       <w:r>
-        <w:t xml:space="preserve"> an den API-Container; Berechnungen, Importe und Exporte laufen in einem eigenen Worker-Container (Kapitel 4.4); PostgreSQL läuft als eigener Container mit persistentem Volume; Coolify verwaltet Bereitstellung, Umgebungsvariablen und Rollback, getrennt vom öffentlichen SLIM-Zugang (Zugang nur mit MFA und aus zugelassenen Netzen, Si001 Fernzugriff). Releases sind versionierte Artefakte mit Datenbankmigration und Smoke-Test über Health-Endpunkte. Rückfall: Migrationen werden rückwärtskompatibel geschrieben (erweitern statt umbenennen/löschen; Aufräumen erst im übernächsten Release), sodass das vorherige Image auf dem migrierten Schema lauffähig bleibt; jede Migration hat einen getesteten Down-Schritt; vor jedem Produktionsrelease wird eine Sicherung gezogen, und für nicht rückwärtskompatible Änderungen gilt ein abgestimmter Wiederherstellungsweg: Release im Wartungsfenster mit Schreibpause, PostgreSQL-Sicherung mit archivierten WAL-Segmenten (Point-in-Time-Recovery), Rückfall = Wiederherstellung auf den Zeitpunkt vor dem Release; die Rückfallgrenze (bis wann ein Rückfall ohne Datenverlust möglich ist) wird je Release festgelegt und kommuniziert. Der Rückfall wird auf dem Akzeptanzsystem geprobt. Sicherung (B1 12.8, FAQ 14): automatisch täglich und manuell vor Releases/Importen, Mehrgenerationen über zwölf Monate, RPO ein Tag, RTO zwei Tage, Integritätsprüfung jeder Sicherung (Prüfsumme und Probe-Restore), Alarm bei fehlender oder fehlerhafter Sicherung (slm 57), jährlicher Restore-Test, Kopie am Betriebsstandort und in einem zweiten Schweizer Standort, lesbarer Datendump (SQL/CSV) auf Verlangen. Monitoring: Health-Endpunkte, Metriken (Antwortzeiten, Fehlerraten, Jobs) und Alarmierung für den SLA-Nachweis (99 % Mo–Fr 07–19 Uhr). </w:t>
+        <w:t xml:space="preserve"> an den API-Container; Berechnungen, Importe und Exporte laufen in einem eigenen Worker-Container (Kapitel 4.4); PostgreSQL läuft als eigener Container mit persistentem Volume; Coolify verwaltet Bereitstellung, Umgebungsvariablen und Rollback, getrennt vom öffentlichen SLIM-Zugang (Zugang nur mit MFA und aus zugelassenen Netzen, Si001 Fernzugriff). Releases sind versionierte Artefakte mit Datenbankmigration und Smoke-Test über Health-Endpunkte. Rückfall: Migrationen werden rückwärtskompatibel geschrieben (erweitern statt umbenennen/löschen; Aufräumen erst im übernächsten Release), sodass das vorherige Image auf dem migrierten Schema lauffähig bleibt; jede Migration hat einen getesteten Down-Schritt; vor jedem Produktionsrelease wird eine Sicherung gezogen, und für nicht rückwärtskompatible Änderungen gilt ein abgestimmter Wiederherstellungsweg: Release im Wartungsfenster mit Schreibpause, PostgreSQL-Sicherung mit archivierten WAL-Segmenten (Point-in-Time-Recovery), Rückfall = Wiederherstellung auf den Zeitpunkt vor dem Release; die Rückfallgrenze (bis wann ein Rückfall ohne Datenverlust möglich ist) wird je Release festgelegt und kommuniziert. Der Rückfall wird auf dem Akzeptanzsystem geprobt. Sicherung (B1 12.8, FAQ 14/116): automatisch täglich und manuell vor Releases/Importen, Mehrgenerationen über zwölf Monate, RPO ein Tag, RTO zwei Tage, Integritätsprüfung jeder Sicherung (Prüfsumme und Probe-Restore), Alarm bei fehlender oder fehlerhafter Sicherung (slm 57), jährlicher Restore-Test, Kopie am Betriebsstandort und in einem zweiten Schweizer Standort, lesbarer Datendump (SQL/CSV) auf Verlangen. Gemäss FAQ 116 umfasst jede wiederherstellbare Sicherung den vollständigen, über alle Komponenten konsistenten Systemstand: Datenbank einschliesslich benötigter Transaktionsprotokolle, importierte Dateien und weitere persistente Dateibestände, passende Anwendungsversion und Container-Images, Datenbankschema und Migrationen sowie Infrastruktur-, Deployment- und Laufzeitkonfiguration. Für die Wiederherstellung erforderliche Schlüssel, Zertifikate und Secrets werden geschützt gesichert und nur berechtigten Wiederherstellungsverantwortlichen zugänglich gemacht. Ein Sicherungsmanifest ordnet Versionen, Sicherungszeitpunkt und Prüfsummen zusammengehörig zu; der Restore-Test stellt das Gesamtsystem aus diesem Stand wieder her und prüft Datenkonsistenz und Funktionsfähigkeit. Ein Datenbankdump allein ist kein vollständiges Systembackup. Monitoring: Health-Endpunkte, Metriken (Antwortzeiten, Fehlerraten, Jobs) und Alarmierung für den SLA-Nachweis (99 % Mo–Fr 07–19 Uhr). </w:t>
       </w:r>
       <w:r>
         <w:rPr>
@@ -1983,7 +1983,7 @@
         <w:t xml:space="preserve">Ressourcenisolation:</w:t>
       </w:r>
       <w:r>
-        <w:t xml:space="preserve"> Im Zielzustand rechnet nicht der API-Prozess, sondern ein getrennter Worker-Container (Isolation gegenüber der API), darin Worker-Threads für Parallelität, mit Warteschlange, begrenzter Parallelität (Anzahl CPU-Kerne) und Zeitlimit je Auftrag. Einzelberechnungen der Masken 5.12/5.13 haben Priorität vor Gesamtläufen (Ampeln der Übersicht, Jahresstatistik, Exporte), die im Hintergrund mit tagesaktuellem Ergebnis laufen (NFA erlaubt das). Eine aufwendige Berechnung blockiert so nie die API. Damit sie auch andere Berechnungen nicht verdrängt, gelten Ressourcenlimits und faire Verteilung: CPU- und Speicherlimits je Worker-Container, ein Zeitlimit je Auftrag (Abbruch mit Meldung statt Endlosbelegung), höchstens ein laufender Auftrag je Nutzer und Round-Robin über wartende Nutzer, reservierte Kapazität für Einzelberechnungen gegenüber Gesamtläufen. Die Wartezeit in der Warteschlange zählt zur gemessenen Antwortzeit (B1 12.5); überschreitet sie den Zielwert, alarmiert das Monitoring, und die API meldet dem Nutzer die voraussichtliche Wartezeit statt eines Timeouts. Weitere API- oder Worker-Container ermöglichen horizontale Skalierung; der erreichbare Durchsatz und die Antwortzeiten nach B1 12.5 werden im Lasttest (k6, Akzeptanzsystem, Datenbestand in Zielgrösse) nachgewiesen, die Kriterien-Tests messen sie laufend. </w:t>
+        <w:t xml:space="preserve"> Im Zielzustand rechnet nicht der API-Prozess, sondern ein getrennter Worker-Container (Isolation gegenüber der API), darin Worker-Threads für Parallelität, mit Warteschlange, begrenzter Parallelität (Anzahl CPU-Kerne) und Zeitlimit je Auftrag. Einzelberechnungen der Masken 5.12/5.13 haben Priorität vor Gesamtläufen (Ampeln der Übersicht, Jahresstatistik, Exporte), die im Hintergrund mit tagesaktuellem Ergebnis laufen (NFA erlaubt das). Eine aufwendige Berechnung blockiert so nie die API. Damit sie auch andere Berechnungen nicht verdrängt, gelten Ressourcenlimits und faire Verteilung: CPU- und Speicherlimits je Worker-Container, ein Zeitlimit je Auftrag (Abbruch mit Meldung statt Endlosbelegung), höchstens ein laufender Auftrag je Nutzer und Round-Robin über wartende Nutzer, reservierte Kapazität für Einzelberechnungen gegenüber Gesamtläufen. Die Wartezeit in der Warteschlange zählt zur gemessenen Antwortzeit (B1 12.5); überschreitet sie den Zielwert, alarmiert das Monitoring, und die API meldet dem Nutzer die voraussichtliche Wartezeit statt eines Timeouts. Weitere API- oder Worker-Container ermöglichen horizontale Skalierung; der Nachweis des erreichbaren Durchsatzes und der Antwortzeiten nach B1 12.5 ist als Lasttest geplant (k6, Akzeptanzsystem, Datenbestand in Zielgrösse). Die vorhandenen Messungen betreffen ausschliesslich den oben beschriebenen Berechnungskern und Service unter den genannten Testbedingungen. Die Performance-Kriterien-Tests sind derzeit Test-Skelette und liefern noch keine laufenden Messungen; ihre Implementierung und regelmässige Ausführung sind geplant. </w:t>
       </w:r>
       <w:r>
         <w:rPr>
@@ -2363,7 +2363,7 @@
         <w:spacing w:after="120"/>
       </w:pPr>
       <w:r>
-        <w:t xml:space="preserve">Mobile first: Tabbar und Seitenpanels auf dem Telefon, Sidebar ab Desktop, Tabellen als gestapelte Karten, Light/Dark persistent. DE/FR/IT (EN zusätzlich) über Übersetzungsressourcen je Fachbereich; Startsprache aus der Browser-Standardsprache, Wahl persistent, Berichte und Exporte in der gewählten Sprache, Formate lokalisiert (de-CH). Die französischen Übersetzungen liefert die Auftraggeberin (B1 12.2); die Anbieterin stellt dafür die Übersetzungsdateien (JSON je Fachbereich) und ein Übersetzungswerkzeug für externe Fachleute bereit, das Schlüssel, Ausgangstext und Kontext zeigt und fehlende oder veraltete Texte meldet; für IT beauftragt die Anbieterin eine Fachübersetzung mit Erfahrung in Bundesterminologie (im Angebot enthalten) [OFFEN: Büro vor Abgabe benennen]. Barrierefreiheit: Die Vorgabe (FAQ 9) nennt keine speziellen Anforderungen und lehnt sich an die Barrierefreiheitserklärung von ar.admin.ch an (Forum 128 zur Verbindlichkeit noch offen); die Anbieterin legt darüber hinaus eCH-0059 / WCAG 2.1 AA als eigenen Zielstandard zugrunde: Tastaturbedienung, sichtbarer Fokus, beschriftete Steuerelemente, Ampeln zusätzlich mit Symbol und Text, Karteninhalte als Tabelle, PDF-Ausgaben mit Struktur (Tagged PDF). Prüfung: automatisierte axe-Prüfung im Build plus manuelle Prüfung der Kernmasken je Release (Tastatur, Screenreader, Kontrast, Zoom 200 %). Optionale QR-Erfassung (slm 46–49): Der QR-Code je Stellungsraum enthält einen Deep Link mit signiertem Token (Schiessplatz, Stellungsraum, Ausgabedatum, Gültigkeit; HMAC mit mandantenspezifischem Schlüssel, Schlüsselwechsel macht alte Codes ungültig). Die API prüft Signatur, Gültigkeit und Zuordnung, bevor die Erfassungsmaske vorbelegt wird; ein ungültiger, abgelaufener oder manipulierter Code führt zu einer klaren Fehlermeldung ohne Erfassungsmöglichkeit, der Versuch wird protokolliert. Die Erfassungsmaske (slm 47/48, B1 11.2) zeigt Schiessplatz und Stellungsraum gesperrt vorbelegt, Tagesdatum editierbar, Beginn/Ende im Viertelstundenraster, Einheit mit Autovervollständigung, Nutzungskategorie mit ziviler Nutzungsart als bedingtem Pflichtfeld, Anzahl Personen, mehrere Zeilen Waffe/Kaliber mit Menge in Stück oder kg; Prüfung wie in 5.11, Erfolgs- und Fehleranzeige, Entwurf lokal in der PWA gehalten und bei Verbindungsabbruch beim nächsten Kontakt gesendet – mit Idempotenz-Schlüssel, damit Wiederholungen keine Doppelmeldung erzeugen; die Meldung selbst erfolgt mit angemeldetem Konto. </w:t>
+        <w:t xml:space="preserve">Mobile first: Tabbar und Seitenpanels auf dem Telefon, Sidebar ab Desktop, Tabellen als gestapelte Karten, Light/Dark persistent. DE/FR/IT (EN zusätzlich) über Übersetzungsressourcen je Fachbereich; Startsprache aus der Browser-Standardsprache, Wahl persistent, Berichte und Exporte in der gewählten Sprache, Formate lokalisiert (de-CH). Die französischen Übersetzungen liefert die Auftraggeberin (B1 12.2); die Anbieterin stellt dafür die Übersetzungsdateien (JSON je Fachbereich) und ein Übersetzungswerkzeug für externe Fachleute bereit, das Schlüssel, Ausgangstext und Kontext zeigt und fehlende oder veraltete Texte meldet; für IT beauftragt die Anbieterin eine Fachübersetzung mit Erfahrung in Bundesterminologie (im Angebot enthalten) [OFFEN: Büro vor Abgabe benennen]. Barrierefreiheit: Die Vorgabe (FAQ 9) nennt keine speziellen Anforderungen und lehnt sich an die Barrierefreiheitserklärung von ar.admin.ch an (FAQ 128 ist beantwortet und verweist auf FAQ 9); die Anbieterin legt darüber hinaus eCH-0059 / WCAG 2.1 AA als eigenen Zielstandard zugrunde: Tastaturbedienung, sichtbarer Fokus, beschriftete Steuerelemente, Ampeln zusätzlich mit Symbol und Text, Karteninhalte als Tabelle, PDF-Ausgaben mit Struktur (Tagged PDF). Prüfung: automatisierte axe-Prüfung im Build plus manuelle Prüfung der Kernmasken je Release (Tastatur, Screenreader, Kontrast, Zoom 200 %). Optionale QR-Erfassung (slm 46–49): Der QR-Code je Stellungsraum enthält einen Deep Link mit signiertem Token (Schiessplatz, Stellungsraum, Ausgabedatum, Gültigkeit; HMAC mit mandantenspezifischem Schlüssel, Schlüsselwechsel macht alte Codes ungültig). Die API prüft Signatur, Gültigkeit und Zuordnung, bevor die Erfassungsmaske vorbelegt wird; ein ungültiger, abgelaufener oder manipulierter Code führt zu einer klaren Fehlermeldung ohne Erfassungsmöglichkeit, der Versuch wird protokolliert. Die Erfassungsmaske (slm 47/48, B1 11.2) zeigt Schiessplatz und Stellungsraum gesperrt vorbelegt, Tagesdatum editierbar, Beginn/Ende im Viertelstundenraster, Einheit mit Autovervollständigung, Nutzungskategorie mit ziviler Nutzungsart als bedingtem Pflichtfeld, Anzahl Personen, mehrere Zeilen Waffe/Kaliber mit Menge in Stück oder kg; Prüfung wie in 5.11, Erfolgs- und Fehleranzeige, Entwurf lokal in der PWA gehalten und bei Verbindungsabbruch beim nächsten Kontakt gesendet – mit Idempotenz-Schlüssel, damit Wiederholungen keine Doppelmeldung erzeugen; die Meldung selbst erfolgt mit angemeldetem Konto. </w:t>
       </w:r>
       <w:r>
         <w:rPr>
@@ -2501,7 +2501,7 @@
         <w:spacing w:after="120"/>
       </w:pPr>
       <w:r>
-        <w:t xml:space="preserve">Ergonomie: einheitliche Masken (Design System), Fehlermeldungen mit Behebung, Tastaturbedienung (Kapitel 5). Betrieb: 99 % Mo–Fr 07–19 Uhr, genehmigte Wartungsfenster, Sicherung und Monitoring nach 2.5. Support: 1st Level durch die Trainer der Auftraggeberin (2–15 Personen, FAQ 20), 2nd/3rd Level durch die Anbieterin Mo–Fr 08–17 Uhr [OFFEN: Standort 3rd Level (E-Kriterium) benennen], Reaktion innerhalb vier Stunden, Behebungsbeginn innerhalb 24 Stunden, Behebung bei erheblichen Störungen in der Regel innerhalb 48 Stunden; Schweregrade (FAQ 4): kritisch = Produktion nicht nutzbar, hoch = Kernfunktion gestört ohne Umgehung, mittel = Umgehung vorhanden, niedrig = kosmetisch – mit abgestuften Reaktions- und Behebungszeiten; Meldeweg über Ticketsystem und Hotline, Stellvertretung im Support, Incident-/Problem-/Change-Prozess, Vor-Ort-Einsatz in Bern innerhalb eines Arbeitstags (Teil B 2.6.2/2.8); die Verfügbarkeit von 99 % wird monatlich gemessen und berichtet. Informationsschutz: Si001 wird in einer Kontrollübersicht auf die Massnahmen aus 2.4/2.5 abgebildet (Zugriffsrechte-Prozess, Anmeldemittel, Protokollierung, Break-Glass – Vorlagen aus einem bestehenden Bundesprojekt, für SLIM angepasst); Schweiz-Nachweis (E1/E5, FAQ 39–41 und 49): Das separate Datenhaltungskonzept inventarisiert alle Dienste mit Applikations- oder Projektdaten – Repository, Projektdokumentation, CI/CD, Container-Registry, Logs und Monitoring, E-Mail-Versand, Ticketsystem, Fehlertracking, Druckdienst, Demo und allfällige KI-Werkzeuge – mit Datenkategorien, Datenflüssen, Verarbeitungs- und Speicherstandorten sowie Unterauftragnehmern. Für das angebotene Umsetzungskonzept wird die umfassende Standortvorgabe aus FAQ 49 zugrunde gelegt: Applikations- und Projektdaten werden ausschliesslich auf Informatiksystemen in der Schweiz gespeichert und bearbeitet, einschliesslich Quellcode, Build-Artefakten, Rand- und Metadaten, Zwischenspeicherung, Protokollierung, Telemetrie, Support und Backups, soweit diese einen Applikations- oder Projektbezug haben. Eine Cloud-Region «Europa/EU» genügt dafür nicht; synthetische Demo-Daten begründen keine pauschale Ausnahme für Repository oder CI/CD. Aus FAQ 39–41 wird daher keine generelle Freigabe ausländischer Dienste abgeleitet; eine abweichende Auslegung ist vor deren Einplanung mit der Auftraggeberin zu klären. Werkzeuge ausserhalb der Schweiz kommen nur für Vorgänge ohne jeglichen Bezug zu Applikations- oder Projektdaten in Betracht; E5 schafft auch für KI keine Ausnahme. [OFFEN: Dienste, Anbieter, Schweizer Verarbeitungs- und Speicherstandorte sowie Nachweise für die gesamte Entwicklungs- und Betriebskette vor Abgabe festlegen; bestehende Prototyp-Werkzeuge dagegen prüfen und erforderliche Umstellungen ausweisen.]</w:t>
+        <w:t xml:space="preserve">Ergonomie: einheitliche Masken (Design System), Fehlermeldungen mit Behebung, Tastaturbedienung (Kapitel 5). Betrieb: 99 % Mo–Fr 07–19 Uhr, genehmigte Wartungsfenster, Sicherung und Monitoring nach 2.5. Support: 1st Level durch die Trainer der Auftraggeberin (2–15 Personen, FAQ 20), 2nd/3rd Level durch die Anbieterin Mo–Fr 08–17 Uhr [OFFEN: Standort 3rd Level (E-Kriterium) benennen], Reaktion innerhalb vier Stunden, Behebungsbeginn innerhalb 24 Stunden, Behebung bei erheblichen Störungen in der Regel innerhalb 48 Stunden. Für die Fristen von 4/24/48 Stunden gilt gemäss FAQ 115: Bei Eingang innerhalb der Supportzeit beginnt die Frist mit Eingang der Meldung, andernfalls mit Beginn der nächsten Erreichbarkeitszeit. Ab diesem Zeitpunkt laufen die Fristen kalendarisch weiter, auch ausserhalb der Supportzeit sowie an Wochenenden und Feiertagen. Die Supportorganisation stellt die fristgerechte Bearbeitung durch einen entsprechenden Bereitschafts- und Eskalationsprozess sicher; bereits laufende Fristen werden durch das Ende der Erreichbarkeit Mo–Fr 08–17 Uhr nicht ausgesetzt; Schweregrade (FAQ 4): kritisch = Produktion nicht nutzbar, hoch = Kernfunktion gestört ohne Umgehung, mittel = Umgehung vorhanden, niedrig = kosmetisch – mit abgestuften Reaktions- und Behebungszeiten; Meldeweg über Ticketsystem und Hotline, Stellvertretung im Support, Incident-/Problem-/Change-Prozess, Vor-Ort-Einsatz in Bern innerhalb eines Arbeitstags (Teil B 2.6.2/2.8); die Verfügbarkeit von 99 % wird monatlich gemessen und berichtet. Informationsschutz: Si001 wird in einer Kontrollübersicht auf die Massnahmen aus 2.4/2.5 abgebildet (Zugriffsrechte-Prozess, Anmeldemittel, Protokollierung, Break-Glass – Vorlagen aus einem bestehenden Bundesprojekt, für SLIM angepasst); Schweiz-Nachweis (E1/E5, FAQ 39–41 und 49): Das separate Datenhaltungskonzept inventarisiert alle Dienste mit Applikations- oder Projektdaten – Repository, Projektdokumentation, CI/CD, Container-Registry, Logs und Monitoring, E-Mail-Versand, Ticketsystem, Fehlertracking, Druckdienst, Demo und allfällige KI-Werkzeuge – mit Datenkategorien, Datenflüssen, Verarbeitungs- und Speicherstandorten sowie Unterauftragnehmern. Für das angebotene Umsetzungskonzept wird die umfassende Standortvorgabe aus FAQ 49 zugrunde gelegt: Applikations- und Projektdaten werden ausschliesslich auf Informatiksystemen in der Schweiz gespeichert und bearbeitet, einschliesslich Quellcode, Build-Artefakten, Rand- und Metadaten, Zwischenspeicherung, Protokollierung, Telemetrie, Support und Backups, soweit diese einen Applikations- oder Projektbezug haben. Eine Cloud-Region «Europa/EU» genügt dafür nicht; synthetische Demo-Daten begründen keine pauschale Ausnahme für Repository oder CI/CD. Aus FAQ 39–41 wird daher keine generelle Freigabe ausländischer Dienste abgeleitet; eine abweichende Auslegung ist vor deren Einplanung mit der Auftraggeberin zu klären. Werkzeuge ausserhalb der Schweiz kommen nur für Vorgänge ohne jeglichen Bezug zu Applikations- oder Projektdaten in Betracht; E5 schafft auch für KI keine Ausnahme. [OFFEN: Dienste, Anbieter, Schweizer Verarbeitungs- und Speicherstandorte sowie Nachweise für die gesamte Entwicklungs- und Betriebskette vor Abgabe festlegen; bestehende Prototyp-Werkzeuge dagegen prüfen und erforderliche Umstellungen ausweisen.]</w:t>
       </w:r>
     </w:p>
     <w:p>
@@ -2683,7 +2683,7 @@
                 <w:sz w:val="19"/>
                 <w:szCs w:val="19"/>
               </w:rPr>
-              <w:t xml:space="preserve">Lese-/Schreibprobe mit dem B1.2-Schema vor Abgabe, einschliesslich Domänen, Beziehungen, Geometrien und Identifikatoren. Bei Lücken stellt die Anbieterin einen geeigneten Konvertierungsweg bereit und weist den vollständigen FGDB-Import/-Export nach; Werkzeug, Lizenzen, Betrieb und Aufwand sind vor Abgabe zu konkretisieren. Die FME-Workbench der Auftraggeberin dient der fachlichen Validierung gemäss 3.2; eine zusätzliche Konvertierungsleistung wird nicht vorausgesetzt. GeoPackage oder ein anderes Austauschformat ersetzt FGDB nur nach ausdrücklicher Vereinbarung mit der Auftraggeberin über den Change-Request-Prozess.</w:t>
+              <w:t xml:space="preserve">Lese-/Schreibprobe vor Abgabe mit den verfügbaren Referenzdaten, einschliesslich der darin enthaltenen Domänen, Beziehungen, Geometrien und Identifikatoren; geprüfte Inhalte und Grenzen dokumentieren. Das endgültige Schema wird gemäss FAQ 99 erst im Projekt festgelegt; danach erfolgt der vollständige Nachweis gegen dieses Schema. Bei Lücken stellt die Anbieterin einen geeigneten Konvertierungsweg bereit und weist den vollständigen FGDB-Import/-Export nach; Werkzeug, Lizenzen, Betrieb und Aufwand sind vor Abgabe zu konkretisieren. Die FME-Workbench der Auftraggeberin dient der fachlichen Validierung gemäss 3.2; eine zusätzliche Konvertierungsleistung wird nicht vorausgesetzt. GeoPackage oder ein anderes Austauschformat ersetzt FGDB nur nach ausdrücklicher Vereinbarung mit der Auftraggeberin über den Change-Request-Prozess.</w:t>
             </w:r>
           </w:p>
         </w:tc>
@@ -2972,7 +2972,7 @@
         <w:spacing w:after="120"/>
       </w:pPr>
       <w:r>
-        <w:t xml:space="preserve">Zuordnung jeder B1-Anforderung zum Kapitel, das ihre Erfüllung beschreibt (FAQ 8: Beilage ausserhalb des Seitenbudgets). Status: </w:t>
+        <w:t xml:space="preserve">Zuordnung jeder B1-Anforderung zum Umsetzungskapitel (FAQ 8: Beilage ausserhalb des Seitenbudgets). Status des Prototyps gemäss den beschriebenen Funktionen: </w:t>
       </w:r>
       <w:r>
         <w:rPr>
@@ -2982,7 +2982,17 @@
         <w:t xml:space="preserve">P</w:t>
       </w:r>
       <w:r>
-        <w:t xml:space="preserve"> = erfüllt, im Prototyp nachgewiesen (Klammer: noch Zielzustand) · </w:t>
+        <w:t xml:space="preserve"> = umgesetzt · </w:t>
+      </w:r>
+      <w:r>
+        <w:rPr>
+          <w:b/>
+          <w:bCs/>
+        </w:rPr>
+        <w:t xml:space="preserve">T</w:t>
+      </w:r>
+      <w:r>
+        <w:t xml:space="preserve"> = teilweise umgesetzt, wesentliche Teile oder Nachweise fehlen · </w:t>
       </w:r>
       <w:r>
         <w:rPr>
@@ -2992,7 +3002,7 @@
         <w:t xml:space="preserve">Z</w:t>
       </w:r>
       <w:r>
-        <w:t xml:space="preserve"> = erfüllt, Umsetzung verbindlich beschrieben · </w:t>
+        <w:t xml:space="preserve"> = verbindlich vorgesehen, Umsetzung ausstehend · </w:t>
       </w:r>
       <w:r>
         <w:rPr>
@@ -3002,7 +3012,7 @@
         <w:t xml:space="preserve">O</w:t>
       </w:r>
       <w:r>
-        <w:t xml:space="preserve"> = Option (KANN, angeboten, 5.4) · </w:t>
+        <w:t xml:space="preserve"> = angebotene Option · </w:t>
       </w:r>
       <w:r>
         <w:rPr>
@@ -3012,7 +3022,7 @@
         <w:t xml:space="preserve">K</w:t>
       </w:r>
       <w:r>
-        <w:t xml:space="preserve"> = Klärung offen.</w:t>
+        <w:t xml:space="preserve"> = Klärung offen. Die Statusangaben sind keine Abnahmebestätigung; P setzt weder eine vollständige unabhängige Codeprüfung noch einen vollständigen E2E-Nachweis voraus. Testumfang und bekannte Abweichungen stehen in 4.3 und 6.1. Bei Teilumsetzungen nennt die Klammer vorhandene und ausstehende Bestandteile.</w:t>
       </w:r>
     </w:p>
     <w:tbl>
@@ -3319,7 +3329,7 @@
                 <w:sz w:val="17"/>
                 <w:szCs w:val="17"/>
               </w:rPr>
-              <w:t xml:space="preserve">Z (schematische Karte P; Gebäude/Isophonen LP5, FAQ 13)</w:t>
+              <w:t xml:space="preserve">T (schematische Karte vorhanden; Viewer/Export ausstehend; zusätzliche Layer LP5, FAQ 13)</w:t>
             </w:r>
           </w:p>
         </w:tc>
@@ -3412,7 +3422,7 @@
                 <w:sz w:val="17"/>
                 <w:szCs w:val="17"/>
               </w:rPr>
-              <w:t xml:space="preserve">Z (Suche, Sortierung, Filter, Selektion, XLSX P)</w:t>
+              <w:t xml:space="preserve">T (Suche, Sortierung, Filter, Selektion, XLSX vorhanden; vollständiger Umfang ausstehend)</w:t>
             </w:r>
           </w:p>
         </w:tc>
@@ -3970,7 +3980,7 @@
                 <w:sz w:val="17"/>
                 <w:szCs w:val="17"/>
               </w:rPr>
-              <w:t xml:space="preserve">Z (Ampeln, Kontext P)</w:t>
+              <w:t xml:space="preserve">T (Ampeln, Kontext vorhanden; vollständige Übersicht ausstehend)</w:t>
             </w:r>
           </w:p>
         </w:tc>
@@ -4063,7 +4073,7 @@
                 <w:sz w:val="17"/>
                 <w:szCs w:val="17"/>
               </w:rPr>
-              <w:t xml:space="preserve">P (Spaltenfilter, Export Z)</w:t>
+              <w:t xml:space="preserve">T (Erfassung vorhanden; Spaltenfilter, Export ausstehend)</w:t>
             </w:r>
           </w:p>
         </w:tc>
@@ -4156,7 +4166,7 @@
                 <w:sz w:val="17"/>
                 <w:szCs w:val="17"/>
               </w:rPr>
-              <w:t xml:space="preserve">P (Kartenviewer Z)</w:t>
+              <w:t xml:space="preserve">T (Details vorhanden; Kartenviewer ausstehend)</w:t>
             </w:r>
           </w:p>
         </w:tc>
@@ -4249,7 +4259,7 @@
                 <w:sz w:val="17"/>
                 <w:szCs w:val="17"/>
               </w:rPr>
-              <w:t xml:space="preserve">P (LP1b gemäss FAQ 117)</w:t>
+              <w:t xml:space="preserve">P – angebotene Option LP1b gemäss FAQ 117</w:t>
             </w:r>
           </w:p>
         </w:tc>
@@ -4528,7 +4538,7 @@
                 <w:sz w:val="17"/>
                 <w:szCs w:val="17"/>
               </w:rPr>
-              <w:t xml:space="preserve">P (Anzeige; Bearbeiten Z)</w:t>
+              <w:t xml:space="preserve">T (Anzeige vorhanden; Bearbeiten ausstehend)</w:t>
             </w:r>
           </w:p>
         </w:tc>
@@ -4714,7 +4724,7 @@
                 <w:sz w:val="17"/>
                 <w:szCs w:val="17"/>
               </w:rPr>
-              <w:t xml:space="preserve">Z (Datenmodell P)</w:t>
+              <w:t xml:space="preserve">T (Datenmodell vorhanden; Zuordnungsmaske ausstehend)</w:t>
             </w:r>
           </w:p>
         </w:tc>
@@ -4900,7 +4910,7 @@
                 <w:sz w:val="17"/>
                 <w:szCs w:val="17"/>
               </w:rPr>
-              <w:t xml:space="preserve">P (FGDB direkt über GDAL Z)</w:t>
+              <w:t xml:space="preserve">T (JSON/WLR/Betriebsdaten vorhanden; direkter FGDB-Import ausstehend)</w:t>
             </w:r>
           </w:p>
         </w:tc>
@@ -4993,7 +5003,7 @@
                 <w:sz w:val="17"/>
                 <w:szCs w:val="17"/>
               </w:rPr>
-              <w:t xml:space="preserve">P (Bündel, CSV; GeoDB Z)</w:t>
+              <w:t xml:space="preserve">T (Bündel, CSV vorhanden; GeoDB-Export ausstehend)</w:t>
             </w:r>
           </w:p>
         </w:tc>
@@ -5551,7 +5561,7 @@
                 <w:sz w:val="17"/>
                 <w:szCs w:val="17"/>
               </w:rPr>
-              <w:t xml:space="preserve">P (Platz-Zuordnung, Schaltflächen nach Recht Z)</w:t>
+              <w:t xml:space="preserve">T (Benutzerverwaltung vorhanden; Platz-Zuordnung, Rechte-Schaltflächen ausstehend)</w:t>
             </w:r>
           </w:p>
         </w:tc>
@@ -5737,7 +5747,7 @@
                 <w:sz w:val="17"/>
                 <w:szCs w:val="17"/>
               </w:rPr>
-              <w:t xml:space="preserve">Z (Modell P)</w:t>
+              <w:t xml:space="preserve">T (Modell vorhanden; GET-Endpunkt ausstehend)</w:t>
             </w:r>
           </w:p>
         </w:tc>
@@ -5830,7 +5840,7 @@
                 <w:sz w:val="17"/>
                 <w:szCs w:val="17"/>
               </w:rPr>
-              <w:t xml:space="preserve">Z (Validierungsregeln P)</w:t>
+              <w:t xml:space="preserve">T (Validierungsregeln vorhanden; POST-Endpunkt ausstehend)</w:t>
             </w:r>
           </w:p>
         </w:tc>
@@ -6202,7 +6212,7 @@
                 <w:sz w:val="17"/>
                 <w:szCs w:val="17"/>
               </w:rPr>
-              <w:t xml:space="preserve">Teilweise im Prototyp nachgewiesen; A7X-Referenzvariante verbindlich, E8-Abweichung im Anwendungsstandard offen (4.3)</w:t>
+              <w:t xml:space="preserve">T (A7X verbindlich; E8-Abweichung im Anwendungsstandard offen, 4.3)</w:t>
             </w:r>
           </w:p>
         </w:tc>
@@ -6388,7 +6398,7 @@
                 <w:sz w:val="17"/>
                 <w:szCs w:val="17"/>
               </w:rPr>
-              <w:t xml:space="preserve">P (2FA in Demo inaktiv; TOTP Z; AGOV Option)</w:t>
+              <w:t xml:space="preserve">T (Rollen/MFA-Grundlagen vorhanden; 2FA in Demo inaktiv, Rollen-/MFA-E2E offen; TOTP ausstehend)</w:t>
             </w:r>
           </w:p>
         </w:tc>
@@ -6760,7 +6770,7 @@
                 <w:sz w:val="17"/>
                 <w:szCs w:val="17"/>
               </w:rPr>
-              <w:t xml:space="preserve">Z (Logbuch-Export P)</w:t>
+              <w:t xml:space="preserve">T (einzelne Exporte vorhanden; CSV für alle Exporte ausstehend)</w:t>
             </w:r>
           </w:p>
         </w:tc>
@@ -7783,7 +7793,7 @@
                 <w:sz w:val="17"/>
                 <w:szCs w:val="17"/>
               </w:rPr>
-              <w:t xml:space="preserve">P (Lesezeichen P; Schaltflächen nach Recht Z)</w:t>
+              <w:t xml:space="preserve">T (Lesezeichen vorhanden; vollständige Persistenz-/Rechte-Nachweise ausstehend)</w:t>
             </w:r>
           </w:p>
         </w:tc>
@@ -7876,7 +7886,7 @@
                 <w:sz w:val="17"/>
                 <w:szCs w:val="17"/>
               </w:rPr>
-              <w:t xml:space="preserve">P (übrige Spalten Z)</w:t>
+              <w:t xml:space="preserve">T (Tabellen und Teile der Spalten deutsch; übrige Spalten ausstehend)</w:t>
             </w:r>
           </w:p>
         </w:tc>
@@ -7969,7 +7979,7 @@
                 <w:sz w:val="17"/>
                 <w:szCs w:val="17"/>
               </w:rPr>
-              <w:t xml:space="preserve">Z (Grundlagen P)</w:t>
+              <w:t xml:space="preserve">T (UI-Grundlagen vorhanden; Barrierefreiheitsnachweis ausstehend)</w:t>
             </w:r>
           </w:p>
         </w:tc>
@@ -8155,7 +8165,7 @@
                 <w:sz w:val="17"/>
                 <w:szCs w:val="17"/>
               </w:rPr>
-              <w:t xml:space="preserve">Z (Kernmessung P)</w:t>
+              <w:t xml:space="preserve">T (Kernmessung vorhanden; Lasttest und Ressourcenisolation ausstehend)</w:t>
             </w:r>
           </w:p>
         </w:tc>
@@ -8248,7 +8258,7 @@
                 <w:sz w:val="17"/>
                 <w:szCs w:val="17"/>
               </w:rPr>
-              <w:t xml:space="preserve">Z (Architektur, Rollen, i18n P; Fachparameter Z)</w:t>
+              <w:t xml:space="preserve">T (Architektur, Rollen, i18n vorhanden; Fachparameter-Konfiguration ausstehend)</w:t>
             </w:r>
           </w:p>
         </w:tc>
@@ -8341,7 +8351,7 @@
                 <w:sz w:val="17"/>
                 <w:szCs w:val="17"/>
               </w:rPr>
-              <w:t xml:space="preserve">P (Break-Glass-Prozess Z)</w:t>
+              <w:t xml:space="preserve">T (Auth-/Logging-Grundlagen vorhanden; MFA-Gesamtnachweis und Break-Glass-Prozess ausstehend)</w:t>
             </w:r>
           </w:p>
         </w:tc>

</xml_diff>

<commit_message>
Refactor change detection to ensure template updates after asynchronous data changes; add unit and e2e tests for redraw scenarios, and update export handling to include BOM normalization for CSV files.
</commit_message>
<xml_diff>
--- a/docs/anforderungskatalog/C2-Loesungskonzept-SLIM.docx
+++ b/docs/anforderungskatalog/C2-Loesungskonzept-SLIM.docx
@@ -26,7 +26,7 @@
           <w:sz w:val="23"/>
           <w:szCs w:val="23"/>
         </w:rPr>
-        <w:t xml:space="preserve">Stand 21.9.2026</w:t>
+        <w:t xml:space="preserve">Stand 2.10.2026</w:t>
       </w:r>
     </w:p>
     <w:p>
@@ -79,7 +79,7 @@
         <w:spacing w:after="120"/>
       </w:pPr>
       <w:r>
-        <w:t xml:space="preserve">Die Auftraggeberin braucht ein Werkzeug, das die Schiessplatznutzung des VBS erfasst, daraus die Beurteilungspegel nach Anhang 7 und 9 LSV ableitet, die Einhaltung von Grenzwerten und Kontingenten je Schiessplatz und Empfangspunkt sichtbar macht und Massnahmen simulierbar hält – nachvollziehbar für Fachspezialisten, einfach für Schiessplatz-Verantwortliche und Interessenten, auf jedem Gerät, in Deutsch, Französisch und Italienisch (Englisch zusätzlich).</w:t>
+        <w:t xml:space="preserve">Die Auftraggeberin braucht ein Werkzeug, das die Schiessplatznutzung des VBS erfasst, daraus die Beurteilungspegel nach Anhang 7 und 9 LSV ableitet, die Einhaltung von Grenzwerten und Kontingenten je Schiessplatz und Empfangspunkt zeigt und Massnahmen simulierbar hält – nachvollziehbar für Fachspezialisten, einfach für Schiessplatz-Verantwortliche und Interessenten, in Deutsch, Französisch und Italienisch.</w:t>
       </w:r>
     </w:p>
     <w:p>
@@ -87,7 +87,7 @@
         <w:spacing w:after="120"/>
       </w:pPr>
       <w:r>
-        <w:t xml:space="preserve">SLIM ist eine Webapplikation aus Standardkomponenten (Angular, NestJS, PostgreSQL/PostGIS, OpenLayers mit swisstopo-Karten, NGINX), die auf einer Schweizer Betriebsplattform in Containern läuft. Sie übernimmt Schusszahlen manuell, per Excel und über die REST-Schnittstelle von ELO, hält die akustischen Grundlagen aus sonARMS als versionierte Zustände und rechnet die Beurteilung bei jeder Anfrage aus Nutzungen und Zustand neu – reproduzierbar und ohne Nachbau der Ausbreitungssoftware. Berechtigungen, Mandanten, Zwei-Faktor-Anmeldung und Logbuch kommen aus vorbestehenden, in einem produktiven Bundessystem erprobten Komponenten (in SLIM integriert; die Zwei-Faktor-Anmeldung ist in der Demo nicht aktiviert); SLIM läuft als eigene Instanz mit eigener Datenbank, eigenen Geheimnissen und eigenen Fachberechtigungen.</w:t>
+        <w:t xml:space="preserve">SLIM ist eine Webapplikation aus Standardkomponenten (Angular, NestJS, PostgreSQL/PostGIS, OpenLayers mit swisstopo-Karten), betrieben in Containern auf Schweizer Infrastruktur. Sie übernimmt Schusszahlen manuell, per Excel und über die REST-Schnittstelle von ELO, hält die akustischen Grundlagen aus sonARMS als versionierte Zustände und rechnet die Beurteilung bei jeder Anfrage aus Nutzungen und Zustand neu – reproduzierbar und ohne Nachbau der Ausbreitungssoftware. Berechtigungen, Mandanten, Zwei-Faktor-Anmeldung und Logbuch stammen aus vorbestehenden, in einem produktiven Bundessystem eingesetzten Komponenten.</w:t>
       </w:r>
     </w:p>
     <w:p>
@@ -95,7 +95,29 @@
         <w:spacing w:after="120"/>
       </w:pPr>
       <w:r>
-        <w:t xml:space="preserve">Wesentliche Vorteile: Der Berechnungskern ist gegen die Empa-Referenzdaten der Beilage B1.4 geprüft; Ergebnisse und ein dokumentierter Sonderfall stehen in Kapitel 4.3. Die Fachmasken (Schusszahlen, Details, Simulation) und die Datenverwaltung (Schiessplatz, Berechnungen mit Import, Waffen) laufen als Prototyp auf dem Datenmodell nach B1 Kapitel 10, abgesichert durch automatisierte Tests in jedem Build (Kapitel 6.1); das Projektteam kennt ELO und die gemeinsame Plattform aus der Entwicklung [OFFEN: Verhältnis der einreichenden Firma zu ELO vor Abgabe prüfen und Formulierung anpassen] – die Schnittstelle wird dennoch mit der Auftraggeberin abgestimmt und mit Integrationstests über beide Systeme abgenommen.</w:t>
+        <w:rPr>
+          <w:b/>
+          <w:bCs/>
+        </w:rPr>
+        <w:t xml:space="preserve">Anbieterorganisation.</w:t>
+      </w:r>
+      <w:r>
+        <w:t xml:space="preserve"> Generalunternehmerin und alleinige Vertragspartnerin ist ongoing; sie verantwortet Betrieb, Support und Schulung. [OFFEN: Firmenname Entwicklerin] (nachfolgend «Entwicklerin») ist als spezialisierte Technologiepartnerin und Subunternehmerin verbindlich für die Entwicklung eingebunden (LP1 und LP5).</w:t>
+      </w:r>
+    </w:p>
+    <w:p>
+      <w:pPr>
+        <w:spacing w:after="120"/>
+      </w:pPr>
+      <w:r>
+        <w:rPr>
+          <w:b/>
+          <w:bCs/>
+        </w:rPr>
+        <w:t xml:space="preserve">Geringeres Umsetzungsrisiko.</w:t>
+      </w:r>
+      <w:r>
+        <w:t xml:space="preserve"> Das Konzept stützt sich auf einen lauffähigen Prototyp (MVP): Fachmasken, Datenverwaltung, Kartenviewer, das Datenmodell nach B1 Kapitel 10 und der gegen die Empa-Referenzwerte der Beilage B1.4 geprüfte Berechnungskern sind umgesetzt und automatisiert getestet; der Stand je Anforderung steht in der Matrix. Die Entwicklerin hat zudem ELO entwickelt und kennt die Fachdomäne und beide Seiten der Schnittstelle. Deshalb wird LP1a mit einem Maximalaufwand von 2'800 statt 4'000 Stunden angeboten.</w:t>
       </w:r>
     </w:p>
     <w:p>
@@ -122,7 +144,7 @@
       <w:r>
         <w:drawing>
           <wp:inline distT="0" distB="0" distL="0" distR="0">
-            <wp:extent cx="5514975" cy="4600575"/>
+            <wp:extent cx="5210175" cy="4343400"/>
             <wp:effectExtent t="0" r="0" b="0" l="0"/>
             <wp:docPr id="1" name="" descr="" title=""/>
             <wp:cNvGraphicFramePr>
@@ -147,7 +169,7 @@
                   <pic:spPr bwMode="auto">
                     <a:xfrm>
                       <a:off x="0" y="0"/>
-                      <a:ext cx="5514975" cy="4600575"/>
+                      <a:ext cx="5210175" cy="4343400"/>
                     </a:xfrm>
                     <a:prstGeom prst="rect">
                       <a:avLst/>
@@ -165,7 +187,7 @@
         <w:spacing w:after="120"/>
       </w:pPr>
       <w:r>
-        <w:t xml:space="preserve">Die Skizze zeigt die Zielarchitektur; gestrichelte Elemente fehlen im Prototyp noch (Kartenviewer, Excel- und FGDB-Import/-Export über GDAL, Worker-Container, Views), die Datenbank läuft im Prototyp auf SQLite/MariaDB statt PostgreSQL/PostGIS. Drei Schichten mit klaren Verträgen: Die </w:t>
+        <w:t xml:space="preserve">Die Skizze zeigt die Zielarchitektur; gestrichelte Elemente sind im Prototyp noch nicht vorhanden (ELO-Endpunkte, Excel- und FGDB-Verarbeitung über GDAL, Worker-Container, Views), die Datenbank läuft im Prototyp auf SQLite/MariaDB. Drei Schichten mit klaren Verträgen: Die </w:t>
       </w:r>
       <w:r>
         <w:rPr>
@@ -195,7 +217,7 @@
         <w:t xml:space="preserve">Berechnungskern</w:t>
       </w:r>
       <w:r>
-        <w:t xml:space="preserve"> ist eine abhängigkeitsfreie Bibliothek, die API und Tests identisch verwenden. Externe Schnittstellen: ELO (REST, Kapitel 3.1), swisstopo-Kartendienste (WMS/WMTS, Kapitel 5.2), nachgelagerte Systeme über Datenbank-Views (Kapitel 3.4).</w:t>
+        <w:t xml:space="preserve"> ist eine abhängigkeitsfreie Bibliothek, die API und Tests identisch verwenden. Externe Schnittstellen: ELO (REST, Kapitel 3.1), swisstopo-Kartendienste (Kapitel 5.2), nachgelagerte Systeme über Datenbank-Views (Kapitel 3.4).</w:t>
       </w:r>
     </w:p>
     <w:p>
@@ -321,7 +343,7 @@
                 <w:sz w:val="19"/>
                 <w:szCs w:val="19"/>
               </w:rPr>
-              <w:t xml:space="preserve">Wahl der Anbieterin: ein Code für Desktop und Mobile (PWA, offline-fähige Entwürfe), langfristig gepflegtes Framework mit Enterprise-Verbreitung, ausgereifte Barrierefreiheits- und i18n-Werkzeuge; Team- und Plattformerfahrung aus ELO</w:t>
+              <w:t xml:space="preserve">Ein Code für Desktop, Tablet und mobile Erfassung (PWA, offline-fähige Entwürfe); langfristig gepflegtes Framework mit ausgereiften Werkzeugen für Barrierefreiheit und Mehrsprachigkeit; gleicher Stack wie ELO</w:t>
             </w:r>
           </w:p>
         </w:tc>
@@ -370,7 +392,7 @@
                 <w:sz w:val="19"/>
                 <w:szCs w:val="19"/>
               </w:rPr>
-              <w:t xml:space="preserve">Wahl der Anbieterin: eine Sprache (TypeScript) für Oberfläche, API und Berechnungskern – Fachtypen und Berechnungsregeln werden geteilt statt doppelt gepflegt; typisierte DTOs sind der einzige API-Vertrag, der Frontend-Client wird daraus generiert</w:t>
+              <w:t xml:space="preserve">Eine Sprache (TypeScript) für Oberfläche, API und Berechnungskern – Fachtypen und Rechenregeln werden geteilt statt doppelt gepflegt; typisierte DTOs sind der einzige API-Vertrag, der Frontend-Client wird daraus generiert</w:t>
             </w:r>
           </w:p>
         </w:tc>
@@ -397,7 +419,7 @@
                 <w:sz w:val="19"/>
                 <w:szCs w:val="19"/>
               </w:rPr>
-              <w:t xml:space="preserve">galaxy auth/core (vorbestehende Komponenten, produktiv erprobt)</w:t>
+              <w:t xml:space="preserve">galaxy auth/core (vorbestehend)</w:t>
             </w:r>
           </w:p>
         </w:tc>
@@ -419,7 +441,7 @@
                 <w:sz w:val="19"/>
                 <w:szCs w:val="19"/>
               </w:rPr>
-              <w:t xml:space="preserve">Benutzer, Rollen, Mandanten, 2FA, Sessions, Replay-Schutz und Objektregeln (Rules) sind erprobt (Nachweis je Komponente: produktiv erprobt / in SLIM integriert / in SLIM getestet); SLIM ergänzt die Fachrollen und betreibt eine eigene Instanz</w:t>
+              <w:t xml:space="preserve">Benutzer, Rollen, Mandanten, 2FA, Sessions, Replay-Schutz und Objektregeln (Rules) sind produktiv erprobt; SLIM ergänzt die Fachrollen und läuft als eigene Instanz mit eigener Datenbank und eigenen Geheimnissen</w:t>
             </w:r>
           </w:p>
         </w:tc>
@@ -468,7 +490,7 @@
                 <w:sz w:val="19"/>
                 <w:szCs w:val="19"/>
               </w:rPr>
-              <w:t xml:space="preserve">Standard mit räumlichen Typen für Empfangspunkte, Anlagenteile und Perimeter, räumliche Indizes, lesende Views für MGDM/ImmoGIS, FGDB-Austausch über GDAL. PostGIS (GPL) wird ausschliesslich als unveränderter Datenbankdienst genutzt – keine Verlinkung mit SLIM-Code, keine Copyleft-Wirkung. Der Prototyp läuft über TypeORM heute auf SQLite/MariaDB; PostGIS-Container, Konfiguration und treiberneutrale Abfragen sind vorbereitet, der Boot gegen PostgreSQL 17 wartet auf die Typzuordnung der vorbestehenden Bibliotheken (MySQL-Typen → PostgreSQL), die vor Abgabe nachgezogen wird</w:t>
+              <w:t xml:space="preserve">Standard mit räumlichen Typen und Indizes für Empfangspunkte, Anlagenteile und Perimeter, lesende Views für MGDM/ImmoGIS. PostGIS (GPL) wird nur als unveränderter Datenbankdienst genutzt – keine Verlinkung mit SLIM-Code. Der Prototyp läuft über TypeORM auf SQLite/MariaDB; Container, Konfiguration und treiberneutrale Abfragen für PostgreSQL sind vorbereitet, die Typzuordnung der vorbestehenden Bibliotheken ist die erste Aufgabe in LP1 (Nachweis auf dem Akzeptanzsystem bis Meilenstein M2)</w:t>
             </w:r>
           </w:p>
         </w:tc>
@@ -495,7 +517,7 @@
                 <w:sz w:val="19"/>
                 <w:szCs w:val="19"/>
               </w:rPr>
-              <w:t xml:space="preserve">OpenLayers + swisstopo WMS/WMTS (geo.admin.ch)</w:t>
+              <w:t xml:space="preserve">OpenLayers + swisstopo (geo.admin.ch)</w:t>
             </w:r>
           </w:p>
         </w:tc>
@@ -517,7 +539,7 @@
                 <w:sz w:val="19"/>
                 <w:szCs w:val="19"/>
               </w:rPr>
-              <w:t xml:space="preserve">Offener Standard-Viewer mit LV95, WMS-Hintergründen und Bundeslayern, Massstab, Layer-Konfiguration; keine Lizenzkosten</w:t>
+              <w:t xml:space="preserve">Offener Standard-Viewer mit LV95, Bundeslayern, Massstab und Layer-Konfiguration; keine Lizenzkosten</w:t>
             </w:r>
           </w:p>
         </w:tc>
@@ -544,7 +566,7 @@
                 <w:sz w:val="19"/>
                 <w:szCs w:val="19"/>
               </w:rPr>
-              <w:t xml:space="preserve">GDAL/OGR ≥ 3.8 (OpenFileGDB-Treiber mit Schreibunterstützung inkl. Domänen und Beziehungsklassen), ExcelJS</w:t>
+              <w:t xml:space="preserve">GDAL/OGR ≥ 3.8 (Treiber OpenFileGDB mit Schreibunterstützung), ExcelJS</w:t>
             </w:r>
           </w:p>
         </w:tc>
@@ -566,7 +588,7 @@
                 <w:sz w:val="19"/>
                 <w:szCs w:val="19"/>
               </w:rPr>
-              <w:t xml:space="preserve">Lesen und Schreiben von File-Geodatabases nach dem Schema B1.2 sowie Excel mit Standardbibliotheken; Lese-/Schreibprobe vor Abgabe mit den verfügbaren Referenzdaten; endgültiges Schema gemäss FAQ 99 im Projekt festlegen und anschliessend vollständig prüfen</w:t>
+              <w:t xml:space="preserve">File-Geodatabases werden über GDAL gelesen und geschrieben, Excel und CSV über ExcelJS – in einer klar abgegrenzten Verarbeitungsschicht, damit ein Wechsel auf GeoPackage oder INTERLIS mit vertretbarem Aufwand möglich bleibt (FAQ 121, 176; Change LP5)</w:t>
             </w:r>
           </w:p>
         </w:tc>
@@ -631,7 +653,7 @@
                 <w:sz w:val="19"/>
                 <w:szCs w:val="19"/>
               </w:rPr>
-              <w:t xml:space="preserve">; Container-Images versioniert; Coolify für Bereitstellung und Rückfall</w:t>
+              <w:t xml:space="preserve">; versionierte Container-Images; Coolify für Bereitstellung und Rückfall</w:t>
             </w:r>
           </w:p>
         </w:tc>
@@ -651,10 +673,10 @@
           <w:b/>
           <w:bCs/>
         </w:rPr>
-        <w:t xml:space="preserve">Vorbestehende Bestandteile und Nutzungsrechte.</w:t>
-      </w:r>
-      <w:r>
-        <w:t xml:space="preserve"> SLIM baut auf drei Schichten von Fremd- und Eigenanteilen auf: (1) Open-Source-Komponenten (Angular 22, NestJS 12, TypeORM 0.3, ExcelJS 4 – MIT; OpenLayers – BSD-2; GDAL ≥ 3.8 – MIT; PostgreSQL 17 – PostgreSQL-Lizenz; PostGIS 3.5 – GPL, nur als unveränderter Datenbankdienst), ohne Copyleft-Wirkung auf SLIM; die vollständige Lizenzliste mit Versionen und Notices ist Teil der SBOM jedes Releases; (2) die vorbestehende Plattform </w:t>
+        <w:t xml:space="preserve">Vorbestehende Rechte und Nutzungsrechte.</w:t>
+      </w:r>
+      <w:r>
+        <w:t xml:space="preserve"> (1) Open-Source-Komponenten: Angular 22, NestJS 12, TypeORM 0.3, ExcelJS 4 (MIT), OpenLayers (BSD-2), GDAL ≥ 3.8 (MIT), PostgreSQL 17 (PostgreSQL-Lizenz), PostGIS 3.5 (GPL, nur als Datenbankdienst) – ohne Copyleft-Wirkung auf SLIM; die Lizenzliste mit Versionen ist Teil der SBOM jedes Releases. (2) Vorbestehende Rechte der Entwicklerin: die Plattformbibliotheken </w:t>
       </w:r>
       <w:r>
         <w:rPr>
@@ -666,7 +688,7 @@
         <w:t xml:space="preserve">@app-galaxy/*</w:t>
       </w:r>
       <w:r>
-        <w:t xml:space="preserve"> (Authentifizierung, Mandanten, Rollen, Rule-Engine, Übersetzung, Setup) – vorbestehende Software im Sinne von Art. 6.2.4 der Vertragsbedingungen, ursprünglich entwickelt von Weslley De Souza (Tech Lead des Angebots) – die Rechtekette (eigene Entwicklung, allfällige Beiträge Dritter, Abtretung an die einreichende Firma) wird im Angebot dokumentiert: Sie wird in der SBOM deklariert, die Auftraggeberin erhält daran ein zeitlich unbefristetes, übertragbares Nutzungsrecht für Betrieb, Wartung und Weiterentwicklung sowie den Quellcode als Teil der Lieferung (Art. 6.1.7); eine Freigabe unter einer Open-Source-Lizenz (MIT/Apache) wird geprüft [OFFEN: Abtretung an die einreichende Firma, Lizenztext und OSS-Entscheid vor Abgabe festlegen]; (3) der SLIM-Anwendungscode, an dem die Auftraggeberin die vertraglich vereinbarten Rechte erhält. Wartbarkeit durch Dritte: Standard-Stack, öffentliche Paketquellen, generierter API-Vertrag, dokumentiertes Datenmodell, automatisierte Tests und der Setup-Wizard erlauben einer anderen Firma die Übernahme; die galaxy-Bibliotheken sind mit Quellcode, Tests und Dokumentation Teil der Lieferung.</w:t>
+        <w:t xml:space="preserve"> (Authentifizierung, Mandanten, Rollen, Rule-Engine, Übersetzung, Setup) und der Prototyp (MVP) in seinem Stand vor Inkrafttreten des Rahmenvertrags. Das Eigentum an diesen Basiskomponenten verbleibt bei der Entwicklerin; die Auftraggeberin erhält daran das vertraglich verlangte, vollständige und unentgeltliche Nutzungsrecht gemäss Art. 6.2.4 des Rahmenvertrags, den Quellcode als Teil der Lieferung (Art. 2.9.1) und die Kennzeichnung als vorbestehend in der SBOM (Art. 4.3.1; FAQ 97, 138, 170). (3) Arbeitsergebnisse: Alle im Projekt erstellten Erweiterungen und Anpassungen gehen gemäss Art. 6.1.4 auf die Auftraggeberin über. Wartbarkeit durch Dritte: Standard-Stack, öffentliche Paketquellen, generierter API-Vertrag, dokumentiertes Datenmodell, automatisierte Tests und der Setup-Wizard erlauben einer anderen Firma die Übernahme; die galaxy-Bibliotheken werden mit Quellcode, Tests und Dokumentation geliefert.</w:t>
       </w:r>
     </w:p>
     <w:p>
@@ -682,7 +704,7 @@
         <w:spacing w:after="120"/>
       </w:pPr>
       <w:r>
-        <w:t xml:space="preserve">Das Modell folgt B1 7.4.1 und 10. Schiessplätze und Stellungsräume sind zeitlich unabhängige Referenzobjekte. Die zulässige Kombination Stellungsraum × Waffe/Kaliber trägt das Kontingent und ist der Schlüssel der Erfassung; die </w:t>
+        <w:t xml:space="preserve">Das Modell folgt B1 7.4.1 und Kapitel 10. Schiessplätze und Stellungsräume sind zeitlich unabhängige Referenzobjekte. Die zulässige Kombination Stellungsraum × Waffe/Kaliber trägt das Kontingent und ist der Schlüssel der Erfassung; die </w:t>
       </w:r>
       <w:r>
         <w:rPr>
@@ -702,7 +724,7 @@
         <w:t xml:space="preserve">Zustand</w:t>
       </w:r>
       <w:r>
-        <w:t xml:space="preserve">. Eine Kombination ist mit einer oder mehreren Quellen verknüpft; das Gewicht je Quelle stammt aus den Betriebsdaten der Grundlage (Verhältnis der Schusszahlen je Schusslinie, Anhang 9 nach Tag/Abend, Anhang 7 je Waffenkategorie) und wird beim Import des Zustands gesetzt und ist in der Datenverwaltung einsehbar. Hierarchie nach B1 5.18 und Kapitel 10: Schiessplatz → </w:t>
+        <w:t xml:space="preserve">. Eine Kombination ist mit einer oder mehreren Quellen verknüpft; das Gewicht je Quelle stammt aus den Betriebsdaten der Grundlage (Verhältnis der Schusszahlen je Schusslinie; Anhang 9 nach Tag/Abend, Anhang 7 je Waffenkategorie) und wird beim Import des Zustands gesetzt. Hierarchie nach B1 5.18: Schiessplatz → </w:t>
       </w:r>
       <w:r>
         <w:rPr>
@@ -722,43 +744,7 @@
         <w:t xml:space="preserve">Zustände</w:t>
       </w:r>
       <w:r>
-        <w:t xml:space="preserve"> (ZustandsID, Referenzjahr, Baujahr-Klasse); genau ein Zustand je Schiessplatz ist «aktuell gültig» und genau einer «Stand MGDM» (Datenbank-Constraint); die Zustände tragen Quellen, Empfangspunkte und WLR-Werte je Empfangspunkt × Quelle. Davon getrennt sind die veränderlichen Auswahlzeiger (gültig/MGDM) und die unveränderlichen Berechnungsstände (Ergebnisläufe). Nutzungen sind davon entkoppelt (Herkunft manuell/ELO/Import, Soft-Delete, Änderungshistorie im Logbuch); Mengen sind Dezimalzahlen mit Einheit (Stück oder kg Sprengstoff, B1 6.2/11.2.3) und werden ohne Rundungsverlust durch Erfassung, Schnittstelle, Import, Verteilung und Export geführt. Externe Identifikatoren (Koordinationsabschnitt-Nr. wie 1104.020, ZustandsID, QuellenID, sonARMS_ID) bleiben als eigene Attribute erhalten; interne Schlüssel sind UUIDs. Physische Datenbankobjekte werden deutsch benannt (B1 12.2, slm 51: </w:t>
-      </w:r>
-      <w:r>
-        <w:rPr>
-          <w:rFonts w:ascii="Consolas" w:cs="Consolas" w:eastAsia="Consolas" w:hAnsi="Consolas"/>
-          <w:sz w:val="20"/>
-          <w:szCs w:val="20"/>
-          <w:shd w:fill="F2F2F2" w:val="clear"/>
-        </w:rPr>
-        <w:t xml:space="preserve">schiessplatz</w:t>
-      </w:r>
-      <w:r>
-        <w:t xml:space="preserve">, </w:t>
-      </w:r>
-      <w:r>
-        <w:rPr>
-          <w:rFonts w:ascii="Consolas" w:cs="Consolas" w:eastAsia="Consolas" w:hAnsi="Consolas"/>
-          <w:sz w:val="20"/>
-          <w:szCs w:val="20"/>
-          <w:shd w:fill="F2F2F2" w:val="clear"/>
-        </w:rPr>
-        <w:t xml:space="preserve">stellungsraum</w:t>
-      </w:r>
-      <w:r>
-        <w:t xml:space="preserve">, </w:t>
-      </w:r>
-      <w:r>
-        <w:rPr>
-          <w:rFonts w:ascii="Consolas" w:cs="Consolas" w:eastAsia="Consolas" w:hAnsi="Consolas"/>
-          <w:sz w:val="20"/>
-          <w:szCs w:val="20"/>
-          <w:shd w:fill="F2F2F2" w:val="clear"/>
-        </w:rPr>
-        <w:t xml:space="preserve">nutzung</w:t>
-      </w:r>
-      <w:r>
-        <w:t xml:space="preserve">, …) – die englischen Klassennamen des Codes und der Skizze sind logische Namen, die Abbildung erfolgt in der Entity-Definition und wird per Migration getestet.</w:t>
+        <w:t xml:space="preserve"> (ZustandsID, Referenzjahr, Baujahr-Klasse) mit Quellen, Empfangspunkten und WLR-Werten je Empfangspunkt × Quelle; genau ein Zustand je Schiessplatz ist «aktuell gültig» und genau einer «Stand MGDM» (Datenbank-Constraint). Nutzungen sind davon entkoppelt (Herkunft manuell/ELO/Import, Soft-Delete, Änderungshistorie im Logbuch); Mengen sind Dezimalzahlen mit Einheit (Stück oder kg Sprengstoff, B1 6.2/11.2.3) und werden ohne Rundungsverlust durch Erfassung, Schnittstelle, Import, Verteilung und Export geführt. Externe Identifikatoren (Koordinationsabschnitt-Nr., ZustandsID, QuellenID, sonARMS_ID) bleiben als eigene Attribute erhalten; interne Schlüssel sind UUIDs. Physische Datenbankobjekte sind deutsch benannt (B1 12.2, slm 51); die englischen Klassennamen des Codes sind logische Namen.</w:t>
       </w:r>
     </w:p>
     <w:p>
@@ -773,7 +759,7 @@
         <w:t xml:space="preserve">Reproduzierbarkeit:</w:t>
       </w:r>
       <w:r>
-        <w:t xml:space="preserve"> Abfragen in den Masken rechnen live aus Nutzungen und Zustand. Zusätzlich sichert ein </w:t>
+        <w:t xml:space="preserve"> Die Masken rechnen live aus Nutzungen und Zustand. Zusätzlich sichert ein </w:t>
       </w:r>
       <w:r>
         <w:rPr>
@@ -783,7 +769,7 @@
         <w:t xml:space="preserve">Berechnungsstand</w:t>
       </w:r>
       <w:r>
-        <w:t xml:space="preserve"> (Masken 5.18–5.21 «Berechnungen») jedes fachlich relevante Ergebnis unveränderbar: Zeitraum, Zustand, Parameter (Feiertagskalender, Grenzwerte, Ampelschwellen, Jahre der Mittelung), die verwendeten Nutzungen als vollständige Kopie (ID, Datum, Beginn, Ende, Nutzungsart, Stellungsraum, Waffe/Kaliber, Kategorie, Schusszahl, Herkunft), die Quellen mit ihren Gewichten, die WLR-Werte und Empfangspunkte (ES, Baujahr) des Zustands, Softwareversion des Berechnungskerns, Ergebnisse je Empfangspunkt, Ersteller und Zeitpunkt. Berechnungsstände sind unveränderbar (kein Update/Delete auf Datenbankebene, nur Archivieren); Zustände, Quellengewichte und WLR-Werte werden nach der Freigabe nicht mehr geändert, sondern als neuer Zustand importiert. Ein Berechnungsstand lässt sich später mit derselben Kernversion aus der eigenen Kopie nachrechnen (Prüfsumme über alle Eingaben) und mit dem aktuellen Stand vergleichen; er ist die Grundlage für MGDM-Stände und Exporte. </w:t>
+        <w:t xml:space="preserve"> jedes fachlich relevante Ergebnis unveränderbar: Zeitraum, Zustand, Parameter (Feiertagskalender, Grenzwerte, Ampelschwellen, Jahre der Mittelung), die verwendeten Nutzungen als vollständige Kopie, Quellen mit Gewichten, WLR-Werte und Empfangspunkte (ES, Baujahr), Version des Berechnungskerns, Ergebnisse je Empfangspunkt, Ersteller und Zeitpunkt. Berechnungsstände kennen kein Update und kein Delete (nur Archivieren); Zustände, Gewichte und WLR-Werte werden nach der Freigabe nicht geändert, sondern als neuer Zustand importiert. Ein Berechnungsstand lässt sich mit derselben Kernversion aus der eigenen Kopie nachrechnen (Prüfsumme über alle Eingaben) und mit dem aktuellen Stand vergleichen; er ist die Grundlage für MGDM-Stände und Exporte. </w:t>
       </w:r>
       <w:r>
         <w:rPr>
@@ -793,7 +779,7 @@
         <w:t xml:space="preserve">Anlagenabgrenzung (B1 7.3, FAQ 93):</w:t>
       </w:r>
       <w:r>
-        <w:t xml:space="preserve"> Angebotsbasis ist die platzweite Berechnung aller Nutzungen und Anlagenteile eines Schiessplatzes. Zusätzliche getrennte Berechnungen für einzelne Anlagen sind nicht Bestandteil dieser Angebotsbasis; sie werden als Erweiterung unter LP5 behandelt. Eine freie Benutzerwahl zwischen anlagenweiser und platzweiter Beurteilung wird im Grundumfang nicht zugesagt. Jede Tabelle trägt </w:t>
+        <w:t xml:space="preserve"> Angebotsbasis ist die platzweite Berechnung aller Nutzungen und Anlagenteile eines Schiessplatzes; getrennte Berechnungen einzelner Anlagen werden als Erweiterung unter LP5 behandelt. Jede Tabelle trägt </w:t>
       </w:r>
       <w:r>
         <w:rPr>
@@ -805,7 +791,7 @@
         <w:t xml:space="preserve">tenantId</w:t>
       </w:r>
       <w:r>
-        <w:t xml:space="preserve"> (fachliche Mandantentrennung, z. B. ein Demo-Mandant neben dem produktiven Mandanten; Entwicklung, Akzeptanz und Produktion sind dagegen getrennte Instanzen mit eigener Datenbank, Kapitel 2.5; SLIM teilt keine Laufzeit mit ELO), Zeitstempel und Löschmarke; das Schema wird per Migration versioniert und als ERD automatisch dokumentiert. </w:t>
+        <w:t xml:space="preserve"> (fachliche Mandantentrennung, z. B. Demo- neben Produktivmandant; Entwicklung, Akzeptanz und Produktion sind getrennte Instanzen mit eigener Datenbank; SLIM teilt keine Laufzeit mit ELO), Zeitstempel und Löschmarke; das Schema wird per Migration versioniert und als ERD automatisch dokumentiert. </w:t>
       </w:r>
       <w:r>
         <w:rPr>
@@ -815,7 +801,7 @@
         <w:t xml:space="preserve">Prototyp:</w:t>
       </w:r>
       <w:r>
-        <w:t xml:space="preserve"> Das Modell nach B1 Kapitel 10 (Abbildung 43) ist umgesetzt: übergeordnete Referenzstruktur (Schiessplatz, Stellungsraum, Waffe/Kaliber/Waffenkategorie, Kombination, zulässige Zuordnung, Kontingent, Feiertage), zustandsunabhängige Nutzungen mit n Positionen (Dezimalmenge, Einheit), Zustandsebene Immissionsberechnung → Zustand → Anlageteile, Schusslinien mit Quelldaten Anhang 9/7 (= Gewichte der Verteilung), Immissionspunkte, Gebäude, WLR je Zeitgruppe und die weiteren FGDB-Objekte; zusammengesetzte Fremdschlüssel verhindern Verknüpfungen über Zustände hinweg, Unique-Indizes erzwingen genau einen aktuellen und einen MGDM-Zustand; der Berechnungsstand (Berechnungslauf mit Kopie der Nutzungen, Referenz-Snapshot, Kernversion, Prüfsumme) ist umgesetzt. Physische Tabellen deutsch; Spalten deutsch in der Zustandsebene und im Berechnungslauf, in Referenzstruktur und Nutzungen noch englisch (gleiches Muster, nächster Schritt). Der Demo-Datensatz «SLIM Demo» mit neun Schiessplätzen wird über denselben Import aus diesem Modell erzeugt.</w:t>
+        <w:t xml:space="preserve"> Das Modell nach B1 Kapitel 10 (Abbildung 43) ist umgesetzt: Referenzstruktur, zustandsunabhängige Nutzungen mit n Positionen, Zustandsebene (Immissionsberechnung → Zustand → Anlageteile, Schusslinien mit Quelldaten Anhang 9/7, Immissionspunkte, Gebäude, WLR je Zeitgruppe, weitere FGDB-Objekte); zusammengesetzte Fremdschlüssel verhindern Verknüpfungen über Zustände hinweg, Unique-Indizes erzwingen genau einen aktuellen und einen MGDM-Zustand; der Berechnungsstand (Kopie der Nutzungen, Referenz-Snapshot, Kernversion, Prüfsumme) ist umgesetzt. Tabellen sind deutsch benannt, Spalten deutsch in Zustandsebene und Berechnungslauf; die Spalten der Referenzstruktur und der Nutzungen werden in LP1 umbenannt. Geometrien liegen im Prototyp als Text (WKT) vor, im Zielsystem als PostGIS-Geometrien.</w:t>
       </w:r>
     </w:p>
     <w:p>
@@ -884,7 +870,7 @@
         <w:t xml:space="preserve">Rollen und Rechte (B1 8.1):</w:t>
       </w:r>
       <w:r>
-        <w:t xml:space="preserve"> Die vier Rollen sind mit der Rechtematrix 8.1.2 als App-Rechte (R/W/X je Applikationsbereich) hinterlegt; «W/R-O – nur zugeordnete Schiessplätze» erzwingt eine Objektregel der Rule-Engine (Zuordnung Benutzer ↔ Schiessplatz, 403 ausserhalb, gefilterte Listen). Jede Route und jeder Deep Link wird serverseitig geprüft; die Oberfläche blendet Menüs und Aktionen nach denselben Rollen-Schlüsseln aus (CASL). </w:t>
+        <w:t xml:space="preserve"> Die vier Rollen sind mit der Rechtematrix 8.1.2 als App-Rechte (R/W/X je Applikationsbereich) hinterlegt; «W/R-O – nur zugeordnete Schiessplätze» erzwingt eine Objektregel der Rule-Engine (Zuordnung Benutzer ↔ Schiessplatz, 403 ausserhalb, gefilterte Listen). Jede Route und jeder Deep Link wird serverseitig geprüft; die Oberfläche blendet Menüs und Aktionen nach denselben Rollen-Schlüsseln aus. </w:t>
       </w:r>
       <w:r>
         <w:rPr>
@@ -894,7 +880,7 @@
         <w:t xml:space="preserve">Anmeldung:</w:t>
       </w:r>
       <w:r>
-        <w:t xml:space="preserve"> «MFA oder AGOV» (slm 35) erfüllt SLIM mit einer Zwei-Faktor-Anmeldung in SLIM selbst: Passwort plus zweiter Faktor über TOTP-App (RFC 6238; Enrollment per QR-Code bei der ersten Anmeldung, Seeds verschlüsselt gespeichert, Wiederherstellung über einmalige Backup-Codes oder Rücksetzung durch den Applikationsadministrator im Vier-Augen-Prinzip, kein E-Mail-Umweg um den zweiten Faktor), für jedes Konto erzwungen; dazu Passwortregeln und Sperre nach Fehlversuchen. Der Prototyp bringt den zweiten Faktor heute als E-Mail-Code mit (in der Demo nicht aktiviert); TOTP ersetzt ihn im ersten Sprint. Entscheid der Anbieterin gemäss FAQ 27: MFA in SLIM, weil alle Nutzer über die VBS-Benutzerverwaltung geführt werden und keine Anschlussvereinbarung mit der Bundeskanzlei nötig ist; AGOV (OIDC) ist als vorbereitete Option für externe Nutzer beschrieben und kann ohne Änderung des Fachmodells ergänzt werden. </w:t>
+        <w:t xml:space="preserve"> «MFA oder AGOV» (slm 35) erfüllt SLIM mit einer Zwei-Faktor-Anmeldung in SLIM selbst: Passwort plus zweiter Faktor über TOTP-App (RFC 6238; Enrollment per QR-Code bei der ersten Anmeldung, Seeds verschlüsselt gespeichert, Wiederherstellung über einmalige Backup-Codes oder Rücksetzung durch den Applikationsadministrator im Vier-Augen-Prinzip), für jedes Konto erzwungen; dazu Passwortregeln und Sperre nach Fehlversuchen. Entscheid der Anbieterin gemäss FAQ 27: MFA in SLIM, weil alle Nutzer über die VBS-Benutzerverwaltung geführt werden und keine Anschlussvereinbarung mit der Bundeskanzlei nötig ist; AGOV (OIDC) kann als Option für externe Nutzer ohne Änderung des Fachmodells ergänzt werden. </w:t>
       </w:r>
       <w:r>
         <w:rPr>
@@ -904,7 +890,7 @@
         <w:t xml:space="preserve">Nachvollziehbarkeit (slm 56):</w:t>
       </w:r>
       <w:r>
-        <w:t xml:space="preserve"> Logbuch mit Login (Methode), Fehlversuch mit Grund, Sperre, Logout, Token-Wiederverwendung, Passwort-Reset und -Änderung, E-Mail-Verifikation, Änderungen an Benutzern, Rollen, Stammdaten und Exporten; Maske mit Filtern und Excel-Export; Notfallzugang (Break-Glass) als dokumentierter Prozess mit Vier-Augen-Freigabe, versiegeltem Passwort und Pflichtprotokoll. </w:t>
+        <w:t xml:space="preserve"> Logbuch mit Login (Methode), Fehlversuch mit Grund, Sperre, Logout, Token-Wiederverwendung, Passwort-Reset und -Änderung, E-Mail-Verifikation, Änderungen an Benutzern, Rollen und Stammdaten sowie Exporten; Maske mit Filtern und Excel-Export; Notfallzugang (Break-Glass) als dokumentierter Prozess mit Vier-Augen-Freigabe, versiegeltem Passwort und Pflichtprotokoll. </w:t>
       </w:r>
       <w:r>
         <w:rPr>
@@ -924,7 +910,7 @@
         <w:t xml:space="preserve">Prototyp:</w:t>
       </w:r>
       <w:r>
-        <w:t xml:space="preserve"> Rollen, Matrix, Objektregel und Logbuch inkl. aller Auth-Ereignisse umgesetzt und getestet; Menü nach den App-Rechten der Sitzung, Lesemodus der Datenverwaltung nach Recht; 2FA per E-Mail-Code vorhanden, in der Demo nicht aktiviert; TOTP und die CASL-Ableitung der Schaltflächen folgen.</w:t>
+        <w:t xml:space="preserve"> Rollen, Matrix, Objektregel, Logbuch mit allen Auth-Ereignissen und die Security-Header (CSP beschränkt den Browser auf die eigene Herkunft und geo.admin.ch) sind umgesetzt und getestet; Menü und Lesemodus der Datenverwaltung folgen den App-Rechten der Sitzung. Der zweite Faktor ist als E-Mail-Code vorhanden (in der Demo nicht aktiviert); TOTP ersetzt ihn im ersten Sprint, die Ableitung der einzelnen Schaltflächen aus den Rechten folgt in LP1.</w:t>
       </w:r>
     </w:p>
     <w:p>
@@ -986,7 +972,7 @@
         <w:spacing w:after="120"/>
       </w:pPr>
       <w:r>
-        <w:t xml:space="preserve">SLIM wird in einem Schweizer Rechenzentrum (ISO 27001, Daten und Sicherungen bleiben in der Schweiz, Support aus der Schweiz) betrieben [OFFEN: Provider und Vertragspartner vor Abgabe benennen; Anforderungen sind festgelegt]. Drei getrennte Umgebungen (Entwicklung, Akzeptanz, Produktion) mit identischen Container-Images; NGINX terminiert TLS (≥ 1.2), liefert den Angular-Build und leitet </w:t>
+        <w:t xml:space="preserve">ongoing betreibt SLIM auf der Infrastruktur von [OFFEN: Hosting-Anbieter] in Schweizer Rechenzentren (reiner Infrastrukturanbieter gemäss FAQ 132, 140 und 180; Anforderungen: ISO 27001, IT-Grundschutz Si001). Sämtliche Applikations- und Projektdaten – alle Umgebungen, Sicherungen, Protokolle, Quellcode und Entwicklungsdaten – werden zu 100 % in der Schweiz gespeichert und bearbeitet; keine Kopie verlässt die Schweiz, auch nicht zu Sicherungszwecken (E1; Nachweis je System im Datenhaltungskonzept). Ein Wechsel des Hosting-Anbieters wird der Auftraggeberin zur Genehmigung vorgelegt. Drei getrennte Umgebungen (Entwicklung, Akzeptanz, Produktion) mit identischen Container-Images; NGINX terminiert TLS (≥ 1.2), liefert den Angular-Build und leitet </w:t>
       </w:r>
       <w:r>
         <w:rPr>
@@ -998,7 +984,7 @@
         <w:t xml:space="preserve">/api</w:t>
       </w:r>
       <w:r>
-        <w:t xml:space="preserve"> an den API-Container; Berechnungen, Importe und Exporte laufen in einem eigenen Worker-Container (Kapitel 4.4); PostgreSQL läuft als eigener Container mit persistentem Volume; Coolify verwaltet Bereitstellung, Umgebungsvariablen und Rollback, getrennt vom öffentlichen SLIM-Zugang (Zugang nur mit MFA und aus zugelassenen Netzen, Si001 Fernzugriff). Releases sind versionierte Artefakte mit Datenbankmigration und Smoke-Test über Health-Endpunkte. Rückfall: Migrationen werden rückwärtskompatibel geschrieben (erweitern statt umbenennen/löschen; Aufräumen erst im übernächsten Release), sodass das vorherige Image auf dem migrierten Schema lauffähig bleibt; jede Migration hat einen getesteten Down-Schritt; vor jedem Produktionsrelease wird eine Sicherung gezogen, und für nicht rückwärtskompatible Änderungen gilt ein abgestimmter Wiederherstellungsweg: Release im Wartungsfenster mit Schreibpause, PostgreSQL-Sicherung mit archivierten WAL-Segmenten (Point-in-Time-Recovery), Rückfall = Wiederherstellung auf den Zeitpunkt vor dem Release; die Rückfallgrenze (bis wann ein Rückfall ohne Datenverlust möglich ist) wird je Release festgelegt und kommuniziert. Der Rückfall wird auf dem Akzeptanzsystem geprobt. Sicherung (B1 12.8, FAQ 14/116): automatisch täglich und manuell vor Releases/Importen, Mehrgenerationen über zwölf Monate, RPO ein Tag, RTO zwei Tage, Integritätsprüfung jeder Sicherung (Prüfsumme und Probe-Restore), Alarm bei fehlender oder fehlerhafter Sicherung (slm 57), jährlicher Restore-Test, Kopie am Betriebsstandort und in einem zweiten Schweizer Standort, lesbarer Datendump (SQL/CSV) auf Verlangen. Gemäss FAQ 116 umfasst jede wiederherstellbare Sicherung den vollständigen, über alle Komponenten konsistenten Systemstand: Datenbank einschliesslich benötigter Transaktionsprotokolle, importierte Dateien und weitere persistente Dateibestände, passende Anwendungsversion und Container-Images, Datenbankschema und Migrationen sowie Infrastruktur-, Deployment- und Laufzeitkonfiguration. Für die Wiederherstellung erforderliche Schlüssel, Zertifikate und Secrets werden geschützt gesichert und nur berechtigten Wiederherstellungsverantwortlichen zugänglich gemacht. Ein Sicherungsmanifest ordnet Versionen, Sicherungszeitpunkt und Prüfsummen zusammengehörig zu; der Restore-Test stellt das Gesamtsystem aus diesem Stand wieder her und prüft Datenkonsistenz und Funktionsfähigkeit. Ein Datenbankdump allein ist kein vollständiges Systembackup. Monitoring: Health-Endpunkte, Metriken (Antwortzeiten, Fehlerraten, Jobs) und Alarmierung für den SLA-Nachweis (99 % Mo–Fr 07–19 Uhr). </w:t>
+        <w:t xml:space="preserve"> an den API-Container; Berechnungen, Importe und Exporte laufen in einem eigenen Worker-Container (Kapitel 4.4); PostgreSQL läuft als eigener Container mit persistentem Volume; Coolify verwaltet Bereitstellung, Umgebungsvariablen und Rollback (Zugang nur mit MFA und aus zugelassenen Netzen, Si001). Releases sind versionierte Artefakte mit Datenbankmigration und Smoke-Test über Health-Endpunkte. Rückfall: Migrationen sind rückwärtskompatibel (erweitern statt umbenennen oder löschen; Aufräumen erst im übernächsten Release), sodass das vorherige Image auf dem migrierten Schema lauffähig bleibt; jede Migration hat einen getesteten Down-Schritt. Für nicht rückwärtskompatible Änderungen gilt: Release im Wartungsfenster mit Schreibpause, Sicherung mit archivierten WAL-Segmenten (Point-in-Time-Recovery), Rückfall durch Wiederherstellung auf den Zeitpunkt vor dem Release; der Rückfall wird auf dem Akzeptanzsystem geprobt. Sicherung (B1 12.8, FAQ 14/116): automatisch täglich und manuell vor Releases und Importen, Mehrgenerationen über zwölf Monate, RPO ein Tag, RTO zwei Tage, Integritätsprüfung jeder Sicherung (Prüfsumme und Probe-Restore), Alarm bei fehlender oder fehlerhafter Sicherung (slm 57), jährlicher Restore-Test, Kopie am Betriebsstandort und an einem zweiten Schweizer Standort, lesbarer Datendump (SQL/CSV) auf Verlangen. Jede Sicherung umfasst gemäss FAQ 116 den über alle Komponenten konsistenten Systemstand: Datenbank mit Transaktionsprotokollen, importierte Dateien, Anwendungsversion und Container-Images, Schema und Migrationen sowie Infrastruktur- und Laufzeitkonfiguration; Schlüssel, Zertifikate und Secrets werden getrennt und geschützt gesichert. Ein Sicherungsmanifest ordnet Versionen, Zeitpunkt und Prüfsummen zu; der Restore-Test stellt das Gesamtsystem wieder her und prüft Datenkonsistenz und Funktion. Monitoring: Health-Endpunkte, Metriken (Antwortzeiten, Fehlerraten, Jobs) und Alarmierung für den SLA-Nachweis (99 % Mo–Fr 07–19 Uhr). </w:t>
       </w:r>
       <w:r>
         <w:rPr>
@@ -1008,7 +994,7 @@
         <w:t xml:space="preserve">Prototyp:</w:t>
       </w:r>
       <w:r>
-        <w:t xml:space="preserve"> Docker-Image (Node 24, pm2), Compose mit MariaDB und PostGIS-Container (Boot gegen PostgreSQL wartet auf die Typzuordnung aus 2.2), Health-Endpunkte, CI mit Lint, Unit-, HTTP- und End-to-End-Tests je Commit, reproduzierbarer Setup-Wizard.</w:t>
+        <w:t xml:space="preserve"> Docker-Image (Node 24, pm2), Compose mit MariaDB und PostGIS-Container, Health-Endpunkte, CI mit Lint, Unit-, HTTP- und End-to-End-Tests je Commit, reproduzierbarer Setup-Wizard; Sicherung, Monitoring und Worker werden mit der Betriebsplattform aufgebaut.</w:t>
       </w:r>
     </w:p>
     <w:p>
@@ -1090,43 +1076,7 @@
         <w:t xml:space="preserve">GET</w:t>
       </w:r>
       <w:r>
-        <w:t xml:space="preserve"> Anlageninformationen (Schiessplätze → Stellungsräume → zulässige Waffen/Kaliber – genau das Modell </w:t>
-      </w:r>
-      <w:r>
-        <w:rPr>
-          <w:rFonts w:ascii="Consolas" w:cs="Consolas" w:eastAsia="Consolas" w:hAnsi="Consolas"/>
-          <w:sz w:val="20"/>
-          <w:szCs w:val="20"/>
-          <w:shd w:fill="F2F2F2" w:val="clear"/>
-        </w:rPr>
-        <w:t xml:space="preserve">area</w:t>
-      </w:r>
-      <w:r>
-        <w:t xml:space="preserve">/</w:t>
-      </w:r>
-      <w:r>
-        <w:rPr>
-          <w:rFonts w:ascii="Consolas" w:cs="Consolas" w:eastAsia="Consolas" w:hAnsi="Consolas"/>
-          <w:sz w:val="20"/>
-          <w:szCs w:val="20"/>
-          <w:shd w:fill="F2F2F2" w:val="clear"/>
-        </w:rPr>
-        <w:t xml:space="preserve">area_room</w:t>
-      </w:r>
-      <w:r>
-        <w:t xml:space="preserve">/</w:t>
-      </w:r>
-      <w:r>
-        <w:rPr>
-          <w:rFonts w:ascii="Consolas" w:cs="Consolas" w:eastAsia="Consolas" w:hAnsi="Consolas"/>
-          <w:sz w:val="20"/>
-          <w:szCs w:val="20"/>
-          <w:shd w:fill="F2F2F2" w:val="clear"/>
-        </w:rPr>
-        <w:t xml:space="preserve">area_weapon</w:t>
-      </w:r>
-      <w:r>
-        <w:t xml:space="preserve">) und </w:t>
+        <w:t xml:space="preserve"> Anlageninformationen (Schiessplätze → Stellungsräume → zulässige Waffen/Kaliber) und </w:t>
       </w:r>
       <w:r>
         <w:rPr>
@@ -1138,7 +1088,17 @@
         <w:t xml:space="preserve">POST</w:t>
       </w:r>
       <w:r>
-        <w:t xml:space="preserve"> genau eine Schiessplatznutzung. Authentifizierung über ein technisches Konto mit eigener Rolle (nur diese zwei Endpunkte): Vorschlag der Anbieterin ist OAuth2 Client Credentials (kurzlebige Zugriffstoken, Geheimnis-Rotation ohne Unterbruch, Scope auf die zwei Endpunkte) mit IP-Allowlist; mTLS bleibt als Alternative, falls die ELO-Seite kein Token-Handling einführen will – der Entscheid fällt bei der Schnittstellenabstimmung. JSON UTF-8, HTTPS mit TLS ≥ 1.2. Jede Meldung trägt einen Idempotenz-Schlüssel: eine Wiederholung liefert dieselbe Antwort und erzeugt keine Doppelnutzung. Validierung vor dem Speichern: Schema, Pflichtfelder, existierende IDs, Viertelstundenraster, Ende &gt; Start, Feldlängen, zulässige Kombination Stellungsraum × Waffe, Sperrdatum; Fehler kommen synchron mit HTTP-Status, Fehlercode und verständlicher Meldung zurück, gültige Nutzungen erhalten die Herkunft «ELO» und sind sofort in Maske 5.11 und in der Beurteilung sichtbar. Vorgehen: Die Schnittstellenspezifikation (Felder, Codes, Fehlerfälle, Konten) wird zu Beginn mit der Auftraggeberin und der ELO-Seite abgestimmt und als OpenAPI-Dokument festgeschrieben (die ELO-seitige Spezifikation verantwortet gemäss FAQ 17 die Auftraggeberin unter Zuzug der ELO-Entwicklerfirma, Aufwände für Anpassungen an ELO trägt die Auftraggeberin); SLIM stellt früh eine Testumgebung mit Demo-Daten bereit; Integrationstests über beide Systeme (Anlagenabruf, Meldung, alle Fehlerfälle) gehören zur Abnahme. Die Erfahrung des Projektteams mit ELO und der gemeinsamen Plattform verkürzt Abstimmung und Fehlersuche, ersetzt diese Schritte aber nicht [OFFEN: Formulierung an die einreichende Firma anpassen]. </w:t>
+        <w:t xml:space="preserve"> genau eine Schiessplatznutzung. Authentifizierung über ein technisches Konto mit eigener Rolle (nur diese zwei Endpunkte): Vorschlag der Anbieterin ist OAuth2 Client Credentials (kurzlebige Zugriffstoken, Geheimnis-Rotation ohne Unterbruch) mit IP-Allowlist, mTLS als Alternative – der Entscheid fällt bei der Schnittstellenabstimmung. JSON UTF-8, HTTPS mit TLS ≥ 1.2. Jede Meldung trägt einen Idempotenz-Schlüssel: Eine Wiederholung liefert dieselbe Antwort und erzeugt keine Doppelnutzung. Validierung vor dem Speichern: Schema, Pflichtfelder, existierende IDs, Viertelstundenraster, Ende &gt; Start, Feldlängen, zulässige Kombination Stellungsraum × Waffe, Sperrdatum; Fehler kommen synchron mit HTTP-Status, Fehlercode und verständlicher Meldung zurück, gültige Nutzungen erhalten die Herkunft «ELO» und sind sofort in Maske 5.11 und in der Beurteilung sichtbar. </w:t>
+      </w:r>
+      <w:r>
+        <w:rPr>
+          <w:b/>
+          <w:bCs/>
+        </w:rPr>
+        <w:t xml:space="preserve">Beide Seiten in einer Hand:</w:t>
+      </w:r>
+      <w:r>
+        <w:t xml:space="preserve"> Die Entwicklerin hat ELO auf demselben Technologie-Stack entwickelt und kennt Datenmodell und Fachbegriffe beider Systeme. Das senkt das Integrationsrisiko, ersetzt die Abstimmung aber nicht: Die Schnittstellenspezifikation (Felder, Codes, Fehlerfälle, Konten) wird zu Beginn mit der Auftraggeberin festgelegt und als OpenAPI-Dokument festgeschrieben (die ELO-seitige Spezifikation verantwortet gemäss FAQ 17 die Auftraggeberin unter Zuzug der ELO-Entwicklerfirma, Anpassungen an ELO trägt die Auftraggeberin); SLIM stellt früh eine Testumgebung mit Demo-Daten bereit; Integrationstests über beide Systeme (Anlagenabruf, Meldung, alle Fehlerfälle) gehören zur Abnahme. </w:t>
       </w:r>
       <w:r>
         <w:rPr>
@@ -1148,7 +1108,7 @@
         <w:t xml:space="preserve">Prototyp:</w:t>
       </w:r>
       <w:r>
-        <w:t xml:space="preserve"> Datenmodell (Nutzung mit n Positionen, Herkunft «ELO» mit Kennzeichen in der Maske, Idempotenz über die externe ID) und die Validierungsregeln des Nutzungs-Service (Viertelstundenraster, Ende &gt; Start, Einheit ≤ 256 Zeichen, Anzahl Personen, zivile Nutzungsart als bedingtes Pflichtfeld, nur zulässige Kombinationen des Stellungsraums, Dezimalmengen mit Einheit) sind umgesetzt und getestet; die beiden Endpunkte folgen als dünne Controller darauf.</w:t>
+        <w:t xml:space="preserve"> Die beiden Endpunkte sind noch nicht umgesetzt; sie werden in LP1 gebaut. Vorhanden und getestet sind das Datenmodell (Nutzung mit n Positionen, Herkunft «ELO» mit Kennzeichen in der Maske, Idempotenz über die externe ID) und die Validierungsregeln des Nutzungs-Service (Viertelstundenraster, Ende &gt; Start, Anzahl Personen, zivile Nutzungsart als bedingtes Pflichtfeld, nur zulässige Kombinationen, Dezimalmengen mit Einheit, Sperrdatum), auf denen die Endpunkte als dünne Controller aufsetzen.</w:t>
       </w:r>
     </w:p>
     <w:p>
@@ -1176,7 +1136,7 @@
         <w:t xml:space="preserve">Stammdaten (slm 36):</w:t>
       </w:r>
       <w:r>
-        <w:t xml:space="preserve"> Initialimport aus B1.6 «Areal_Grundlagen» und B1.7 Waffenliste per CSV/Excel in einen Prüfbereich (Staging-Tabellen); Abgleich über Koordinationsabschnitt-Nr., Stellungsraum-Name und Waffe/Kaliber; Prüfbericht mit Zeilenbezug; Übernahme erst nach fehlerfreiem Lauf. Vorgehen der Migration (B1 9.2, FAQ 28): Die Auftraggeberin bereitet die Daten in rund drei Monaten per ETL auf und verantwortet ihre Qualität; SLIM liefert das Zielformat und den Prüfbericht; Probemigration auf dem Akzeptanzsystem mit Mengenabgleich (Schiessplätze, Stellungsräume, Kombinationen, Zuordnungen, Kontingente) und fachlicher Stichprobe, Freigabe durch die Auftraggeberin, dann Produktivmigration im Wartungsfenster mit Sicherung davor (Testdaten gemäss Mitwirkungspflichten A1.1, Ziffer 6). Historische Nutzungen und frühere Berechnungen sind gemäss B1 9.2 nicht Teil des Initialimports; die Strukturen (Nutzungen je Jahr, Zustände je Lieferung) sind dafür vorbereitet, ein späterer Nachimport ist ein Change.</w:t>
+        <w:t xml:space="preserve"> Initialimport aus B1.6 «Areal_Grundlagen» und B1.7 Waffenliste per CSV/Excel in einen Prüfbereich (Staging-Tabellen); Abgleich über Koordinationsabschnitt-Nr., Stellungsraum-Name und Waffe/Kaliber; Prüfbericht mit Zeilenbezug; Übernahme erst nach fehlerfreiem Lauf. Vorgehen (B1 9.2, FAQ 28): Die Auftraggeberin bereitet die Daten in rund drei Monaten per ETL auf und verantwortet ihre Qualität; SLIM liefert das Zielformat und den Prüfbericht; Probemigration auf dem Akzeptanzsystem mit Mengenabgleich und fachlicher Stichprobe, Freigabe durch die Auftraggeberin, dann Produktivmigration im Wartungsfenster mit Sicherung davor. Historische Nutzungen und frühere Berechnungen sind gemäss B1 9.2 nicht Teil des Initialimports; ein späterer Nachimport ist ein Change.</w:t>
       </w:r>
     </w:p>
     <w:p>
@@ -1196,7 +1156,7 @@
         <w:t xml:space="preserve">Schusszahlen (slm 37):</w:t>
       </w:r>
       <w:r>
-        <w:t xml:space="preserve"> Excel-Import nach der Vorlage B1.6 (B1 Kapitel 9.3) mit denselben Regeln wie die Maske 5.11 und wie ELO; Zeilen mit unbekanntem Stellungsraum oder unzulässiger Kombination werden abgewiesen und im Bericht ausgewiesen (slm 45).</w:t>
+        <w:t xml:space="preserve"> Excel-Import nach der Vorlage B1.6 (B1 9.3) mit denselben Regeln wie Maske 5.11 und ELO; Zeilen mit unbekanntem Stellungsraum oder unzulässiger Kombination werden abgewiesen und im Bericht ausgewiesen.</w:t>
       </w:r>
     </w:p>
     <w:p>
@@ -1213,7 +1173,7 @@
           <w:b/>
           <w:bCs/>
         </w:rPr>
-        <w:t xml:space="preserve">Berechnungsdaten (slm 19, 21):</w:t>
+        <w:t xml:space="preserve">Berechnungsdaten (slm 19–21):</w:t>
       </w:r>
       <w:r>
         <w:t xml:space="preserve"> Ablauf nach B1 9.1: SLIM exportiert die Grundlage (Zustand, Nutzungen), das Ingenieurbüro rechnet in sonARMS, die zurückgelieferte FGDB wird durch KOMZ Lärm mit der FME-Workbench </w:t>
@@ -1226,7 +1186,7 @@
         <w:t xml:space="preserve">fachlich</w:t>
       </w:r>
       <w:r>
-        <w:t xml:space="preserve"> validiert (ausserhalb von SLIM); SLIM prüft beim Import nur Struktur und Zuordnung. Die FGDB (Anlagenteile, Empfangspunkte, WLR-DAY/WLR-NIGHT, Betriebsdaten A9/A7) wird mit GDAL/OGR gelesen, in Staging geladen und geprüft: Quellen-IDs müssen auf bekannte Stellungsräume/Waffen abbilden, Empfangspunkte brauchen ES und EGID und werden über die sonARMS_ID (B1.2 V5) abgeglichen, WLR-Werte müssen vollständig sein. Erst dann entsteht ein neuer </w:t>
+        <w:t xml:space="preserve"> validiert (ausserhalb von SLIM); SLIM prüft beim Import Struktur und Zuordnung. SLIM liest und schreibt die FGDB (Anlagenteile, Empfangspunkte, WLR-DAY/WLR-NIGHT, Betriebsdaten A9/A7) direkt über die GDAL-Bibliotheken (OGR, Treiber OpenFileGDB); die Lese- und Schreibfähigkeit wird zu Projektbeginn mit den Testdaten von KOMZ Lärm validiert, das endgültige Schema gemäss FAQ 99 gemeinsam festgelegt. Die Daten werden in Staging geladen und geprüft: Quellen-IDs müssen auf bekannte Stellungsräume und Waffen abbilden, Empfangspunkte brauchen ES und EGID und werden über die sonARMS_ID abgeglichen, WLR-Werte müssen vollständig sein. Erst dann entsteht ein neuer </w:t>
       </w:r>
       <w:r>
         <w:rPr>
@@ -1236,7 +1196,7 @@
         <w:t xml:space="preserve">Zustand</w:t>
       </w:r>
       <w:r>
-        <w:t xml:space="preserve"> mit Referenzjahr, Baujahr-Klasse und Kennzeichen «gültig»/«MGDM»; frühere Zustände bleiben erhalten. </w:t>
+        <w:t xml:space="preserve">; frühere Zustände bleiben erhalten. </w:t>
       </w:r>
       <w:r>
         <w:rPr>
@@ -1246,7 +1206,7 @@
         <w:t xml:space="preserve">Prototyp:</w:t>
       </w:r>
       <w:r>
-        <w:t xml:space="preserve"> Import 5.19 umgesetzt: Staging, Validierung ohne Schreiben (Befunde, Warnungen, Zähler), Abbruch bei unbekanntem Stellungsraum oder doppeltem Anlageteil ohne einen Datensatz zu schreiben (slm 45), Übernahme in einer Transaktion als neuer Zustand mit Anlageteilen, Schusslinien, Quelldaten, Immissionspunkten, Gebäuden und WLR je Zeitgruppe; Upload von WLR- und Betriebsdaten-Dateien je Zeitgruppe. Die Berechnungsdatei wird heute als validiertes JSON (FME-Export) gelesen; das direkte Lesen der FGDB über GDAL folgt.</w:t>
+        <w:t xml:space="preserve"> Import 5.19 umgesetzt: Staging, Validierung ohne Schreiben (Befunde, Warnungen, Zähler), Abbruch bei unbekanntem Stellungsraum oder doppeltem Anlageteil, ohne einen Datensatz zu schreiben (slm 45), Übernahme in einer Transaktion als neuer Zustand; WLR- und Betriebsdaten-Dateien je Zeitgruppe werden direkt gelesen. Die Berechnungsdatei selbst liest und schreibt der Prototyp als JSON derselben Struktur (FME-Export); die GDAL-Anbindung ersetzt diesen Schritt, die Prüfungen bleiben unverändert.</w:t>
       </w:r>
     </w:p>
     <w:p>
@@ -1279,7 +1239,7 @@
         <w:t xml:space="preserve">.xlsx</w:t>
       </w:r>
       <w:r>
-        <w:t xml:space="preserve">) und CSV (UTF-8, Semikolon) über ExcelJS; FGDB über GDAL. Grosse Dateien werden per Drag-and-Drop abgelegt und zeilenweise gestreamt (kein Laden ganzer Dateien in den Speicher), Geometrien in räumliche Indizes übernommen, Ausschnittabfragen der Karte lesen nur den sichtbaren Bereich. Jeder Import läuft als Job (Kapitel 6.2): Datei ablegen → Struktur prüfen → fachlich validieren → Bericht → Übernahme in einer Transaktion. Fehler werden nie verschluckt: Der Bericht nennt Zeile, Feld, Regel und Behebung; ein Import mit Fehlern übernimmt nichts. Alle Prüfregeln sind dieselben wie in Maske und Schnittstelle (ein Service).</w:t>
+        <w:t xml:space="preserve">) und CSV (UTF-8, Semikolon) über ExcelJS; FGDB über GDAL. Grosse Dateien werden per Drag-and-Drop abgelegt und zeilenweise gestreamt, Geometrien in räumliche Indizes übernommen; Ausschnittabfragen der Karte lesen nur den sichtbaren Bereich. Jeder Import läuft als Job (Kapitel 6.2): Datei ablegen → Struktur prüfen → fachlich validieren → Bericht → Übernahme in einer Transaktion. Fehler werden nie verschluckt: Der Bericht nennt Zeile, Feld, Regel und Behebung; ein Import mit Fehlern übernimmt nichts. Alle Prüfregeln sind dieselben wie in Maske und Schnittstelle (ein Service).</w:t>
       </w:r>
     </w:p>
     <w:p>
@@ -1295,7 +1255,7 @@
         <w:spacing w:after="120"/>
       </w:pPr>
       <w:r>
-        <w:t xml:space="preserve">Jede Tabelle exportiert ihre aktuelle Sicht (Filter, Spalten) als Excel und CSV (slm 39); davon getrennt der vollständige Nutzungsexport mit allen Attributen im Format B1.6 (slm 40) und die Gesamtstatistik MPV mit einer Zeile je Schiessplatz – Kontingent- und Grenzwertstatus je Anhang, Stand SPM/MPV/Projekt, Berechnungsgrundlage (slm 41). Berechnungsstände werden als GeoDB (GDAL) und CSV exportiert (slm 20). Für MGDM und ImmoGIS (slm 38) stellt PostgreSQL lesende Views mit eigenen technischen Konten bereit (nur SELECT auf die fachlichen Views, kein Zugriff auf Auth- und Mandantentabellen, protokolliert); der Zugriffsweg ist ein dedizierter, TLS-verschlüsselter Datenbankendpunkt im Netzsegment der Auftraggeberin oder über VPN, mit IP-Allowlist – die Datenbank ist nie öffentlich erreichbar; Details werden mit Provider und Auftraggeberin festgelegt; bundesinterne Empfänger gemäss FAQ 15. </w:t>
+        <w:t xml:space="preserve">Jede Tabelle exportiert ihre aktuelle Sicht (Filter, Spalten) als Excel und CSV (slm 3, 39); davon getrennt der vollständige Nutzungsexport im Format B1.6 (slm 40) und die Gesamtstatistik MPV mit einer Zeile je Schiessplatz – Kontingent- und Grenzwertstatus je Anhang, Stand SPM/MPV/Projekt, Berechnungsgrundlage (slm 41). Berechnungsstände werden als GeoDB (GDAL) und CSV exportiert (slm 20). Für MGDM und ImmoGIS (slm 38) stellt PostgreSQL lesende Views mit eigenen technischen Konten bereit (nur SELECT auf die fachlichen Views, protokolliert); Zugriff über einen dedizierten, TLS-verschlüsselten Datenbankendpunkt mit IP-Allowlist oder VPN – die Datenbank ist nie öffentlich erreichbar; Netze und Quellen werden gemäss FAQ 171 zu Beginn der Realisierung festgelegt. </w:t>
       </w:r>
       <w:r>
         <w:rPr>
@@ -1305,7 +1265,7 @@
         <w:t xml:space="preserve">Prototyp:</w:t>
       </w:r>
       <w:r>
-        <w:t xml:space="preserve"> Excel-Export des Logbuchs und der Waffen-Stammdaten, Export der Zustände als wieder importierbares Bündel (5.20), Schusszahlen als CSV; die Exporte nach B1.6, die MPV-Statistik und die GeoDB folgen.</w:t>
+        <w:t xml:space="preserve"> Tabellen-Export als Excel (fester Kopfblock mit Titel, Auswahl, Filter, Exportdatum und Benutzer) und als CSV in der Übersicht der Schiessplätze und in den Schusszahlen, Excel-Export des Logbuchs und der Waffen-Stammdaten, Zustände als wieder importierbares Bündel (5.20), Schusszahlen als CSV. In LP1 folgen der Export in den übrigen Tabellen, das Format B1.6, die MPV-Statistik, die GeoDB und die Views.</w:t>
       </w:r>
     </w:p>
     <w:p>
@@ -1329,7 +1289,7 @@
         <w:spacing w:after="120"/>
       </w:pPr>
       <w:r>
-        <w:t xml:space="preserve">Eingaben: Nutzungen des Zeitraums (je Kombination Stellungsraum × Waffe/Kaliber), die Quellen des Zustands (Stellungsraum + Schusslinie + Waffe, Kapitel 2.3) mit Gewicht und Kategorie, der gewählte Zustand mit den Pegeln je Empfangspunkt × Quelle – für Anhang 9 der LAE aus WLR_Day (Tag) und WLR_Eve (Abend), für Anhang 7 der LAFmax aus WLR_Day (B1 7.6.1/7.6.2; die Zuordnung der Dateien erfolgt über ihr Format, nicht über den Dateinamen) –, Empfangspunkte mit Empfindlichkeitsstufe, Baujahr der zugehörigen Stellungsräume. Ergebnisse: Beurteilungspegel je Empfangspunkt (Anhang 9: LAE1/LAE2/Lr; Anhang 7: Li/Lri/Lr), Grenzwert, Reserve und Ampel je Zeile, aggregiert je Schiessplatz. Die akustischen Grundlagen stammen aus sonARMS; SLIM baut die Schallausbreitung nicht nach.</w:t>
+        <w:t xml:space="preserve">Eingaben: Nutzungen des Zeitraums (je Kombination Stellungsraum × Waffe/Kaliber), die Quellen des Zustands mit Gewicht und Kategorie, die Pegel je Empfangspunkt × Quelle – für Anhang 9 der LAE aus WLR_Day (Tag) und WLR_Eve (Abend), für Anhang 7 der LAFmax aus WLR_Day (B1 7.6.1/7.6.2) –, Empfangspunkte mit Empfindlichkeitsstufe, Baujahr der zugehörigen Stellungsräume. Ergebnisse: Beurteilungspegel je Empfangspunkt (Anhang 9: LAE1/LAE2/Lr; Anhang 7: Li/Lri/Lr), Grenzwert, Reserve und Ampel je Zeile, aggregiert je Schiessplatz. Die akustischen Grundlagen stammen aus sonARMS; SLIM baut die Schallausbreitung nicht nach.</w:t>
       </w:r>
     </w:p>
     <w:p>
@@ -1406,7 +1366,7 @@
         <w:t xml:space="preserve">Anhang 9</w:t>
       </w:r>
       <w:r>
-        <w:t xml:space="preserve"> berücksichtigt alle Kategorien – Militär, Zivil, Blaulicht und SAT; </w:t>
+        <w:t xml:space="preserve"> berücksichtigt alle Kategorien (Militär, Zivil, Blaulicht, SAT); </w:t>
       </w:r>
       <w:r>
         <w:rPr>
@@ -1416,7 +1376,7 @@
         <w:t xml:space="preserve">Anhang 7</w:t>
       </w:r>
       <w:r>
-        <w:t xml:space="preserve"> normalerweise Zivil und SAT, alle Kategorien bei gesetztem Flag «Gesamtbeurteilung nach Anhang 7» des Schiessplatzes; nur Nutzungen mit gültiger Zuordnung Stellungsraum × Waffe.</w:t>
+        <w:t xml:space="preserve"> Zivil und SAT, alle Kategorien bei gesetztem Flag «Gesamtbeurteilung nach Anhang 7» des Schiessplatzes; nur Nutzungen mit gültiger Zuordnung Stellungsraum × Waffe. Ob zivile Nutzungen in Anhang 9 einfliessen, wird gemäss FAQ 165 zu Beginn der Realisierung mit KOMZ Lärm bestätigt; die Regel liegt an einer Stelle des Berechnungskerns.</w:t>
       </w:r>
     </w:p>
     <w:p>
@@ -1439,7 +1399,7 @@
         <w:t xml:space="preserve">lokal am Standort</w:t>
       </w:r>
       <w:r>
-        <w:t xml:space="preserve"> (B1 S. 71): je Schiessplatz ein Kalender aus nationalen, kantonalen und Gemeinde-Feiertagen inklusive halber Feiertage (Vor-/Nachmittag), in der erweiterten Konfiguration pflegbar und aus Vorlagen übernehmbar; Schiesshalbtage je Waffenkategorie a–f (Werktag Mo–Sa / Sonn- und Feiertag; Grenze Vormittag/Nachmittag 12:00 Uhr nach B1 7.4.3; ein Halbtag zählt 1 bei mehr als zwei Stunden Schiesszeit, sonst ½, LSV Anhang 7 Ziffer 322; mehrere Nutzungen im selben Halbtag werden zusammengezählt). Betrachtungszeitraum: Der Benutzer wählt je Berechnung die repräsentativen Jahre – Standard drei, auch nicht aufeinanderfolgende (z. B. 2020, 2023, 2025) – oder einen beliebigen Zeitraum (B1 7.4.5); die Betriebsdaten werden als Jahresmittel über diese Auswahl gebildet.</w:t>
+        <w:t xml:space="preserve"> (B1 S. 71, FAQ 164): je Schiessplatz ein in SLIM gepflegter Kalender aus nationalen, kantonalen und Gemeinde-Feiertagen inklusive halber Feiertage. Schiesshalbtage je Waffenkategorie a–f (Werktag Mo–Sa / Sonn- und Feiertag; Grenze Vormittag/Nachmittag 12:00 Uhr nach B1 7.4.3; ein Halbtag zählt 1 bei mehr als zwei Stunden Schiesszeit, sonst ½, LSV Anhang 7 Ziffer 322; mehrere Nutzungen im selben Halbtag werden zusammengezählt). Betrachtungszeitraum: je Berechnung die repräsentativen Jahre – Standard drei, auch nicht aufeinanderfolgende – oder ein beliebiger Zeitraum (B1 7.4.5); die Betriebsdaten werden als Jahresmittel über diese Auswahl gebildet.</w:t>
       </w:r>
     </w:p>
     <w:p>
@@ -1452,7 +1412,7 @@
         <w:spacing w:after="40"/>
       </w:pPr>
       <w:r>
-        <w:t xml:space="preserve">Verteilung auf Quellen: jede Kombination Stellungsraum × Waffe kennt ihre Quellen des Zustands mit Gewicht (Kapitel 2.3); die Schusszahlen aus Schritt 2 werden im Verhältnis dieser Gewichte auf die Quellen (Schusslinien) verteilt – eine Kombination mit genau einer Quelle erhält alles. Bei nicht verteilbaren oder nicht zuordenbaren positiven Schusszahlen wird die betroffene Gesamtbeurteilung als unvollständig und nicht abschliessend beurteilbar gekennzeichnet (Status «nicht beurteilbar» ohne Ampelfarbe, mit Prüfhinweis auf die betroffenen Kombinationen und den Zustand). Teilberechnungen können ergänzend angezeigt werden, werden jedoch nicht als gültige Gesamtbeurteilung ausgewiesen. Eine Gleichverteilung ist ausschliesslich nach dokumentierter Freigabe durch KOMZ Lärm zulässig (Parameter nur zusammen mit Referenz und Datum des Fachentscheids setzbar, Referenz wird im Berechnungsstand mitgeführt, Ergebnis trägt das Kennzeichen «Ersatzregel angewendet»); die Import-Validierung meldet Kombinationen mit Quellen, aber ohne Betriebsdaten bereits beim FGDB-Import. </w:t>
+        <w:t xml:space="preserve">Verteilung auf Quellen: Die Schusszahlen aus Schritt 2 werden im Verhältnis der Gewichte auf die Quellen (Schusslinien) der Kombination verteilt – eine Kombination mit genau einer Quelle erhält alles. Bei nicht verteilbaren oder nicht zuordenbaren positiven Schusszahlen wird die betroffene Gesamtbeurteilung als «nicht beurteilbar» gekennzeichnet (ohne Ampelfarbe, mit Prüfhinweis auf die betroffenen Kombinationen und den Zustand); Teilpegel bleiben sichtbar, gelten aber nicht als Gesamtbeurteilung. Eine Gleichverteilung ist nur nach dokumentierter Freigabe durch KOMZ Lärm zulässig (Parameter mit Referenz und Datum des Fachentscheids, im Berechnungsstand mitgeführt, Ergebnis mit Kennzeichen «Ersatzregel angewendet»); die Import-Validierung meldet Kombinationen mit Quellen, aber ohne Betriebsdaten. </w:t>
       </w:r>
       <w:r>
         <w:rPr>
@@ -1462,7 +1422,7 @@
         <w:t xml:space="preserve">Prototyp:</w:t>
       </w:r>
       <w:r>
-        <w:t xml:space="preserve"> Verteilung nach den Quelldaten-Gewichten des Zustands, Verweigern als Standard, Status «nicht beurteilbar» bis in Detailmaske, Simulation, Zähler, Übersichts-Ampel und Berechnungslauf umgesetzt und getestet; im Export folgt er mit den Exporten aus 3.4.</w:t>
+        <w:t xml:space="preserve"> umgesetzt und getestet bis in Detailmaske, Simulation, Übersichts-Ampel und Berechnungslauf.</w:t>
       </w:r>
     </w:p>
     <w:p>
@@ -1475,7 +1435,7 @@
         <w:spacing w:after="40"/>
       </w:pPr>
       <w:r>
-        <w:t xml:space="preserve">Beurteilungspegel je Empfangspunkt (LSV): Anhang 9 gemäss Beilage B1.4, Formelblatt A9X: LAE1 = GEMW(M_Tag, LAE_Day) + 10·log10(Σ M_Tag); LAE2 = GEMW(M_Ausserhalb, LAE_Eve) + 10·log10(Σ M_Ausserhalb) + 5; Lr = 10·log10(10^(0.1·LAE1) + 10^(0.1·LAE2)) − 10·log10(T / 1 s) + 15. GEMW ist das mit den Schusszahlen gewichtete energetische Mittel über die Quellen; M_Tag und M_Ausserhalb sind die auf die Quellen verteilten mittleren jährlichen Schusszahlen innerhalb bzw. ausserhalb Werktag. Die feste Bezugszeit beträgt T = 52 × 5 × 12 × 3600 s = 11’232’000 s. Alle Logarithmen haben Basis 10; der Zuschlag für Schüsse ausserhalb Werktag (+5 dB) ist bereits in LAE2 enthalten und wird nicht nochmals addiert. Anhang 7 mit Li je Waffenkategorie als energetischem Mittel, Ki = 10·log(Dw + 3·Ds) + 3·log(M) − 44, Lri = Li + Ki und Lr als energetischer Summe über die Kategorien. Leere Quellen und Nullfälle werden explizit behandelt (Marker «keine Energie» statt −∞).</w:t>
+        <w:t xml:space="preserve">Beurteilungspegel je Empfangspunkt, Anhang 9 gemäss Formelblatt A9X der Beilage B1.4: LAE1 = GEMW(M_Tag, LAE_Day) + 10·log10(Σ M_Tag); LAE2 = GEMW(M_Ausserhalb, LAE_Eve) + 10·log10(Σ M_Ausserhalb) + 5; Lr = 10·log10(10^(0.1·LAE1) + 10^(0.1·LAE2)) − 10·log10(T / 1 s) + 15. GEMW ist das mit den Schusszahlen gewichtete energetische Mittel über die Quellen; M_Tag und M_Ausserhalb sind die auf die Quellen verteilten mittleren jährlichen Schusszahlen innerhalb bzw. ausserhalb Werktag; T = 52 × 5 × 12 × 3600 s = 11’232’000 s. Der Zuschlag für Schüsse ausserhalb Werktag (+5 dB) ist in LAE2 enthalten und wird nicht nochmals addiert. Anhang 7 (Formelblatt A7X) mit Li je Waffenkategorie als energetischem Mittel, Ki = 10·log(Dw + 3·Ds) + 3·log(M) − 44, Lri = Li + Ki und Lr als energetischer Summe über die Kategorien. Leere Quellen und Nullfälle werden explizit behandelt (Marker «keine Energie» statt −∞).</w:t>
       </w:r>
     </w:p>
     <w:p>
@@ -1488,7 +1448,17 @@
         <w:spacing w:after="40"/>
       </w:pPr>
       <w:r>
-        <w:t xml:space="preserve">Grenzwerte nach ES und Baujahr der Stellungsräume (Stichtag 1. Januar 1985; </w:t>
+        <w:t xml:space="preserve">Grenzwerte nach ES und Baujahr der Stellungsräume (Stichtag 1. Januar 1985): Anlagen mit Stellungsräumen nur vor dem Stichtag werden am IGW gemessen, nur nach dem Stichtag am PW; bei gemischten Anlagen werden </w:t>
+      </w:r>
+      <w:r>
+        <w:rPr>
+          <w:b/>
+          <w:bCs/>
+        </w:rPr>
+        <w:t xml:space="preserve">zwei Datenmengen</w:t>
+      </w:r>
+      <w:r>
+        <w:t xml:space="preserve"> gerechnet und ausgewiesen – der Gesamtpegel aller Stellungsräume gegen den IGW und ein zweiter Pegel ausschliesslich aus den Quellen der Stellungsräume nach dem Stichtag gegen den PW (B1 7.4.5). Der Vergleich erfolgt mit dem auf ganze dB gerundeten Beurteilungspegel (Projekthandbuch B1.2 Kapitel 10.4: 60.4 → 60 eingehalten, 60.5 → 61 überschritten), die Anzeige mit einer Dezimale. </w:t>
       </w:r>
       <w:r>
         <w:rPr>
@@ -1498,17 +1468,490 @@
         <w:t xml:space="preserve">Prototyp:</w:t>
       </w:r>
       <w:r>
-        <w:t xml:space="preserve"> Rundung auf ganze dB und PW-Teilbetrachtung umgesetzt und getestet): Anlagen mit Stellungsräumen nur vor dem Stichtag werden am IGW gemessen, nur nach dem Stichtag am PW; bei gemischten Anlagen werden </w:t>
-      </w:r>
+        <w:t xml:space="preserve"> Rundung und PW-Teilbetrachtung umgesetzt und getestet; Grenzwerttabellen und Rundungsmodus sind Konstanten und werden in LP1 in die erweiterte Konfiguration (5.28) überführt.</w:t>
+      </w:r>
+    </w:p>
+    <w:p>
+      <w:pPr>
+        <w:spacing w:after="80"/>
+      </w:pPr>
+    </w:p>
+    <w:p>
+      <w:pPr>
+        <w:spacing w:after="120"/>
+      </w:pPr>
       <w:r>
         <w:rPr>
           <w:b/>
           <w:bCs/>
         </w:rPr>
-        <w:t xml:space="preserve">zwei Datenmengen</w:t>
-      </w:r>
-      <w:r>
-        <w:t xml:space="preserve"> gerechnet und ausgewiesen – der Gesamtpegel aller Stellungsräume gegen den IGW und ein zweiter Pegel ausschliesslich aus den Quellen der Stellungsräume nach dem Stichtag gegen den PW (B1 7.4.5); die Zuordnung Quelle → Stellungsraum liegt im eingefrorenen Zustand. Der Vergleich erfolgt mit dem auf ganze dB gerundeten Beurteilungspegel (Projekthandbuch B1.2 Kapitel 10.4: 60.4 → 60 eingehalten, 60.5 → 61 überschritten), die Anzeige mit einer Dezimale; der Rundungsmodus ist Konfiguration. Ampel rot &gt; Grenzwert, orange &gt; Grenzwert − 5 dB, sonst grün. Kontingent (B1 5.10): Soll aus der Plangenehmigung je Waffe/Kaliber gegen Ist des laufenden Jahres und gegen den Durchschnitt der drei letzten Jahre (gewähltes Jahr + zwei Vorjahre); eine Waffe ohne Kontingent hat Soll 0 und ist bei Nutzung rot; Ampel-Schwellen 100 %/125 %. Grenzwerttabellen, Rundung und Schwellen liegen im Zielzustand in der erweiterten Konfiguration (5.28). </w:t>
+        <w:t xml:space="preserve">Zwei Ampeln, zwei Massstäbe (FAQ 166).</w:t>
+      </w:r>
+      <w:r>
+        <w:t xml:space="preserve"> Lärm-Ampel und Kontingent-Ampel vergleichen verschiedene Grössen und haben eigene Schwellen in eigener Einheit:</w:t>
+      </w:r>
+    </w:p>
+    <w:tbl>
+      <w:tblPr>
+        <w:tblW w:type="pct" w:w="100%"/>
+        <w:tblBorders>
+          <w:top w:val="single" w:color="BFBFBF" w:sz="4"/>
+          <w:left w:val="single" w:color="BFBFBF" w:sz="4"/>
+          <w:bottom w:val="single" w:color="BFBFBF" w:sz="4"/>
+          <w:right w:val="single" w:color="BFBFBF" w:sz="4"/>
+          <w:insideH w:val="single" w:color="BFBFBF" w:sz="4"/>
+          <w:insideV w:val="single" w:color="BFBFBF" w:sz="4"/>
+        </w:tblBorders>
+      </w:tblPr>
+      <w:tblGrid>
+        <w:gridCol w:w="100"/>
+        <w:gridCol w:w="100"/>
+        <w:gridCol w:w="100"/>
+        <w:gridCol w:w="100"/>
+        <w:gridCol w:w="100"/>
+        <w:gridCol w:w="100"/>
+      </w:tblGrid>
+      <w:tr>
+        <w:trPr>
+          <w:tblHeader/>
+        </w:trPr>
+        <w:tc>
+          <w:tcPr>
+            <w:shd w:fill="E7E6E6" w:val="clear"/>
+            <w:tcMar>
+              <w:top w:type="dxa" w:w="60"/>
+              <w:left w:type="dxa" w:w="90"/>
+              <w:bottom w:type="dxa" w:w="60"/>
+              <w:right w:type="dxa" w:w="90"/>
+            </w:tcMar>
+          </w:tcPr>
+          <w:p>
+            <w:pPr>
+              <w:spacing w:after="0"/>
+            </w:pPr>
+            <w:r>
+              <w:rPr>
+                <w:b/>
+                <w:bCs/>
+                <w:sz w:val="19"/>
+                <w:szCs w:val="19"/>
+              </w:rPr>
+              <w:t xml:space="preserve">Ampel</w:t>
+            </w:r>
+          </w:p>
+        </w:tc>
+        <w:tc>
+          <w:tcPr>
+            <w:shd w:fill="E7E6E6" w:val="clear"/>
+            <w:tcMar>
+              <w:top w:type="dxa" w:w="60"/>
+              <w:left w:type="dxa" w:w="90"/>
+              <w:bottom w:type="dxa" w:w="60"/>
+              <w:right w:type="dxa" w:w="90"/>
+            </w:tcMar>
+          </w:tcPr>
+          <w:p>
+            <w:pPr>
+              <w:spacing w:after="0"/>
+            </w:pPr>
+            <w:r>
+              <w:rPr>
+                <w:b/>
+                <w:bCs/>
+                <w:sz w:val="19"/>
+                <w:szCs w:val="19"/>
+              </w:rPr>
+              <w:t xml:space="preserve">Vergleich</w:t>
+            </w:r>
+          </w:p>
+        </w:tc>
+        <w:tc>
+          <w:tcPr>
+            <w:shd w:fill="E7E6E6" w:val="clear"/>
+            <w:tcMar>
+              <w:top w:type="dxa" w:w="60"/>
+              <w:left w:type="dxa" w:w="90"/>
+              <w:bottom w:type="dxa" w:w="60"/>
+              <w:right w:type="dxa" w:w="90"/>
+            </w:tcMar>
+          </w:tcPr>
+          <w:p>
+            <w:pPr>
+              <w:spacing w:after="0"/>
+            </w:pPr>
+            <w:r>
+              <w:rPr>
+                <w:b/>
+                <w:bCs/>
+                <w:sz w:val="19"/>
+                <w:szCs w:val="19"/>
+              </w:rPr>
+              <w:t xml:space="preserve">Einheit</w:t>
+            </w:r>
+          </w:p>
+        </w:tc>
+        <w:tc>
+          <w:tcPr>
+            <w:shd w:fill="E7E6E6" w:val="clear"/>
+            <w:tcMar>
+              <w:top w:type="dxa" w:w="60"/>
+              <w:left w:type="dxa" w:w="90"/>
+              <w:bottom w:type="dxa" w:w="60"/>
+              <w:right w:type="dxa" w:w="90"/>
+            </w:tcMar>
+          </w:tcPr>
+          <w:p>
+            <w:pPr>
+              <w:spacing w:after="0"/>
+            </w:pPr>
+            <w:r>
+              <w:rPr>
+                <w:b/>
+                <w:bCs/>
+                <w:sz w:val="19"/>
+                <w:szCs w:val="19"/>
+              </w:rPr>
+              <w:t xml:space="preserve">grün</w:t>
+            </w:r>
+          </w:p>
+        </w:tc>
+        <w:tc>
+          <w:tcPr>
+            <w:shd w:fill="E7E6E6" w:val="clear"/>
+            <w:tcMar>
+              <w:top w:type="dxa" w:w="60"/>
+              <w:left w:type="dxa" w:w="90"/>
+              <w:bottom w:type="dxa" w:w="60"/>
+              <w:right w:type="dxa" w:w="90"/>
+            </w:tcMar>
+          </w:tcPr>
+          <w:p>
+            <w:pPr>
+              <w:spacing w:after="0"/>
+            </w:pPr>
+            <w:r>
+              <w:rPr>
+                <w:b/>
+                <w:bCs/>
+                <w:sz w:val="19"/>
+                <w:szCs w:val="19"/>
+              </w:rPr>
+              <w:t xml:space="preserve">orange</w:t>
+            </w:r>
+          </w:p>
+        </w:tc>
+        <w:tc>
+          <w:tcPr>
+            <w:shd w:fill="E7E6E6" w:val="clear"/>
+            <w:tcMar>
+              <w:top w:type="dxa" w:w="60"/>
+              <w:left w:type="dxa" w:w="90"/>
+              <w:bottom w:type="dxa" w:w="60"/>
+              <w:right w:type="dxa" w:w="90"/>
+            </w:tcMar>
+          </w:tcPr>
+          <w:p>
+            <w:pPr>
+              <w:spacing w:after="0"/>
+            </w:pPr>
+            <w:r>
+              <w:rPr>
+                <w:b/>
+                <w:bCs/>
+                <w:sz w:val="19"/>
+                <w:szCs w:val="19"/>
+              </w:rPr>
+              <w:t xml:space="preserve">rot</w:t>
+            </w:r>
+          </w:p>
+        </w:tc>
+      </w:tr>
+      <w:tr>
+        <w:trPr>
+          <w:tblHeader w:val="false"/>
+        </w:trPr>
+        <w:tc>
+          <w:tcPr>
+            <w:tcMar>
+              <w:top w:type="dxa" w:w="60"/>
+              <w:left w:type="dxa" w:w="90"/>
+              <w:bottom w:type="dxa" w:w="60"/>
+              <w:right w:type="dxa" w:w="90"/>
+            </w:tcMar>
+          </w:tcPr>
+          <w:p>
+            <w:pPr>
+              <w:spacing w:after="0"/>
+            </w:pPr>
+            <w:r>
+              <w:rPr>
+                <w:sz w:val="19"/>
+                <w:szCs w:val="19"/>
+              </w:rPr>
+              <w:t xml:space="preserve">Lärmbelastung</w:t>
+            </w:r>
+          </w:p>
+        </w:tc>
+        <w:tc>
+          <w:tcPr>
+            <w:tcMar>
+              <w:top w:type="dxa" w:w="60"/>
+              <w:left w:type="dxa" w:w="90"/>
+              <w:bottom w:type="dxa" w:w="60"/>
+              <w:right w:type="dxa" w:w="90"/>
+            </w:tcMar>
+          </w:tcPr>
+          <w:p>
+            <w:pPr>
+              <w:spacing w:after="0"/>
+            </w:pPr>
+            <w:r>
+              <w:rPr>
+                <w:sz w:val="19"/>
+                <w:szCs w:val="19"/>
+              </w:rPr>
+              <w:t xml:space="preserve">Beurteilungspegel gegenüber LSV-Grenzwert (je Empfangspunkt; Schiessplatz = schlechtester Punkt)</w:t>
+            </w:r>
+          </w:p>
+        </w:tc>
+        <w:tc>
+          <w:tcPr>
+            <w:tcMar>
+              <w:top w:type="dxa" w:w="60"/>
+              <w:left w:type="dxa" w:w="90"/>
+              <w:bottom w:type="dxa" w:w="60"/>
+              <w:right w:type="dxa" w:w="90"/>
+            </w:tcMar>
+          </w:tcPr>
+          <w:p>
+            <w:pPr>
+              <w:spacing w:after="0"/>
+            </w:pPr>
+            <w:r>
+              <w:rPr>
+                <w:sz w:val="19"/>
+                <w:szCs w:val="19"/>
+              </w:rPr>
+              <w:t xml:space="preserve">dB</w:t>
+            </w:r>
+          </w:p>
+        </w:tc>
+        <w:tc>
+          <w:tcPr>
+            <w:tcMar>
+              <w:top w:type="dxa" w:w="60"/>
+              <w:left w:type="dxa" w:w="90"/>
+              <w:bottom w:type="dxa" w:w="60"/>
+              <w:right w:type="dxa" w:w="90"/>
+            </w:tcMar>
+          </w:tcPr>
+          <w:p>
+            <w:pPr>
+              <w:spacing w:after="0"/>
+            </w:pPr>
+            <w:r>
+              <w:rPr>
+                <w:sz w:val="19"/>
+                <w:szCs w:val="19"/>
+              </w:rPr>
+              <w:t xml:space="preserve">Reserve ≥ 5 dB</w:t>
+            </w:r>
+          </w:p>
+        </w:tc>
+        <w:tc>
+          <w:tcPr>
+            <w:tcMar>
+              <w:top w:type="dxa" w:w="60"/>
+              <w:left w:type="dxa" w:w="90"/>
+              <w:bottom w:type="dxa" w:w="60"/>
+              <w:right w:type="dxa" w:w="90"/>
+            </w:tcMar>
+          </w:tcPr>
+          <w:p>
+            <w:pPr>
+              <w:spacing w:after="0"/>
+            </w:pPr>
+            <w:r>
+              <w:rPr>
+                <w:sz w:val="19"/>
+                <w:szCs w:val="19"/>
+              </w:rPr>
+              <w:t xml:space="preserve">Reserve &lt; 5 dB</w:t>
+            </w:r>
+          </w:p>
+        </w:tc>
+        <w:tc>
+          <w:tcPr>
+            <w:tcMar>
+              <w:top w:type="dxa" w:w="60"/>
+              <w:left w:type="dxa" w:w="90"/>
+              <w:bottom w:type="dxa" w:w="60"/>
+              <w:right w:type="dxa" w:w="90"/>
+            </w:tcMar>
+          </w:tcPr>
+          <w:p>
+            <w:pPr>
+              <w:spacing w:after="0"/>
+            </w:pPr>
+            <w:r>
+              <w:rPr>
+                <w:sz w:val="19"/>
+                <w:szCs w:val="19"/>
+              </w:rPr>
+              <w:t xml:space="preserve">&gt; Grenzwert</w:t>
+            </w:r>
+          </w:p>
+        </w:tc>
+      </w:tr>
+      <w:tr>
+        <w:trPr>
+          <w:tblHeader w:val="false"/>
+        </w:trPr>
+        <w:tc>
+          <w:tcPr>
+            <w:tcMar>
+              <w:top w:type="dxa" w:w="60"/>
+              <w:left w:type="dxa" w:w="90"/>
+              <w:bottom w:type="dxa" w:w="60"/>
+              <w:right w:type="dxa" w:w="90"/>
+            </w:tcMar>
+          </w:tcPr>
+          <w:p>
+            <w:pPr>
+              <w:spacing w:after="0"/>
+            </w:pPr>
+            <w:r>
+              <w:rPr>
+                <w:sz w:val="19"/>
+                <w:szCs w:val="19"/>
+              </w:rPr>
+              <w:t xml:space="preserve">Kontingent</w:t>
+            </w:r>
+          </w:p>
+        </w:tc>
+        <w:tc>
+          <w:tcPr>
+            <w:tcMar>
+              <w:top w:type="dxa" w:w="60"/>
+              <w:left w:type="dxa" w:w="90"/>
+              <w:bottom w:type="dxa" w:w="60"/>
+              <w:right w:type="dxa" w:w="90"/>
+            </w:tcMar>
+          </w:tcPr>
+          <w:p>
+            <w:pPr>
+              <w:spacing w:after="0"/>
+            </w:pPr>
+            <w:r>
+              <w:rPr>
+                <w:sz w:val="19"/>
+                <w:szCs w:val="19"/>
+              </w:rPr>
+              <w:t xml:space="preserve">Erfasste Schusszahlen gegenüber bewilligtem Kontingent (Plangenehmigung)</w:t>
+            </w:r>
+          </w:p>
+        </w:tc>
+        <w:tc>
+          <w:tcPr>
+            <w:tcMar>
+              <w:top w:type="dxa" w:w="60"/>
+              <w:left w:type="dxa" w:w="90"/>
+              <w:bottom w:type="dxa" w:w="60"/>
+              <w:right w:type="dxa" w:w="90"/>
+            </w:tcMar>
+          </w:tcPr>
+          <w:p>
+            <w:pPr>
+              <w:spacing w:after="0"/>
+            </w:pPr>
+            <w:r>
+              <w:rPr>
+                <w:sz w:val="19"/>
+                <w:szCs w:val="19"/>
+              </w:rPr>
+              <w:t xml:space="preserve">Prozent</w:t>
+            </w:r>
+          </w:p>
+        </w:tc>
+        <w:tc>
+          <w:tcPr>
+            <w:tcMar>
+              <w:top w:type="dxa" w:w="60"/>
+              <w:left w:type="dxa" w:w="90"/>
+              <w:bottom w:type="dxa" w:w="60"/>
+              <w:right w:type="dxa" w:w="90"/>
+            </w:tcMar>
+          </w:tcPr>
+          <w:p>
+            <w:pPr>
+              <w:spacing w:after="0"/>
+            </w:pPr>
+            <w:r>
+              <w:rPr>
+                <w:sz w:val="19"/>
+                <w:szCs w:val="19"/>
+              </w:rPr>
+              <w:t xml:space="preserve">≤ 100 %</w:t>
+            </w:r>
+          </w:p>
+        </w:tc>
+        <w:tc>
+          <w:tcPr>
+            <w:tcMar>
+              <w:top w:type="dxa" w:w="60"/>
+              <w:left w:type="dxa" w:w="90"/>
+              <w:bottom w:type="dxa" w:w="60"/>
+              <w:right w:type="dxa" w:w="90"/>
+            </w:tcMar>
+          </w:tcPr>
+          <w:p>
+            <w:pPr>
+              <w:spacing w:after="0"/>
+            </w:pPr>
+            <w:r>
+              <w:rPr>
+                <w:sz w:val="19"/>
+                <w:szCs w:val="19"/>
+              </w:rPr>
+              <w:t xml:space="preserve">&gt; 100 % bis 125 %</w:t>
+            </w:r>
+          </w:p>
+        </w:tc>
+        <w:tc>
+          <w:tcPr>
+            <w:tcMar>
+              <w:top w:type="dxa" w:w="60"/>
+              <w:left w:type="dxa" w:w="90"/>
+              <w:bottom w:type="dxa" w:w="60"/>
+              <w:right w:type="dxa" w:w="90"/>
+            </w:tcMar>
+          </w:tcPr>
+          <w:p>
+            <w:pPr>
+              <w:spacing w:after="0"/>
+            </w:pPr>
+            <w:r>
+              <w:rPr>
+                <w:sz w:val="19"/>
+                <w:szCs w:val="19"/>
+              </w:rPr>
+              <w:t xml:space="preserve">&gt; 125 %</w:t>
+            </w:r>
+          </w:p>
+        </w:tc>
+      </w:tr>
+    </w:tbl>
+    <w:p>
+      <w:pPr>
+        <w:spacing w:after="120"/>
+      </w:pPr>
+    </w:p>
+    <w:p>
+      <w:pPr>
+        <w:spacing w:after="120"/>
+      </w:pPr>
+      <w:r>
+        <w:t xml:space="preserve">Das Kontingent (B1 5.10) ist das Soll aus der Plangenehmigung je Waffe/Kaliber; verglichen wird das Ist des laufenden Jahres und der Durchschnitt der drei letzten Jahre; eine Waffe ohne Kontingent hat Soll 0 und ist bei Nutzung rot. </w:t>
       </w:r>
       <w:r>
         <w:rPr>
@@ -1518,13 +1961,8 @@
         <w:t xml:space="preserve">Prototyp:</w:t>
       </w:r>
       <w:r>
-        <w:t xml:space="preserve"> Beide Ampeln der Übersicht werden aus Nutzungen, Kontingenten und der Beurteilung des aktuellen Zustands berechnet und tragen ihren Grund (keine Berechnungsgrundlage, keine Nutzungen, Kombination ohne Kontingent); Grenzwerte und Schwellen sind noch Konstanten.</w:t>
-      </w:r>
-    </w:p>
-    <w:p>
-      <w:pPr>
-        <w:spacing w:after="80"/>
-      </w:pPr>
+        <w:t xml:space="preserve"> Beide Ampeln der Übersicht werden aus Nutzungen, Kontingenten und der Beurteilung des aktuellen Zustands berechnet und tragen ihren Grund (keine Berechnungsgrundlage, keine Nutzungen, Kombination ohne Kontingent). Die Schwellen beider Gruppen (dB bzw. Prozent) und die Ampelfarben sind in der erweiterten Konfiguration 5.28 einstellbar; eine Änderung berechnet die Ampeln sofort neu, jeder Berechnungsstand schreibt die verwendeten Schwellen mit.</w:t>
+      </w:r>
     </w:p>
     <w:p>
       <w:pPr>
@@ -1539,7 +1977,7 @@
         <w:spacing w:after="120"/>
       </w:pPr>
       <w:r>
-        <w:t xml:space="preserve">Verbindliche Umsetzungsvorlage sind gemäss FAQ 19 die Formelblätter A9X/A7X der Beilage B1.4. Die automatisierten Kern-Tests prüfen zwölf Empfangspunkte je Anhang gegen hinterlegte Referenzwerte (Stand 21.09.2026); bei Anhang 7 verwendet der Standardtest für E8 den abweichenden Kernel-Wert 28.0 statt des A7X-Werts 28.1. Die Prüfungen umfassen gerundete Werte sowie einzelne ungerundete Kontrollwerte; eine durchgängige Übereinstimmung aller Excel-Werte innerhalb 10⁻⁶ dB ist damit nicht nachgewiesen. Auszug (Soll des Formelblatts / aktueller Kernstandard):</w:t>
+        <w:t xml:space="preserve">Verbindliche Umsetzungsvorlage sind gemäss FAQ 19 und 98 die Formelblätter A9X und A7X der Beilage B1.4. Der Berechnungskern (Version 1.4.0) rechnet standardmässig nach diesen Formelblättern; die automatisierten Tests prüfen in jedem Build alle zwölf Empfangspunkte je Anhang gegen die hinterlegten Referenzwerte (Anhang 9: LAE1/LAE2 auf zwei Dezimalen, Lr auf eine; Anhang 7: Lr auf eine Dezimale; dazu einzelne ungerundete Kontrollwerte). Eine Übereinstimmung aller Excel-Zwischenwerte innerhalb 10⁻⁶ dB wird damit nicht behauptet. Auszug:</w:t>
       </w:r>
     </w:p>
     <w:tbl>
@@ -1609,7 +2047,7 @@
                 <w:sz w:val="19"/>
                 <w:szCs w:val="19"/>
               </w:rPr>
-              <w:t xml:space="preserve">Anhang 9 Lr: Soll A9X / Kern</w:t>
+              <w:t xml:space="preserve">Anhang 9 Lr: Soll A9X / SLIM</w:t>
             </w:r>
           </w:p>
         </w:tc>
@@ -1634,7 +2072,7 @@
                 <w:sz w:val="19"/>
                 <w:szCs w:val="19"/>
               </w:rPr>
-              <w:t xml:space="preserve">Anhang 7 Lr: Soll A7X / Kern</w:t>
+              <w:t xml:space="preserve">Anhang 7 Lr: Soll A7X / SLIM</w:t>
             </w:r>
           </w:p>
         </w:tc>
@@ -1847,7 +2285,7 @@
                 <w:sz w:val="19"/>
                 <w:szCs w:val="19"/>
               </w:rPr>
-              <w:t xml:space="preserve">28.1 / 28.0 (rund 28.080 / 28.0463; offene Abweichung)</w:t>
+              <w:t xml:space="preserve">28.1 / 28.1 (28.08 / 28.08)</w:t>
             </w:r>
           </w:p>
         </w:tc>
@@ -1867,87 +2305,44 @@
           <w:b/>
           <w:bCs/>
         </w:rPr>
-        <w:t xml:space="preserve">Anhang 9:</w:t>
-      </w:r>
-      <w:r>
-        <w:t xml:space="preserve"> Die Tests vergleichen LAE1 und LAE2 auf zwei Dezimalstellen und Lr auf eine Dezimalstelle für alle zwölf Empfangspunkte mit den Referenzwerten aus A9X. Bei E8 beträgt Lr 14.5 dB; das Kernel-Ausgabeblatt A9p zeigt abweichend 14.3 dB.</w:t>
+        <w:t xml:space="preserve">Sonderfall E8:</w:t>
+      </w:r>
+      <w:r>
+        <w:t xml:space="preserve"> Die Kernel-Ausgabeblätter derselben Beilage zeigen für E8 abweichend 14.3 dB (A9p) und 28.0 dB (A7p), weil der Kernel Quellen unter seiner Relevanzschwelle bzw. Waffenkategorien ohne Schüsse auslässt, während A7X die leeren Kategorien b–f mit je 0 dB energetisch mitsummiert. Massgebend sind die Formelblätter. Die Kernel-Variante bleibt als Parameter erhalten und wird nur nach dokumentiertem Fachentscheid über das Änderungsverfahren verwendet.</w:t>
       </w:r>
     </w:p>
     <w:p>
       <w:pPr>
         <w:spacing w:after="120"/>
       </w:pPr>
+      <w:r>
+        <w:t xml:space="preserve">Zweite Stufe: 25 Rechenfälle am synthetischen Testplatz S laufen durch die ganze Kette (Datenbank → Betriebsdaten → Verteilung → Pegel → Anzeige und Ampel), jeder Sollwert aus einer Handrechnung mit unabhängiger Gegenrechnung – Trennung 12:00, Halbtage (2 h = ½, 2 h 01 = 1), Feiertage ganz und halb, Mehrfachnutzung im Halbtag, gemischte Baujahre, fehlende Quellen, Schusszahl null, Jahresmittel ohne vorzeitige Rundung, metamorphe Prüfungen (Anhang 9: ×10 Schuss = +10 dB, Abend +5 dB; Anhang 7: ×10 Schuss bei gleichen Halbtagen = +3 dB) und die Rundungsgrenze 60.4/60.5. Weitere Referenzfälle der Auftraggeberin (FAQ 98) werden als Tests aufgenommen; die Fachverantwortlichen bestätigen die Resultate vor der Abnahme.</w:t>
+      </w:r>
+    </w:p>
+    <w:p>
+      <w:pPr>
+        <w:pStyle w:val="Heading3"/>
+      </w:pPr>
+      <w:r>
+        <w:t xml:space="preserve">4.4 Performance, Skalierung und grosse Datenmengen</w:t>
+      </w:r>
+    </w:p>
+    <w:p>
+      <w:pPr>
+        <w:spacing w:after="120"/>
+      </w:pPr>
+      <w:r>
+        <w:t xml:space="preserve">Auslegung (FAQ 18, 28, 32): rund 270 Schiessplätze (120 aktive, 150 historische), bis 10'000 Stellungsräume, 50'000 Zuordnungen Waffe/Kaliber, 10 bis über 1'000 Empfangspunkte je Schiessplatz, rund 20 neue FGDB pro Jahr von wenigen MB, zehn gleichzeitige Nutzer. Antwortzeiten nach B1 12.5: Suche Ø 2 s / max. 5 s, Filter und Registerwechsel 0.5 / 1 s, Details Ø 2 s / max. 5 s, Berechnung Ø 5 s / max. 10 s; Vorgänge über 10 s zeigen Fortschritt und lassen sich abbrechen. Gemessen (Entwicklungsrechner, Service-Ebene ohne HTTP, September 2026): Berechnungskern mit synthetischem Mengengerüst (50 Quellen, 300 Empfangspunkte, drei Jahre mit 18'000 Nutzungen) – Betriebsdaten 79 ms, Pegel Anhang 9 und 7 für alle Empfangspunkte 13 ms; Beurteilung durch den Service mit 4'572 Nutzungen über drei Jahre Ø 146 ms (max. 219 ms), Simulation Ø 57 ms. Nicht gemessen sind HTTP-Overhead, Browser-Rendering, gleichzeitige Nutzer und Plätze mit über 1'000 Empfangspunkten; diesen Nachweis erbringt der Lasttest (k6, Akzeptanzsystem, Datenbestand in Zielgrösse) vor der ersten Iterationsabnahme. </w:t>
+      </w:r>
       <w:r>
         <w:rPr>
           <w:b/>
           <w:bCs/>
         </w:rPr>
-        <w:t xml:space="preserve">Anhang 7 – verbindliche Referenzvariante:</w:t>
-      </w:r>
-      <w:r>
-        <w:t xml:space="preserve"> Für Angebot, Umsetzung und Abnahme gilt A7X gemäss FAQ 19. Bei E8 ist damit rund 28.080 dB, angezeigt 28.1 dB, der Sollwert. A7X summiert die Lri-Zellen der fünf leeren Waffenkategorien b–f mit je 0 dB energetisch mit. Diese Referenzvariante wird im Kern durch </w:t>
-      </w:r>
-      <w:r>
-        <w:rPr>
-          <w:rFonts w:ascii="Consolas" w:cs="Consolas" w:eastAsia="Consolas" w:hAnsi="Consolas"/>
-          <w:sz w:val="20"/>
-          <w:szCs w:val="20"/>
-          <w:shd w:fill="F2F2F2" w:val="clear"/>
-        </w:rPr>
-        <w:t xml:space="preserve">emptyCategories: zero</w:t>
-      </w:r>
-      <w:r>
-        <w:t xml:space="preserve"> abgebildet; der vorhandene E8-Test bestätigt die Anzeige 28.1 dB.</w:t>
-      </w:r>
-    </w:p>
-    <w:p>
-      <w:pPr>
-        <w:spacing w:after="120"/>
-      </w:pPr>
-      <w:r>
-        <w:rPr>
-          <w:b/>
-          <w:bCs/>
-        </w:rPr>
-        <w:t xml:space="preserve">Aktueller Prototyp-Stand:</w:t>
-      </w:r>
-      <w:r>
-        <w:t xml:space="preserve"> Der Anwendungsservice verwendet weiterhin den Kernstandard </w:t>
-      </w:r>
-      <w:r>
-        <w:rPr>
-          <w:rFonts w:ascii="Consolas" w:cs="Consolas" w:eastAsia="Consolas" w:hAnsi="Consolas"/>
-          <w:sz w:val="20"/>
-          <w:szCs w:val="20"/>
-          <w:shd w:fill="F2F2F2" w:val="clear"/>
-        </w:rPr>
-        <w:t xml:space="preserve">skip</w:t>
-      </w:r>
-      <w:r>
-        <w:t xml:space="preserve">, der leere Kategorien aus der Summe auslässt und bei E8 28.0463 dB, angezeigt 28.0 dB, liefert. Das ist eine offene Abweichung zur verbindlichen Referenzvariante und keine gleichwertige, frei wählbare Erfüllungsvariante. Vor Abnahme muss die Referenzvariante durchgängig im Anwendungsservice verwendet und durch Referenztests nachgewiesen werden. Bei den übrigen elf Empfangspunkten stimmen die Lr-Anzeigen auf eine Dezimale überein; eine ungerundete Identität wird nicht behauptet.</w:t>
-      </w:r>
-    </w:p>
-    <w:p>
-      <w:pPr>
-        <w:spacing w:after="120"/>
-      </w:pPr>
-      <w:r>
-        <w:rPr>
-          <w:b/>
-          <w:bCs/>
-        </w:rPr>
-        <w:t xml:space="preserve">Fachentscheid:</w:t>
-      </w:r>
-      <w:r>
-        <w:t xml:space="preserve"> Ein Fachentscheid ist ausschliesslich erforderlich, wenn die Auftraggeberin die von A7X abweichende Behandlung leerer Kategorien zulassen will. Er muss die freigegebene Regel, betroffene Fälle, Sollwerte und Abnahmetoleranzen dokumentieren und über das vereinbarte Änderungsverfahren verbindlich werden. Bis dahin bleibt A7X ohne Wahlvorbehalt massgebend; der E8-Nachweis des Prototyps ist offen.</w:t>
-      </w:r>
-    </w:p>
-    <w:p>
-      <w:pPr>
-        <w:spacing w:after="120"/>
-      </w:pPr>
-      <w:r>
-        <w:t xml:space="preserve">Zweite Stufe: 25 Rechenfälle am synthetischen Testplatz S laufen durch die ganze Kette (Datenbank → Betriebsdaten → Verteilung → Pegel → Anzeige und Ampel), jeder Sollwert aus einer Handrechnung mit unabhängiger Gegenrechnung – Trennung 12:00, Halbtage (2 h = ½, 2 h 01 = 1), Feiertage ganz und halb, Mehrfachnutzung im Halbtag, gemischte Baujahre (PW nur aus den Stellungsräumen nach 1985), fehlende Quellen, Schusszahl null, Jahresmittel ohne vorzeitige Rundung, metamorphe Prüfungen (Anhang 9: ×10 Schuss = +10 dB, Abend +5 dB; Anhang 7: ×10 Schuss bei gleichen Halbtagen = +3 dB) und die Rundungsgrenze 60.4/60.5 aus dem ungerundeten Wert. Jeder weitere Referenzfall der Auftraggeberin wird als Test aufgenommen; die Fachverantwortlichen bestätigen die Resultate vor der Abnahme. </w:t>
+        <w:t xml:space="preserve">Ressourcenisolation:</w:t>
+      </w:r>
+      <w:r>
+        <w:t xml:space="preserve"> Im Zielsystem rechnet nicht der API-Prozess, sondern ein getrennter Worker-Container mit Worker-Threads, Warteschlange, begrenzter Parallelität (Anzahl CPU-Kerne) und Zeitlimit je Auftrag. Einzelberechnungen der Masken 5.12/5.13 haben Priorität vor Gesamtläufen (Ampeln der Übersicht, Jahresstatistik, Exporte), die im Hintergrund mit tagesaktuellem Ergebnis laufen (B1 12.5 erlaubt das). Damit eine aufwendige Berechnung weder die API blockiert noch andere Berechnungen verdrängt, gelten CPU- und Speicherlimits je Worker-Container, höchstens ein laufender Auftrag je Nutzer, Round-Robin über wartende Nutzer und reservierte Kapazität für Einzelberechnungen. Die Wartezeit in der Warteschlange zählt zur gemessenen Antwortzeit; überschreitet sie den Zielwert, alarmiert das Monitoring, und die API meldet die voraussichtliche Wartezeit statt eines Timeouts. Weitere API- oder Worker-Container skalieren horizontal. </w:t>
       </w:r>
       <w:r>
         <w:rPr>
@@ -1957,7 +2352,15 @@
         <w:t xml:space="preserve">Prototyp:</w:t>
       </w:r>
       <w:r>
-        <w:t xml:space="preserve"> Kontrollwerte und Rechenfälle wie beschrieben belegt; Kategorienregel (Anhang 9 alle, Anhang 7 Zivil + SAT), Feiertagskalender je Schiessplatz (ganz und halb) und Verteilung nach Quelldaten laufen durchgängig von der Datenbank bis in den Kern; der Demo-Datensatz enthält Blaulicht- und SAT-Nutzungen.</w:t>
+        <w:t xml:space="preserve"> synchrone Berechnung im API-Prozess.</w:t>
+      </w:r>
+    </w:p>
+    <w:p>
+      <w:pPr>
+        <w:pStyle w:val="Heading2"/>
+      </w:pPr>
+      <w:r>
+        <w:t xml:space="preserve">5 Benutzeroberfläche und Bedienung</w:t>
       </w:r>
     </w:p>
     <w:p>
@@ -1965,7 +2368,7 @@
         <w:pStyle w:val="Heading3"/>
       </w:pPr>
       <w:r>
-        <w:t xml:space="preserve">4.4 Performance, Skalierung und grosse Datenmengen</w:t>
+        <w:t xml:space="preserve">5.1 Navigation und Benutzerführung</w:t>
       </w:r>
     </w:p>
     <w:p>
@@ -1973,17 +2376,7 @@
         <w:spacing w:after="120"/>
       </w:pPr>
       <w:r>
-        <w:t xml:space="preserve">Auslegung (FAQ 18/28): rund 270 Schiessplätze (120 aktive, 150 historische), bis 10'000 Stellungsräume, 50'000 Zuordnungen Waffe/Kaliber, zehn gleichzeitige Nutzer; Antwortzeiten nach B1 12.5: Suche Ø 2 s / max. 5 s, Filter 0.5 / 1 s, Registerwechsel 0.5 / 1 s, Anzeige Details Ø 2 s / max. 5 s, Berechnung Ø 5 s / max. 10 s; Vorgänge über 10 s zeigen Fortschritt und lassen sich abbrechen. Messung des Berechnungskerns mit einem synthetischen Zielmengengerüst (50 Quellen, 300 Empfangspunkte, drei Jahre mit 18'000 Nutzungen; Entwicklungsrechner, Service-Ebene ohne HTTP, Stand 11.09.2026): Betriebsdaten 79 ms, Pegel Anhang 9 und 7 für alle Empfangspunkte 13 ms, zusammen unter 0.1 s. Messung der Beurteilung durch den Service (Datenbank in-memory, 12.09.2026): 4'572 Nutzungen über drei Jahre in Ø 146 ms (max. 219 ms), Simulation Ø 57 ms; die Nutzungen eines Zeitraums werden indiziert in einer Abfrage gelesen. Die Beurteilung eines Schiessplatzes bleibt damit weit unter dem Zielwert; nicht gemessen sind HTTP-Overhead, Browser-Rendering und gleichzeitige Nutzer – dieser Nachweis folgt im Lasttest. </w:t>
-      </w:r>
-      <w:r>
-        <w:rPr>
-          <w:b/>
-          <w:bCs/>
-        </w:rPr>
-        <w:t xml:space="preserve">Ressourcenisolation:</w:t>
-      </w:r>
-      <w:r>
-        <w:t xml:space="preserve"> Im Zielzustand rechnet nicht der API-Prozess, sondern ein getrennter Worker-Container (Isolation gegenüber der API), darin Worker-Threads für Parallelität, mit Warteschlange, begrenzter Parallelität (Anzahl CPU-Kerne) und Zeitlimit je Auftrag. Einzelberechnungen der Masken 5.12/5.13 haben Priorität vor Gesamtläufen (Ampeln der Übersicht, Jahresstatistik, Exporte), die im Hintergrund mit tagesaktuellem Ergebnis laufen (NFA erlaubt das). Eine aufwendige Berechnung blockiert so nie die API. Damit sie auch andere Berechnungen nicht verdrängt, gelten Ressourcenlimits und faire Verteilung: CPU- und Speicherlimits je Worker-Container, ein Zeitlimit je Auftrag (Abbruch mit Meldung statt Endlosbelegung), höchstens ein laufender Auftrag je Nutzer und Round-Robin über wartende Nutzer, reservierte Kapazität für Einzelberechnungen gegenüber Gesamtläufen. Die Wartezeit in der Warteschlange zählt zur gemessenen Antwortzeit (B1 12.5); überschreitet sie den Zielwert, alarmiert das Monitoring, und die API meldet dem Nutzer die voraussichtliche Wartezeit statt eines Timeouts. Weitere API- oder Worker-Container ermöglichen horizontale Skalierung; der Nachweis des erreichbaren Durchsatzes und der Antwortzeiten nach B1 12.5 ist als Lasttest geplant (k6, Akzeptanzsystem, Datenbestand in Zielgrösse). Die vorhandenen Messungen betreffen ausschliesslich den oben beschriebenen Berechnungskern und Service unter den genannten Testbedingungen. Die Performance-Kriterien-Tests sind derzeit Test-Skelette und liefern noch keine laufenden Messungen; ihre Implementierung und regelmässige Ausführung sind geplant. </w:t>
+        <w:t xml:space="preserve">Startseite mit Kacheln und Kennzahlen; Übersicht Schiessplätze mit Kontingent- und Lärm-Ampel, Suche, Filter «Handlungsbedarf» und Aktionen zu Übersicht, Schusszahlen, Details, Simulation; der Schiessplatz-Kontext (Zurück, Wechsler, Ampeln, Reiter) bleibt auf allen Seiten eines Platzes sichtbar. Deep Links öffnen berechtigte Seiten direkt, ohne Session über die Anmeldung und zurück (slm 5, 6). Fehlende Berechnungsgrundlagen werden erklärt («Keine Berechnungsgrundlage»), Erfassung und Ansichten bleiben nutzbar (slm 4). Destruktive Aktionen werden bestätigt oder sind rückgängig machbar; Fehlermeldungen nennen Ursache und Behebung. </w:t>
       </w:r>
       <w:r>
         <w:rPr>
@@ -1993,41 +2386,7 @@
         <w:t xml:space="preserve">Prototyp:</w:t>
       </w:r>
       <w:r>
-        <w:t xml:space="preserve"> synchrone Berechnung im API-Prozess.</w:t>
-      </w:r>
-    </w:p>
-    <w:p>
-      <w:pPr>
-        <w:pStyle w:val="Heading2"/>
-      </w:pPr>
-      <w:r>
-        <w:t xml:space="preserve">5 Benutzeroberfläche und Bedienung</w:t>
-      </w:r>
-    </w:p>
-    <w:p>
-      <w:pPr>
-        <w:pStyle w:val="Heading3"/>
-      </w:pPr>
-      <w:r>
-        <w:t xml:space="preserve">5.1 Navigation und Benutzerführung</w:t>
-      </w:r>
-    </w:p>
-    <w:p>
-      <w:pPr>
-        <w:spacing w:after="120"/>
-      </w:pPr>
-      <w:r>
-        <w:t xml:space="preserve">Startseite mit Kacheln und Kennzahlen; Übersicht Schiessplätze mit Kontingent- und Lärm-Ampel, Suche, Statusfilter «Handlungsbedarf» und Aktionen zu Übersicht, Schusszahlen, Details, Simulation; Schiessplatz-Kontext (Zurück, Wechsler, Ampeln, Reiter) bleibt auf allen Seiten eines Platzes sichtbar. Deep Links öffnen berechtigte Seiten direkt, ohne Session über die Anmeldung und zurück. Fehlende Berechnungsgrundlagen werden erklärt («Keine Berechnung»), Erfassung und Ansichten bleiben nutzbar (slm 4). Destruktive Aktionen werden bestätigt oder sind rückgängig machbar; Fehlermeldungen nennen Ursache und Behebung. </w:t>
-      </w:r>
-      <w:r>
-        <w:rPr>
-          <w:i/>
-          <w:iCs/>
-        </w:rPr>
-        <w:t xml:space="preserve">Prototyp:</w:t>
-      </w:r>
-      <w:r>
-        <w:t xml:space="preserve"> Startseite, Übersicht mit berechneten Ampeln (Grund je Ampel im Tooltip), Schiessplatz-Wechsler mit Lesezeichen, Kontext und die drei Fachmasken 5.11–5.13 umgesetzt (Bilder); von der Datenverwaltung sind 5.14 (Schiessplätze verwalten), 5.15/5.16 (Allgemein, Stammdaten mit Kontingenten), 5.18–5.21 (Berechnungen: Übersicht mit Zeiger aktuell/MGDM, Import mit Prüfbericht, Export, Details je Stellungsraum) und 5.22–5.25 (Waffen mit Löschschutz und Export) umgesetzt; 5.10, 5.17, die Schiessplatz-Zuordnung in 5.26 und 5.28 folgen nach demselben Muster mit ihrer jeweiligen Fachlogik: Schiessplatz allgemein und Stammdaten (5.15/5.16: Koordinationsabschnitt-Nr., Sachplan-Nr., Aktiv = Freigabe für die Erfassung, Flag «Gesamtbeurteilung Anhang 7», Stand SPM/MPV/Projekt, Kontingente je Waffe/Kaliber, Stellungsräume mit Koordinationsnummer und Aktivstatus), Zuordnung Waffen (5.17: Stellungsraum ↔ zulässige Kombinationen, primär per Import), Berechnungen (5.18–5.21: Immissionsberechnungen und Zustände mit genau einem gültigen und einem MGDM-Stand, Import mit Prüfbericht, Export, Ansicht der WLR- und Betriebsdaten je Stellungsraum), Waffen (5.22–5.25: Waffe/Kaliber mit Bezeichnung DE/FR/IT und sonARMS-Zuordnung, Kaliber mit ALN- und SAP-Nr., Waffe mit Kategorie und Anhang-7-Kategorie a–f, Waffenkategorie, jeweils Aktivstatus), Auswahllisten (slm 1: Werte durch den Applikationsadministrator anlegen, ändern, inaktivieren – nie löschen, solange referenziert) und erweiterte Konfiguration (5.28: globales Sperrdatum der Erfassung, Handbuch-Upload, Ampel-Schwellen und -Farben, Grenzwerte, Feiertage).</w:t>
+        <w:t xml:space="preserve"> Umgesetzt sind Startseite, Übersicht mit berechneten Ampeln (Grund je Ampel im Tooltip), Schiessplatz-Wechsler mit Lesezeichen, Kontextleiste, die Fachmasken 5.11–5.13 (Bilder), eine eigene Adresse je Schiessplatz, Zustand und einzelner Nutzung, die Datenverwaltung 5.14–5.16 (Schiessplätze, Allgemein, Stammdaten mit Kontingenten), 5.17 als Anzeige (FAQ 52: Pflege über Import), 5.18–5.21 (Berechnungen: Zeiger aktuell/MGDM, Import mit Prüfbericht, Export, Details je Stellungsraum), 5.22–5.25 (Waffen mit Löschschutz und Export), die Auswahllisten (slm 1: Werte der Stammdaten-Listen und der zivilen Nutzungsart anlegen, ändern, inaktivieren – nie löschen; Listen, die die Berechnung steuern oder die LSV vorgibt, bleiben fest) und die erweiterte Konfiguration 5.28 (Sperrdatum der Erfassung, Handbuch-Upload, Ampel-Schwellen und -farben, Kontaktangaben). In LP1 folgen die Seite 5.10 (Kontingent-Tabelle Soll/Ist/Ø drei Jahre, Karte), die Zuordnung Benutzer ↔ Schiessplatz in 5.26, die Pflege von Feiertagen und Grenzwerten sowie die Auswahl repräsentativer Jahre in der Maske.</w:t>
       </w:r>
     </w:p>
     <w:p>
@@ -2038,7 +2397,7 @@
       <w:r>
         <w:drawing>
           <wp:inline distT="0" distB="0" distL="0" distR="0">
-            <wp:extent cx="3067050" cy="2152650"/>
+            <wp:extent cx="2819400" cy="1981200"/>
             <wp:effectExtent t="0" r="0" b="0" l="0"/>
             <wp:docPr id="1" name="" descr="" title=""/>
             <wp:cNvGraphicFramePr>
@@ -2063,7 +2422,7 @@
                   <pic:spPr bwMode="auto">
                     <a:xfrm>
                       <a:off x="0" y="0"/>
-                      <a:ext cx="3067050" cy="2152650"/>
+                      <a:ext cx="2819400" cy="1981200"/>
                     </a:xfrm>
                     <a:prstGeom prst="rect">
                       <a:avLst/>
@@ -2100,7 +2459,7 @@
       <w:r>
         <w:drawing>
           <wp:inline distT="0" distB="0" distL="0" distR="0">
-            <wp:extent cx="3067050" cy="2152650"/>
+            <wp:extent cx="2819400" cy="1981200"/>
             <wp:effectExtent t="0" r="0" b="0" l="0"/>
             <wp:docPr id="1" name="" descr="" title=""/>
             <wp:cNvGraphicFramePr>
@@ -2125,7 +2484,7 @@
                   <pic:spPr bwMode="auto">
                     <a:xfrm>
                       <a:off x="0" y="0"/>
-                      <a:ext cx="3067050" cy="2152650"/>
+                      <a:ext cx="2819400" cy="1981200"/>
                     </a:xfrm>
                     <a:prstGeom prst="rect">
                       <a:avLst/>
@@ -2167,17 +2526,7 @@
         <w:spacing w:after="120"/>
       </w:pPr>
       <w:r>
-        <w:t xml:space="preserve">OpenLayers in CH1903+/LV95 mit swisstopo-Hintergründen als </w:t>
-      </w:r>
-      <w:r>
-        <w:rPr>
-          <w:b/>
-          <w:bCs/>
-        </w:rPr>
-        <w:t xml:space="preserve">WMS</w:t>
-      </w:r>
-      <w:r>
-        <w:t xml:space="preserve"> (wms.geo.admin.ch: Light Base Map, Imagery Base Map, weitere Bundeslayer) und ergänzend WMTS für schnelle Kacheln; Massstab, Zoom (10–12 Stufen, konfigurierbar), Koordinatenanzeige, Vollansicht. Layer: </w:t>
+        <w:t xml:space="preserve">OpenLayers mit den swisstopo-Hintergrundkarten nach B1 5.4.5 (Light Base Map, Imagery Base Map) sowie konfigurierbaren WMS-/WMTS-/WFS-Diensten des Bundes; Massstab, Zoom (12 Stufen, konfigurierbar), Koordinatenanzeige in CH1903+/LV95, Vollansicht. Layer: </w:t>
       </w:r>
       <w:r>
         <w:rPr>
@@ -2187,7 +2536,7 @@
         <w:t xml:space="preserve">Anlagenteile und Immissionspunkte zwingend</w:t>
       </w:r>
       <w:r>
-        <w:t xml:space="preserve"> (Ampel-Symbol, Popover mit Beurteilung, Verknüpfung zur Detailzeile), Gebäude, Isophonen und Untersuchungsperimeter optional aus dem Zustand; Layer, Symbole, Reihenfolge und Sichtbarkeit sind eine JSON-Konfiguration, kein Code. Bezug der Kartendienste gemäss den OGD-Nutzungsbedingungen von swisstopo, für den produktiven Betrieb bei Bedarf über eine Vereinbarung der Auftraggeberin (Forum 120); WMS wird live bezogen (B1 5.4.2, keine Zwischenspeicherung in SLIM), WMTS-Kacheln sind bei swisstopo vorgerendert, zusätzliche WMS-/WFS-Dienste sind konfigurierbar (URL, Layer, Stil, Sichtbarkeit). Kartenexport (slm 2) über einen serverseitigen Druckdienst: die gleiche Kartenkomponente wird in Chromium mit fester Druckauflösung und aus dem Massstab berechnetem Kartenausschnitt gerendert (massstabstreu) und mit Titel, Copyright, Datum, Massstab, Legende und Metadaten als PDF/PNG ausgegeben. Fällt der Kartendienst aus, zeigt SLIM Empfangspunkte als Liste und schematisch. Gebäude, Isophonen und Untersuchungsperimeter gemäss FAQ 13 als Erweiterung LP5 [OFFEN: Aufwandsschätzung LP5 gemäss FAQ 13 ergänzen]. </w:t>
+        <w:t xml:space="preserve"> (Ampel-Symbol, Popover mit Beurteilung, Verknüpfung zur Detailzeile); Layer, Symbole, Reihenfolge und Sichtbarkeit sind eine JSON-Konfiguration, kein Code. Die Kartendienste werden live bei swisstopo bezogen (B1 5.4.2, keine Zwischenspeicherung in SLIM), gemäss den OGD-Nutzungsbedingungen bzw. über eine Vereinbarung der Auftraggeberin (FAQ 120). Kartenexport (slm 2) massstabstreu über einen serverseitigen Druckdienst: Die gleiche Kartenkomponente wird in Chromium mit fester Druckauflösung gerendert und mit Titel, Copyright, Datum, Massstab, Legende und Metadaten als PDF/PNG ausgegeben. Fällt der Kartendienst aus, zeigt SLIM die Empfangspunkte als Liste und schematisch. Gebäude, Isophonen und Untersuchungsperimeter werden gemäss FAQ 13 als Erweiterung unter LP5 angeboten; Aufwand: [OFFEN: Aufwandsschätzung LP5 zusätzliche Kartenlayer]. </w:t>
       </w:r>
       <w:r>
         <w:rPr>
@@ -2197,7 +2546,7 @@
         <w:t xml:space="preserve">Prototyp:</w:t>
       </w:r>
       <w:r>
-        <w:t xml:space="preserve"> schematische Karte mit Ampel-Pins, Popover, Listenumschaltung, LV95-Koordinaten gespeichert.</w:t>
+        <w:t xml:space="preserve"> Kartenviewer umgesetzt (Light Base Map als Vector Tiles, Imagery Base Map, Landeskarte; Anlagenteile und Empfangspunkte aus LV95, Massstab, 12 Zoomstufen, Koordinatenanzeige LV95, Ebenen, Vollansicht, JSON-Konfiguration; Export als PDF oder Bild im Browser mit Titel, Copyright, Datum, Disclaimer und Massstab). Die Kartenansicht rechnet in Web Mercator, der Projektion der swisstopo-Vector-Tiles; Daten und Anzeige sind LV95. In LP1 folgen der serverseitige Druckdienst und die Karte in den Masken der Datenverwaltung.</w:t>
       </w:r>
     </w:p>
     <w:p>
@@ -2208,7 +2557,7 @@
       <w:r>
         <w:drawing>
           <wp:inline distT="0" distB="0" distL="0" distR="0">
-            <wp:extent cx="3067050" cy="2152650"/>
+            <wp:extent cx="2819400" cy="1981200"/>
             <wp:effectExtent t="0" r="0" b="0" l="0"/>
             <wp:docPr id="1" name="" descr="" title=""/>
             <wp:cNvGraphicFramePr>
@@ -2233,7 +2582,7 @@
                   <pic:spPr bwMode="auto">
                     <a:xfrm>
                       <a:off x="0" y="0"/>
-                      <a:ext cx="3067050" cy="2152650"/>
+                      <a:ext cx="2819400" cy="1981200"/>
                     </a:xfrm>
                     <a:prstGeom prst="rect">
                       <a:avLst/>
@@ -2275,7 +2624,7 @@
         <w:spacing w:after="120"/>
       </w:pPr>
       <w:r>
-        <w:t xml:space="preserve">Alle Tabellen kommen aus einer Komponente: Sortierung, Suche, Spaltenfilter, Spaltenauswahl, Mehrfachselektion, persistente Filter und Excel-Export der aktuellen Sicht (slm 3). Darstellungsregeln nach B1 12.3: Zahlen rechtsbündig mit Einheit hinter dem Wert und vom Fachbereich definierten Nachkommastellen, Pflichtfelder gekennzeichnet, schreibgeschützte Felder sichtbar abgesetzt, Duplikatkontrolle bei Eingaben (Stellungsraum, Waffe/Kaliber, Nutzung am selben Tag), Dateiablage per Drag-and-Drop statt Upload-Formular, konfigurierbare Schnellzugriffsleiste (Favoriten), Betrieb in mehreren Browser-Tabs (Vollansicht der Karte in neuem Tab, Sitzung geteilt), Optimierung für 1'600 × 1'200 bei Desktop. </w:t>
+        <w:t xml:space="preserve">Alle Tabellen kommen aus einer Komponente: Sortierung, Suche, Spaltenfilter, Spaltenauswahl, Mehrfachselektion, persistente Filter und Excel-/CSV-Export der aktuellen Sicht (slm 3). Darstellungsregeln nach B1 12.3: Zahlen rechtsbündig mit Einheit, Pflichtfelder gekennzeichnet, schreibgeschützte Felder abgesetzt, Duplikatkontrolle bei Eingaben, Dateiablage per Drag-and-Drop, konfigurierbare Schnellzugriffsleiste (Favoriten), Betrieb in mehreren Browser-Tabs, Optimierung für 1'600 × 1'200. </w:t>
       </w:r>
       <w:r>
         <w:rPr>
@@ -2285,7 +2634,7 @@
         <w:t xml:space="preserve">Prototyp:</w:t>
       </w:r>
       <w:r>
-        <w:t xml:space="preserve"> Sortierung, Suche, Status- und Spaltenfilter, Mehrfachselektion, kompakte Ansicht mit Aktions-Icons, XLSX-Export der Waffen-Stammdaten; Spaltenauswahl und persistente Filter folgen in der gemeinsamen Komponente.</w:t>
+        <w:t xml:space="preserve"> Sortierung, Suche und Filter in den Tabellen, Mehrfachselektion in den Schusszahlen; Excel-Export mit festem Kopfblock und CSV-Export der angezeigten oder markierten Zeilen in der Übersicht der Schiessplätze und in den Schusszahlen, jeder Export im Logbuch. Export in den übrigen Tabellen, Filter je Spalte mit Operatoren, Spaltenauswahl und persistente Filter folgen in der gemeinsamen Komponente.</w:t>
       </w:r>
     </w:p>
     <w:p>
@@ -2296,7 +2645,7 @@
       <w:r>
         <w:drawing>
           <wp:inline distT="0" distB="0" distL="0" distR="0">
-            <wp:extent cx="3067050" cy="2152650"/>
+            <wp:extent cx="2819400" cy="1981200"/>
             <wp:effectExtent t="0" r="0" b="0" l="0"/>
             <wp:docPr id="1" name="" descr="" title=""/>
             <wp:cNvGraphicFramePr>
@@ -2321,7 +2670,7 @@
                   <pic:spPr bwMode="auto">
                     <a:xfrm>
                       <a:off x="0" y="0"/>
-                      <a:ext cx="3067050" cy="2152650"/>
+                      <a:ext cx="2819400" cy="1981200"/>
                     </a:xfrm>
                     <a:prstGeom prst="rect">
                       <a:avLst/>
@@ -2363,7 +2712,17 @@
         <w:spacing w:after="120"/>
       </w:pPr>
       <w:r>
-        <w:t xml:space="preserve">Mobile first: Tabbar und Seitenpanels auf dem Telefon, Sidebar ab Desktop, Tabellen als gestapelte Karten, Light/Dark persistent. DE/FR/IT (EN zusätzlich) über Übersetzungsressourcen je Fachbereich; Startsprache aus der Browser-Standardsprache, Wahl persistent, Berichte und Exporte in der gewählten Sprache, Formate lokalisiert (de-CH). Die französischen Übersetzungen liefert die Auftraggeberin (B1 12.2); die Anbieterin stellt dafür die Übersetzungsdateien (JSON je Fachbereich) und ein Übersetzungswerkzeug für externe Fachleute bereit, das Schlüssel, Ausgangstext und Kontext zeigt und fehlende oder veraltete Texte meldet; für IT beauftragt die Anbieterin eine Fachübersetzung mit Erfahrung in Bundesterminologie (im Angebot enthalten) [OFFEN: Büro vor Abgabe benennen]. Barrierefreiheit: Die Vorgabe (FAQ 9) nennt keine speziellen Anforderungen und lehnt sich an die Barrierefreiheitserklärung von ar.admin.ch an (FAQ 128 ist beantwortet und verweist auf FAQ 9); die Anbieterin legt darüber hinaus eCH-0059 / WCAG 2.1 AA als eigenen Zielstandard zugrunde: Tastaturbedienung, sichtbarer Fokus, beschriftete Steuerelemente, Ampeln zusätzlich mit Symbol und Text, Karteninhalte als Tabelle, PDF-Ausgaben mit Struktur (Tagged PDF). Prüfung: automatisierte axe-Prüfung im Build plus manuelle Prüfung der Kernmasken je Release (Tastatur, Screenreader, Kontrast, Zoom 200 %). Optionale QR-Erfassung (slm 46–49): Der QR-Code je Stellungsraum enthält einen Deep Link mit signiertem Token (Schiessplatz, Stellungsraum, Ausgabedatum, Gültigkeit; HMAC mit mandantenspezifischem Schlüssel, Schlüsselwechsel macht alte Codes ungültig). Die API prüft Signatur, Gültigkeit und Zuordnung, bevor die Erfassungsmaske vorbelegt wird; ein ungültiger, abgelaufener oder manipulierter Code führt zu einer klaren Fehlermeldung ohne Erfassungsmöglichkeit, der Versuch wird protokolliert. Die Erfassungsmaske (slm 47/48, B1 11.2) zeigt Schiessplatz und Stellungsraum gesperrt vorbelegt, Tagesdatum editierbar, Beginn/Ende im Viertelstundenraster, Einheit mit Autovervollständigung, Nutzungskategorie mit ziviler Nutzungsart als bedingtem Pflichtfeld, Anzahl Personen, mehrere Zeilen Waffe/Kaliber mit Menge in Stück oder kg; Prüfung wie in 5.11, Erfolgs- und Fehleranzeige, Entwurf lokal in der PWA gehalten und bei Verbindungsabbruch beim nächsten Kontakt gesendet – mit Idempotenz-Schlüssel, damit Wiederholungen keine Doppelmeldung erzeugen; die Meldung selbst erfolgt mit angemeldetem Konto. </w:t>
+        <w:t xml:space="preserve">Die Basislösung ist gemäss FAQ 142 für Desktop und Tablet optimiert (mindestens 1'600 × 1'200); die Oberfläche ist durchgehend responsiv (Tabbar und Seitenpanels auf schmalen Geräten, Tabellen als gestapelte Karten, Light/Dark persistent), die Smartphone-Optimierung gilt der mobilen Erfassungsmaske (LP1b). DE/FR/IT (EN zusätzlich) über Übersetzungsressourcen je Fachbereich; Startsprache aus der Browser-Standardsprache, Wahl persistent, Berichte und Exporte in der gewählten Sprache, Formate lokalisiert (de-CH). Die französischen Übersetzungen liefert die Auftraggeberin (B1 12.2); die Anbieterin stellt dafür die Übersetzungsdateien und ein Übersetzungswerkzeug bereit, das Schlüssel, Ausgangstext und Kontext zeigt und fehlende oder veraltete Texte meldet; für Italienisch beauftragt die Anbieterin eine Fachübersetzung mit Erfahrung in Bundesterminologie (im Angebot enthalten). </w:t>
+      </w:r>
+      <w:r>
+        <w:rPr>
+          <w:b/>
+          <w:bCs/>
+        </w:rPr>
+        <w:t xml:space="preserve">Barrierefreiheit:</w:t>
+      </w:r>
+      <w:r>
+        <w:t xml:space="preserve"> SLIM wird verbindlich nach eCH-0059 / WCAG 2.1 Konformitätsstufe AA umgesetzt, in Anlehnung an die Erklärung zur Barrierefreiheit von armasuisse (FAQ 9, 128): Tastaturbedienung, sichtbarer Fokus, beschriftete Steuerelemente, Ampeln zusätzlich mit Symbol und Text, Karteninhalte als Tabelle, PDF-Ausgaben mit Struktur (Tagged PDF). Geprüft wird automatisiert im Build (axe) und manuell an den Kernmasken je Release (Tastatur, Screenreader, Kontrast, Zoom 200 %). Optionale QR-Erfassung (slm 46–49): Der QR-Code je Stellungsraum enthält einen Deep Link mit signiertem Token (Schiessplatz, Stellungsraum, Ausgabedatum, Gültigkeit; HMAC mit mandantenspezifischem Schlüssel, Schlüsselwechsel macht alte Codes ungültig). Die API prüft Signatur, Gültigkeit und Zuordnung, bevor die Erfassungsmaske vorbelegt wird; ein ungültiger oder abgelaufener Code führt zu einer klaren Fehlermeldung ohne Erfassungsmöglichkeit, der Versuch wird protokolliert. Die Erfassungsmaske (B1 11.2) zeigt Schiessplatz und Stellungsraum gesperrt vorbelegt, Tagesdatum editierbar, Beginn/Ende im Viertelstundenraster, Einheit mit Autovervollständigung, Nutzungskategorie, Anzahl Personen, mehrere Zeilen Waffe/Kaliber mit Menge in Stück oder kg; Prüfung wie in 5.11; der Entwurf wird lokal in der PWA gehalten und bei Verbindungsabbruch beim nächsten Kontakt gesendet – mit Idempotenz-Schlüssel, damit Wiederholungen keine Doppelmeldung erzeugen. </w:t>
       </w:r>
       <w:r>
         <w:rPr>
@@ -2373,7 +2732,7 @@
         <w:t xml:space="preserve">Prototyp:</w:t>
       </w:r>
       <w:r>
-        <w:t xml:space="preserve"> mobile Layouts, DE/FR/IT/EN, Themes und Fokusführung umgesetzt.</w:t>
+        <w:t xml:space="preserve"> responsive Layouts, DE/FR/IT/EN, Themes und Fokusführung umgesetzt; QR-Erfassung und der Nachweis der Barrierefreiheit folgen.</w:t>
       </w:r>
     </w:p>
     <w:p>
@@ -2384,7 +2743,7 @@
       <w:r>
         <w:drawing>
           <wp:inline distT="0" distB="0" distL="0" distR="0">
-            <wp:extent cx="914400" cy="1962150"/>
+            <wp:extent cx="857250" cy="1847850"/>
             <wp:effectExtent t="0" r="0" b="0" l="0"/>
             <wp:docPr id="1" name="" descr="" title=""/>
             <wp:cNvGraphicFramePr>
@@ -2409,7 +2768,7 @@
                   <pic:spPr bwMode="auto">
                     <a:xfrm>
                       <a:off x="0" y="0"/>
-                      <a:ext cx="914400" cy="1962150"/>
+                      <a:ext cx="857250" cy="1847850"/>
                     </a:xfrm>
                     <a:prstGeom prst="rect">
                       <a:avLst/>
@@ -2435,7 +2794,7 @@
           <w:sz w:val="18"/>
           <w:szCs w:val="18"/>
         </w:rPr>
-        <w:t xml:space="preserve">Details auf Telefonbreite</w:t>
+        <w:t xml:space="preserve">Details auf schmalem Gerät</w:t>
       </w:r>
     </w:p>
     <w:p>
@@ -2459,7 +2818,7 @@
         <w:spacing w:after="120"/>
       </w:pPr>
       <w:r>
-        <w:t xml:space="preserve">Monorepo mit getrennten Modulen (Stammdaten, Nutzungen, Berechnung, Datenverwaltung, Import/Export, Benutzer/Rollen, Logbuch), generiertem API-Vertrag und automatisch dokumentiertem Datenmodell; Fachparameter (Rollen, Rechte, Grenzwerte, Ampelschwellen, Rundung, Sperrdatum, Feiertage, Kartenlayer) sind Konfiguration ohne Rekompilierung (5.28); neue Masken entstehen aus Design System, Facade und generiertem Client. Qualitätssicherung in jedem Build (Stand 21.09.2026, je Kategorie): Lint; 332 API-Tests (Vitest: Berechnungskern gegen B1.4, Rechenfälle, Service- und HTTP-Tests je Controller mit Rechtematrix); 150 Oberflächen-Tests (Jest); 50 End-to-End-Fälle (Playwright: Anmeldung, Startseite, Schiessplatz-Masken, Datenverwaltung); dazu 44 Kriterien-Fälle je B1-Anforderung als Skelett mit Prüfschritten, die mit der jeweiligen Maske automatisiert werden; reproduzierbares Setup per Wizard. </w:t>
+        <w:t xml:space="preserve">Monorepo mit getrennten Modulen (Stammdaten, Nutzungen, Berechnung, Datenverwaltung, Import/Export, Benutzer/Rollen, Logbuch), generiertem API-Vertrag und automatisch dokumentiertem Datenmodell; Fachparameter (Rollen, Rechte, Auswahllisten, Grenzwerte, Ampelschwellen, Rundung, Sperrdatum, Feiertage, Kartenlayer) sind Konfiguration ohne Rekompilierung; neue Masken entstehen aus Design System, Facade und generiertem Client. Qualitätssicherung in jedem Build (Stand 02.10.2026, alle bestanden): Lint; 422 API-Tests (Berechnungskern gegen B1.4, Rechenfälle, Service- und HTTP-Tests je Controller mit Rechtematrix); 232 Oberflächen-Tests; 27 Tests der Kartenbibliothek; dazu End-to-End-Fälle (Playwright) für Anmeldung, Startseite, Schiessplatz-Masken und Datenverwaltung sowie Kriterien-Fälle je B1-Anforderung als Skelett mit Prüfschritten, die mit der jeweiligen Maske automatisiert werden. </w:t>
       </w:r>
       <w:r>
         <w:rPr>
@@ -2469,7 +2828,7 @@
         <w:t xml:space="preserve">Prototyp:</w:t>
       </w:r>
       <w:r>
-        <w:t xml:space="preserve"> Rollen, Rechte, Übersetzungen und technische Parameter sind konfigurierbar; Grenzwerte, Ampelschwellen, Rundung und Sperrdatum sind heute Konstanten und werden in die Konfiguration 5.28 überführt. Erweiterungen (weitere Anhänge der LSV, zusätzliche Layer, AGOV) betreffen je ein Modul.</w:t>
+        <w:t xml:space="preserve"> Rollen, Rechte, Übersetzungen, Auswahllisten, Sperrdatum, Ampelschwellen und -farben sowie Kartenlayer sind konfigurierbar; Grenzwerte, Rundung und Feiertage folgen in LP1. Erweiterungen (weitere Anhänge der LSV, zusätzliche Layer, AGOV) betreffen je ein Modul.</w:t>
       </w:r>
     </w:p>
     <w:p>
@@ -2501,7 +2860,47 @@
         <w:spacing w:after="120"/>
       </w:pPr>
       <w:r>
-        <w:t xml:space="preserve">Ergonomie: einheitliche Masken (Design System), Fehlermeldungen mit Behebung, Tastaturbedienung (Kapitel 5). Betrieb: 99 % Mo–Fr 07–19 Uhr, genehmigte Wartungsfenster, Sicherung und Monitoring nach 2.5. Support: 1st Level durch die Trainer der Auftraggeberin (2–15 Personen, FAQ 20), 2nd/3rd Level durch die Anbieterin Mo–Fr 08–17 Uhr [OFFEN: Standort 3rd Level (E-Kriterium) benennen], Reaktion innerhalb vier Stunden, Behebungsbeginn innerhalb 24 Stunden, Behebung bei erheblichen Störungen in der Regel innerhalb 48 Stunden. Für die Fristen von 4/24/48 Stunden gilt gemäss FAQ 115: Bei Eingang innerhalb der Supportzeit beginnt die Frist mit Eingang der Meldung, andernfalls mit Beginn der nächsten Erreichbarkeitszeit. Ab diesem Zeitpunkt laufen die Fristen kalendarisch weiter, auch ausserhalb der Supportzeit sowie an Wochenenden und Feiertagen. Die Supportorganisation stellt die fristgerechte Bearbeitung durch einen entsprechenden Bereitschafts- und Eskalationsprozess sicher; bereits laufende Fristen werden durch das Ende der Erreichbarkeit Mo–Fr 08–17 Uhr nicht ausgesetzt; Schweregrade (FAQ 4): kritisch = Produktion nicht nutzbar, hoch = Kernfunktion gestört ohne Umgehung, mittel = Umgehung vorhanden, niedrig = kosmetisch – mit abgestuften Reaktions- und Behebungszeiten; Meldeweg über Ticketsystem und Hotline, Stellvertretung im Support, Incident-/Problem-/Change-Prozess, Vor-Ort-Einsatz in Bern innerhalb eines Arbeitstags (Teil B 2.6.2/2.8); die Verfügbarkeit von 99 % wird monatlich gemessen und berichtet. Informationsschutz: Si001 wird in einer Kontrollübersicht auf die Massnahmen aus 2.4/2.5 abgebildet (Zugriffsrechte-Prozess, Anmeldemittel, Protokollierung, Break-Glass – Vorlagen aus einem bestehenden Bundesprojekt, für SLIM angepasst); Schweiz-Nachweis (E1/E5, FAQ 39–41 und 49): Das separate Datenhaltungskonzept inventarisiert alle Dienste mit Applikations- oder Projektdaten – Repository, Projektdokumentation, CI/CD, Container-Registry, Logs und Monitoring, E-Mail-Versand, Ticketsystem, Fehlertracking, Druckdienst, Demo und allfällige KI-Werkzeuge – mit Datenkategorien, Datenflüssen, Verarbeitungs- und Speicherstandorten sowie Unterauftragnehmern. Für das angebotene Umsetzungskonzept wird die umfassende Standortvorgabe aus FAQ 49 zugrunde gelegt: Applikations- und Projektdaten werden ausschliesslich auf Informatiksystemen in der Schweiz gespeichert und bearbeitet, einschliesslich Quellcode, Build-Artefakten, Rand- und Metadaten, Zwischenspeicherung, Protokollierung, Telemetrie, Support und Backups, soweit diese einen Applikations- oder Projektbezug haben. Eine Cloud-Region «Europa/EU» genügt dafür nicht; synthetische Demo-Daten begründen keine pauschale Ausnahme für Repository oder CI/CD. Aus FAQ 39–41 wird daher keine generelle Freigabe ausländischer Dienste abgeleitet; eine abweichende Auslegung ist vor deren Einplanung mit der Auftraggeberin zu klären. Werkzeuge ausserhalb der Schweiz kommen nur für Vorgänge ohne jeglichen Bezug zu Applikations- oder Projektdaten in Betracht; E5 schafft auch für KI keine Ausnahme. [OFFEN: Dienste, Anbieter, Schweizer Verarbeitungs- und Speicherstandorte sowie Nachweise für die gesamte Entwicklungs- und Betriebskette vor Abgabe festlegen; bestehende Prototyp-Werkzeuge dagegen prüfen und erforderliche Umstellungen ausweisen.]</w:t>
+        <w:t xml:space="preserve">Ergonomie: einheitliche Masken (Design System), Fehlermeldungen mit Behebung, Tastaturbedienung (Kapitel 5). </w:t>
+      </w:r>
+      <w:r>
+        <w:rPr>
+          <w:b/>
+          <w:bCs/>
+        </w:rPr>
+        <w:t xml:space="preserve">Betrieb (LP4):</w:t>
+      </w:r>
+      <w:r>
+        <w:t xml:space="preserve"> ongoing betreibt SLIM als SaaS über die gesamte Betriebsphase von zehn Jahren und trägt die volle Betriebsverantwortung: 99 % Verfügbarkeit Mo–Fr 07–19 Uhr, monatlich gemessen und berichtet, genehmigte Wartungsfenster, Sicherung und Monitoring nach 2.5. </w:t>
+      </w:r>
+      <w:r>
+        <w:rPr>
+          <w:b/>
+          <w:bCs/>
+        </w:rPr>
+        <w:t xml:space="preserve">Support:</w:t>
+      </w:r>
+      <w:r>
+        <w:t xml:space="preserve"> 1st Level durch die Trainer der Auftraggeberin (2–15 Personen, FAQ 20); 2nd und 3rd Level durch ongoing, Mo–Fr 08–17 Uhr, Standort [OFFEN: Standort 2nd-/3rd-Level-Support]: Reaktion innerhalb vier Stunden, Behebungsbeginn innerhalb 24 Stunden, Behebung erheblicher Störungen in der Regel innerhalb 48 Stunden. Codeänderungen im 3rd Level erstellt die Entwicklerin; sie gelangen ausschliesslich über die CI/CD-Pipeline (Build, automatisierte Tests, Akzeptanzsystem, Freigabe) von der Entwicklung in den Betrieb, die Gesamtverantwortung bleibt bei ongoing. Fristbeginn gemäss FAQ 115: bei Eingang innerhalb der Supportzeit mit der Meldung, sonst mit der nächsten Erreichbarkeit; danach laufen die Fristen kalendarisch, auch an Wochenenden und Feiertagen, gesichert durch einen Bereitschafts- und Eskalationsprozess. Schweregrade (FAQ 4): kritisch = Produktion nicht nutzbar, hoch = Kernfunktion gestört ohne Umgehung, mittel = Umgehung vorhanden, niedrig = kosmetisch; Meldeweg über Ticketsystem und Hotline, Stellvertretung im Support, Incident-/Problem-/Change-Prozess, Vor-Ort-Einsatz in Bern innerhalb eines Arbeitstags (Teil B 2.6.2/2.8). </w:t>
+      </w:r>
+      <w:r>
+        <w:rPr>
+          <w:b/>
+          <w:bCs/>
+        </w:rPr>
+        <w:t xml:space="preserve">Informationsschutz:</w:t>
+      </w:r>
+      <w:r>
+        <w:t xml:space="preserve"> Si001 wird in einer Kontrollübersicht auf die Massnahmen aus 2.4/2.5 abgebildet (Zugriffsrechte-Prozess, Anmeldemittel, Protokollierung, Break-Glass). </w:t>
+      </w:r>
+      <w:r>
+        <w:rPr>
+          <w:b/>
+          <w:bCs/>
+        </w:rPr>
+        <w:t xml:space="preserve">Datenhaltung in der Schweiz (E1, E5):</w:t>
+      </w:r>
+      <w:r>
+        <w:t xml:space="preserve"> Das Datenhaltungskonzept inventarisiert alle Dienste mit Applikations- oder Projektdaten – Repository, Dokumentation, CI/CD, Container-Registry, Logs und Monitoring, E-Mail-Versand, Ticketsystem, Druckdienst, Demo, KI-Werkzeuge – mit Datenkategorien, Datenflüssen, Standorten und Unterauftragnehmern; ongoing und die Entwicklerin legen je ein eigenes Konzept vor (FAQ 132). Verbindlich gilt: Applikations- und Projektdaten werden in allen Umgebungen ausschliesslich auf Informatiksystemen in der Schweiz gespeichert und bearbeitet (FAQ 49, 174) – einschliesslich Quellcode (selbst betriebenes GitLab, FAQ 158), Container-Images und Paketen (selbst betriebenes Nexus), Build-Artefakten, Rand- und Metadaten, Protokollen, Telemetrie, Support und Sicherungen; eine Region «Europa/EU» genügt nicht. Reale Fachdaten liegen nur in Produktion und Akzeptanz; Entwicklung, Tests und Demo arbeiten mit synthetischen Daten. Werkzeuge ausserhalb der Schweiz (z. B. KI-Entwicklungswerkzeuge) werden gemäss FAQ 157, 160 und 172 nur eingesetzt, soweit sie nachweislich keine produktiven oder realen Fachdaten und keine schützenswerten Projektinformationen erhalten; ihr Einsatz ist im Datenhaltungskonzept ausgewiesen. Die Entwicklungsleistungen werden in der Schweiz erbracht.</w:t>
       </w:r>
     </w:p>
     <w:p>
@@ -2517,7 +2916,27 @@
         <w:spacing w:after="120"/>
       </w:pPr>
       <w:r>
-        <w:t xml:space="preserve">Benutzerhandbuch deutsch online und als PDF (Upload in der erweiterten Konfiguration); kontextsensitive Hilfe über Info-Elemente an jeder Maske aus den Übersetzungsressourcen, Anzeige unter zwei Sekunden; technische Dokumentation (Architektur, Datenmodell, Berechnung, Berechtigungen, Betrieb) im Repository, mit jedem Release nachgeführt; rollenbezogene Trainerschulung (Train-the-Trainer auf Deutsch, FAQ 37): zehn initiale Schulungen und zwei wiederkehrende über die Laufzeit, z. B. bei Wechsel der Applikationsverantwortung (FAQ 36/38); Annahme für grössere Funktionserweiterungen: eine zusätzliche Trainerschulung je Erweiterungsrelease [OFFEN: Annahme mit dem Preisblatt LP3 abgleichen]. </w:t>
+        <w:t xml:space="preserve">Benutzerhandbuch deutsch online und als PDF (Upload in der erweiterten Konfiguration); kontextsensitive Hilfe je Seite über Hilfe-Schaltfläche und F1 aus den Übersetzungsressourcen, Anzeige unter zwei Sekunden; technische Dokumentation (Architektur, Datenmodell, Berechnung, Berechtigungen, Betrieb) im Repository, mit jedem Release nachgeführt. </w:t>
+      </w:r>
+      <w:r>
+        <w:rPr>
+          <w:i/>
+          <w:iCs/>
+        </w:rPr>
+        <w:t xml:space="preserve">Prototyp:</w:t>
+      </w:r>
+      <w:r>
+        <w:t xml:space="preserve"> Hilfe mit 16 Themen in vier Sprachen und Online-Hilfe umgesetzt; der Inhalt des PDF-Handbuchs und die Schulungsunterlagen entstehen in LP1. </w:t>
+      </w:r>
+      <w:r>
+        <w:rPr>
+          <w:b/>
+          <w:bCs/>
+        </w:rPr>
+        <w:t xml:space="preserve">Schulung (LP3):</w:t>
+      </w:r>
+      <w:r>
+        <w:t xml:space="preserve"> Die Trainer von ongoing führen sämtliche Schulungen durch – zehn initiale und zwei wiederkehrende über die Laufzeit, z. B. bei Wechsel der Applikationsverantwortung (FAQ 36/38) – als Train-the-Trainer für die Applikationsverantwortlichen der Auftraggeberin: vor Ort (Bern und weitere Standorte), rund ein halber Tag, zwei bis drei Personen je Schulung, Unterlagen auf Deutsch, Durchführung bei Bedarf auch auf Französisch oder Italienisch (FAQ 37, 70). Annahme für grössere Funktionserweiterungen: eine zusätzliche Trainerschulung je Erweiterungsrelease. </w:t>
       </w:r>
       <w:r>
         <w:rPr>
@@ -2527,19 +2946,7 @@
         <w:t xml:space="preserve">Abnahme (Beilage A1.2):</w:t>
       </w:r>
       <w:r>
-        <w:t xml:space="preserve"> Die Entwicklung läuft in Sprints von zwei bis drei Wochen mit formeller Iterationsabnahme: Vor dem Sprint Review liefert die Anbieterin die Zusammenfassung der umgesetzten Anforderungen, die Testfälle (aus den im Refinement vereinbarten Akzeptanzkriterien) und die Testprotokolle und stellt den Stand auf dem Akzeptanzsystem mit produktionsnahen Daten bereit; die Auftraggeberin protokolliert je Testobjekt abgenommen / bedingt / nicht abgenommen, Nachbesserungen erfolgen in der vereinbarten Frist. Jede B1-Anforderung ist heute schon als Testfall-Skelett mit Prüfschritten hinterlegt (End-to-End-Fall je </w:t>
-      </w:r>
-      <w:r>
-        <w:rPr>
-          <w:rFonts w:ascii="Consolas" w:cs="Consolas" w:eastAsia="Consolas" w:hAnsi="Consolas"/>
-          <w:sz w:val="20"/>
-          <w:szCs w:val="20"/>
-          <w:shd w:fill="F2F2F2" w:val="clear"/>
-        </w:rPr>
-        <w:t xml:space="preserve">slm</w:t>
-      </w:r>
-      <w:r>
-        <w:t xml:space="preserve">-Nummer, automatisiert mit der jeweiligen Maske; die Kontrollwerte der Berechnung sind bereits als Tests erbracht); die Schlussabnahme stützt sich auf das vollständige, aus diesen Fällen erzeugte Abnahmetestprotokoll. Abweichungen von B1 laufen ausschliesslich über den Change-Request-Prozess der Beilage (Auswirkungsanalyse Aufwand, Kosten, Termine, Risiken; Entscheid der Auftraggeberin); ein Q-Ansprechpartner der Anbieterin steht dem Qualitätsmanager der Auftraggeberin gegenüber. </w:t>
+        <w:t xml:space="preserve"> Die Entwicklung läuft in Sprints von zwei bis drei Wochen mit formeller Iterationsabnahme: Vor dem Sprint Review liefert die Anbieterin die Zusammenfassung der umgesetzten Anforderungen, die Testfälle (aus den im Refinement vereinbarten Akzeptanzkriterien) und die Testprotokolle und stellt den Stand auf dem Akzeptanzsystem mit produktionsnahen Daten bereit; die Auftraggeberin protokolliert je Testobjekt abgenommen / bedingt / nicht abgenommen. Die Schlussabnahme stützt sich auf das vollständige Abnahmetestprotokoll. Abweichungen von B1 laufen ausschliesslich über den Change-Request-Prozess (Auswirkungsanalyse Aufwand, Kosten, Termine, Risiken; Entscheid der Auftraggeberin); ein Q-Ansprechpartner der Anbieterin steht dem Qualitätsmanager der Auftraggeberin gegenüber. </w:t>
       </w:r>
       <w:r>
         <w:rPr>
@@ -2549,7 +2956,7 @@
         <w:t xml:space="preserve">Mitwirkung (Beilage A1.1):</w:t>
       </w:r>
       <w:r>
-        <w:t xml:space="preserve"> Das Konzept setzt die dort zugesagten Beiträge voraus – SPOC, Testdaten und Referenzfälle, Fachbestätigungen (Kapitel 4.3), Mitarbeit an Handbuch, Schulung, Migrations- und Testkonzept, Sprint Planning und Reviews.</w:t>
+        <w:t xml:space="preserve"> Das Konzept setzt die dort zugesagten Beiträge voraus – SPOC, Testdaten und Referenzfälle, Fachbestätigungen, Mitarbeit an Handbuch, Schulung, Migrations- und Testkonzept, Sprint Planning und Reviews.</w:t>
       </w:r>
     </w:p>
     <w:p>
@@ -2565,7 +2972,7 @@
         <w:spacing w:after="120"/>
       </w:pPr>
       <w:r>
-        <w:t xml:space="preserve">Der Machbarkeitsnachweis stützt sich nicht auf Absichtserklärungen, sondern auf den lauffähigen Prototyp, der aus denselben Bausteinen besteht wie die angebotene Lösung (Angular, NestJS, TypeORM, galaxy-Plattform, Berechnungskern): Stand 21.09.2026 sind Anmeldung (2FA vorhanden, in der Demo nicht aktiviert), Rollen und Objektregeln, Übersicht Schiessplätze mit berechneten Ampeln, die Masken 5.11 Schusszahlen, 5.12 Details und 5.13 Simulation, die Datenverwaltung 5.14–5.16, 5.18–5.21 (inkl. Import mit Prüfbericht und Zeiger aktuell/MGDM) und 5.22–5.25, das Datenmodell nach B1 Kapitel 10, der Berechnungslauf, Benutzerverwaltung und Logbuch umgesetzt; der Nachweisstand des Berechnungskerns gegen Beilage B1.4, die offene A7X-Abweichung bei E8 und die Rechenfälle durch die Kette sind in Kapitel 4.3 ausgewiesen; die automatisierten Tests (Kapitel 6.1) und ein reproduzierbarer Setup-Wizard laufen bei jedem Build. Nicht umgesetzte Masken sind in der Oberfläche als «In Vorbereitung» gekennzeichnet; der Umsetzungsstand je Anforderung steht in der Matrix (Kapitel 7, Status P). Die Risiken der verbleibenden Arbeit sind dadurch eingegrenzt:</w:t>
+        <w:t xml:space="preserve">Der Machbarkeitsnachweis stützt sich auf den lauffähigen Prototyp (MVP), der aus denselben Bausteinen besteht wie die angebotene Lösung (Angular, NestJS, TypeORM, galaxy-Plattform, Berechnungskern). Stand 02.10.2026 sind umgesetzt: Anmeldung, Rollen und Objektregeln, Übersicht Schiessplätze mit berechneten Ampeln, die Masken 5.11 Schusszahlen, 5.12 Details und 5.13 Simulation, der GIS-Kartenviewer, die Datenverwaltung 5.14–5.25 (5.17 als Anzeige), Auswahllisten, erweiterte Konfiguration 5.28, Hilfe, das Datenmodell nach B1 Kapitel 10, der Berechnungslauf, Benutzerverwaltung und Logbuch; der Berechnungskern ist gegen Beilage B1.4 geprüft (Kapitel 4.3). Noch nicht umgesetzt sind insbesondere die Seite 5.10, die ELO-Endpunkte, der FGDB-Zugriff über GDAL, der Excel-Import der Schusszahlen, die Exporte nach B1.6 und MPV, die Views, der Betrieb auf PostgreSQL/PostGIS und die Zuordnung Benutzer ↔ Schiessplatz in der Maske. Nicht umgesetzte Masken sind in der Oberfläche als «In Vorbereitung» gekennzeichnet; der Stand je Anforderung steht in der Matrix. Auf diesem Stand und auf der ELO-Erfahrung der Entwicklerin beruht der angebotene Maximalaufwand von 2'800 Stunden für LP1a. Die Risiken der verbleibenden Arbeit sind eingegrenzt:</w:t>
       </w:r>
     </w:p>
     <w:tbl>
@@ -2661,7 +3068,7 @@
                 <w:sz w:val="19"/>
                 <w:szCs w:val="19"/>
               </w:rPr>
-              <w:t xml:space="preserve">FGDB-Schema B1.2 lässt sich mit GDAL nicht vollständig lesen/schreiben (Domänen, Beziehungen)</w:t>
+              <w:t xml:space="preserve">FGDB-Schema lässt sich mit GDAL nicht vollständig lesen oder schreiben (Domänen, Beziehungen)</w:t>
             </w:r>
           </w:p>
         </w:tc>
@@ -2683,7 +3090,7 @@
                 <w:sz w:val="19"/>
                 <w:szCs w:val="19"/>
               </w:rPr>
-              <w:t xml:space="preserve">Lese-/Schreibprobe vor Abgabe mit den verfügbaren Referenzdaten, einschliesslich der darin enthaltenen Domänen, Beziehungen, Geometrien und Identifikatoren; geprüfte Inhalte und Grenzen dokumentieren. Das endgültige Schema wird gemäss FAQ 99 erst im Projekt festgelegt; danach erfolgt der vollständige Nachweis gegen dieses Schema. Bei Lücken stellt die Anbieterin einen geeigneten Konvertierungsweg bereit und weist den vollständigen FGDB-Import/-Export nach; Werkzeug, Lizenzen, Betrieb und Aufwand sind vor Abgabe zu konkretisieren. Die FME-Workbench der Auftraggeberin dient der fachlichen Validierung gemäss 3.2; eine zusätzliche Konvertierungsleistung wird nicht vorausgesetzt. GeoPackage oder ein anderes Austauschformat ersetzt FGDB nur nach ausdrücklicher Vereinbarung mit der Auftraggeberin über den Change-Request-Prozess.</w:t>
+              <w:t xml:space="preserve">Validierung zu Projektbeginn mit den Testdaten von KOMZ Lärm einschliesslich Domänen, Beziehungen, Geometrien und Identifikatoren; vollständiger Nachweis gegen das gemäss FAQ 99 festgelegte Schema. Bei Lücken stellt die Anbieterin einen Konvertierungsweg bereit und weist den vollständigen FGDB-Import und -Export nach. Ein anderes Austauschformat ersetzt FGDB nur über den Change-Request-Prozess (FAQ 121)</w:t>
             </w:r>
           </w:p>
         </w:tc>
@@ -2710,7 +3117,7 @@
                 <w:sz w:val="19"/>
                 <w:szCs w:val="19"/>
               </w:rPr>
-              <w:t xml:space="preserve">Performance mit realem Mengengerüst (bis 10'000 Stellungsräume)</w:t>
+              <w:t xml:space="preserve">Umstellung des Prototyps auf PostgreSQL/PostGIS</w:t>
             </w:r>
           </w:p>
         </w:tc>
@@ -2732,7 +3139,7 @@
                 <w:sz w:val="19"/>
                 <w:szCs w:val="19"/>
               </w:rPr>
-              <w:t xml:space="preserve">Kern gemessen (&lt; 0.1 s), Worker-Isolation, Lasttest auf dem Akzeptanzsystem vor der ersten Iterationsabnahme; Rückfall: tagesaktuelle Vorberechnung der Ampeln</w:t>
+              <w:t xml:space="preserve">Typzuordnung der vorbestehenden Bibliotheken als erste Aufgabe in LP1; Nachweis auf dem Akzeptanzsystem vor dem fachlichen Durchstich</w:t>
             </w:r>
           </w:p>
         </w:tc>
@@ -2759,7 +3166,7 @@
                 <w:sz w:val="19"/>
                 <w:szCs w:val="19"/>
               </w:rPr>
-              <w:t xml:space="preserve">Abstimmung der ELO-Schnittstelle</w:t>
+              <w:t xml:space="preserve">Performance mit realem Mengengerüst</w:t>
             </w:r>
           </w:p>
         </w:tc>
@@ -2781,7 +3188,7 @@
                 <w:sz w:val="19"/>
                 <w:szCs w:val="19"/>
               </w:rPr>
-              <w:t xml:space="preserve">OpenAPI-Vertrag im ersten Sprint, Testumgebung, Integrationstests über beide Systeme</w:t>
+              <w:t xml:space="preserve">Kern gemessen (4.4), Worker-Isolation, Lasttest auf dem Akzeptanzsystem vor der ersten Iterationsabnahme; Rückfall: tagesaktuelle Vorberechnung der Ampeln</w:t>
             </w:r>
           </w:p>
         </w:tc>
@@ -2808,7 +3215,7 @@
                 <w:sz w:val="19"/>
                 <w:szCs w:val="19"/>
               </w:rPr>
-              <w:t xml:space="preserve">Referenzabweichung E8, Ersatzregel der Verteilung und zusätzliche Anlagenberechnungen</w:t>
+              <w:t xml:space="preserve">Abstimmung der ELO-Schnittstelle</w:t>
             </w:r>
           </w:p>
         </w:tc>
@@ -2830,7 +3237,7 @@
                 <w:sz w:val="19"/>
                 <w:szCs w:val="19"/>
               </w:rPr>
-              <w:t xml:space="preserve">A7X ist gemäss FAQ 19 verbindlich; E8-Abweichung des Anwendungsstandards vor Abnahme beheben und gemäss 4.3 nachweisen, abweichende Behandlung und Ersatzregel nur mit dokumentiertem Entscheid; Angebotsbasis gemäss FAQ 93 ist die platzweite Berechnung, zusätzliche getrennte Anlagenberechnungen werden unter LP5 behandelt (2.3)</w:t>
+              <w:t xml:space="preserve">Beide Systeme sind der Entwicklerin bekannt; OpenAPI-Vertrag im ersten Sprint, Testumgebung, Integrationstests über beide Systeme</w:t>
             </w:r>
           </w:p>
         </w:tc>
@@ -2857,7 +3264,7 @@
                 <w:sz w:val="19"/>
                 <w:szCs w:val="19"/>
               </w:rPr>
-              <w:t xml:space="preserve">Kartendienste swisstopo (Nutzungsbedingungen, Verfügbarkeit)</w:t>
+              <w:t xml:space="preserve">Offene Fachregeln (Ersatzregel der Verteilung, «nicht beurteilbar», zivile Nutzungen in Anhang 9, getrennte Anlagen)</w:t>
             </w:r>
           </w:p>
         </w:tc>
@@ -2879,7 +3286,7 @@
                 <w:sz w:val="19"/>
                 <w:szCs w:val="19"/>
               </w:rPr>
-              <w:t xml:space="preserve">Vereinbarung über die Auftraggeberin, Listen-/Schemafallback in der Oberfläche</w:t>
+              <w:t xml:space="preserve">Fachentscheidregister, Bestätigung durch KOMZ Lärm zu Beginn der Realisierung (FAQ 165); platzweite Berechnung als Basis (FAQ 93), Abweichungen über Change Request</w:t>
             </w:r>
           </w:p>
         </w:tc>
@@ -2906,7 +3313,7 @@
                 <w:sz w:val="19"/>
                 <w:szCs w:val="19"/>
               </w:rPr>
-              <w:t xml:space="preserve">Nutzungsrechte an vorbestehender Software</w:t>
+              <w:t xml:space="preserve">Kartendienste swisstopo (Nutzungsbedingungen, Verfügbarkeit)</w:t>
             </w:r>
           </w:p>
         </w:tc>
@@ -2928,7 +3335,56 @@
                 <w:sz w:val="19"/>
                 <w:szCs w:val="19"/>
               </w:rPr>
-              <w:t xml:space="preserve">Deklaration nach Art. 6.2.4, Quellcode-Lieferung, OSS-Entscheid vor Abgabe</w:t>
+              <w:t xml:space="preserve">Vereinbarung über die Auftraggeberin (FAQ 120), Listen- und Schemafallback in der Oberfläche</w:t>
+            </w:r>
+          </w:p>
+        </w:tc>
+      </w:tr>
+      <w:tr>
+        <w:trPr>
+          <w:tblHeader w:val="false"/>
+        </w:trPr>
+        <w:tc>
+          <w:tcPr>
+            <w:tcMar>
+              <w:top w:type="dxa" w:w="60"/>
+              <w:left w:type="dxa" w:w="90"/>
+              <w:bottom w:type="dxa" w:w="60"/>
+              <w:right w:type="dxa" w:w="90"/>
+            </w:tcMar>
+          </w:tcPr>
+          <w:p>
+            <w:pPr>
+              <w:spacing w:after="0"/>
+            </w:pPr>
+            <w:r>
+              <w:rPr>
+                <w:sz w:val="19"/>
+                <w:szCs w:val="19"/>
+              </w:rPr>
+              <w:t xml:space="preserve">Nutzungsrechte an vorbestehender Software</w:t>
+            </w:r>
+          </w:p>
+        </w:tc>
+        <w:tc>
+          <w:tcPr>
+            <w:tcMar>
+              <w:top w:type="dxa" w:w="60"/>
+              <w:left w:type="dxa" w:w="90"/>
+              <w:bottom w:type="dxa" w:w="60"/>
+              <w:right w:type="dxa" w:w="90"/>
+            </w:tcMar>
+          </w:tcPr>
+          <w:p>
+            <w:pPr>
+              <w:spacing w:after="0"/>
+            </w:pPr>
+            <w:r>
+              <w:rPr>
+                <w:sz w:val="19"/>
+                <w:szCs w:val="19"/>
+              </w:rPr>
+              <w:t xml:space="preserve">Deklaration nach Art. 6.2.4, Quellcode-Lieferung und SBOM (2.2)</w:t>
             </w:r>
           </w:p>
         </w:tc>
@@ -2951,7 +3407,7 @@
         <w:t xml:space="preserve">Interaktive Demonstration des Prototyps.</w:t>
       </w:r>
       <w:r>
-        <w:t xml:space="preserve"> URL: https://[PLACEHOLDER] – Demo-Zugang mit der Rolle Interessent (Lesen und Simulation gemäss Matrix 8.1.2) und einem Konto je Rolle für den Vergleich der Berechtigungen; Zugangsdaten in der Begleitnotiz zum Angebot. Die Demo veranschaulicht den aktuellen Entwicklungsstand (Demostand «SLIM Demo», Datensatz Version 6, Software-Stand 21.09.2026 [OFFEN: Freeze-Datum und Version bei Abgabe eintragen]) anhand synthetischer Beispieldaten: neun fiktive Schiessplätze, Empfangspunkte, Zustände und Nutzungen sind generiert und enthalten keine echten Kunden-, Schiessplatz- oder Personendaten; die Kontrollwerte des Berechnungskerns stammen aus der öffentlichen Beilage B1.4. Noch nicht umgesetzte Funktionen sind gekennzeichnet. Die Demo wird während der Evaluation eingefroren (kein Deployment, tägliche Rücksetzung der Daten), ist auf Schweizer Infrastruktur erreichbar und wird mit Verfügbarkeits-Monitoring überwacht. Die vollständige Beschreibung der angebotenen Lösung ist in diesem Dokument enthalten; das Konzept ist ohne Aufruf der Demo vollständig bewertbar.</w:t>
+        <w:t xml:space="preserve"> URL: [OFFEN: Demo-URL] – Demo-Zugang mit der Rolle Interessent (Lesen und Simulation gemäss Matrix 8.1.2) und einem Konto je Rolle für den Vergleich der Berechtigungen; Zugangsdaten in der Begleitnotiz zum Angebot. Die Demo zeigt den Stand [OFFEN: Freeze-Datum und Version der Demo] anhand synthetischer Beispieldaten (Datensatz «SLIM Demo»): Neun fiktive Schiessplätze, Empfangspunkte, Zustände und Nutzungen sind generiert und enthalten keine echten Kunden-, Schiessplatz- oder Personendaten. Die Demo ist während der Evaluation eingefroren (kein Deployment, tägliche Rücksetzung der Daten) und läuft auf Schweizer Infrastruktur. Das Konzept ist ohne Aufruf der Demo vollständig bewertbar.</w:t>
       </w:r>
     </w:p>
     <w:p>
@@ -2972,7 +3428,7 @@
         <w:spacing w:after="120"/>
       </w:pPr>
       <w:r>
-        <w:t xml:space="preserve">Zuordnung jeder B1-Anforderung zum Umsetzungskapitel (FAQ 8: Beilage ausserhalb des Seitenbudgets). Status des Prototyps gemäss den beschriebenen Funktionen: </w:t>
+        <w:t xml:space="preserve">Zuordnung jeder B1-Anforderung zum Umsetzungskapitel (FAQ 8). Status des Prototyps am 02.10.2026: </w:t>
       </w:r>
       <w:r>
         <w:rPr>
@@ -2992,7 +3448,7 @@
         <w:t xml:space="preserve">T</w:t>
       </w:r>
       <w:r>
-        <w:t xml:space="preserve"> = teilweise umgesetzt, wesentliche Teile oder Nachweise fehlen · </w:t>
+        <w:t xml:space="preserve"> = teilweise umgesetzt · </w:t>
       </w:r>
       <w:r>
         <w:rPr>
@@ -3002,7 +3458,7 @@
         <w:t xml:space="preserve">Z</w:t>
       </w:r>
       <w:r>
-        <w:t xml:space="preserve"> = verbindlich vorgesehen, Umsetzung ausstehend · </w:t>
+        <w:t xml:space="preserve"> = verbindlich zugesagt, Umsetzung ausstehend · </w:t>
       </w:r>
       <w:r>
         <w:rPr>
@@ -3012,17 +3468,7 @@
         <w:t xml:space="preserve">O</w:t>
       </w:r>
       <w:r>
-        <w:t xml:space="preserve"> = angebotene Option · </w:t>
-      </w:r>
-      <w:r>
-        <w:rPr>
-          <w:b/>
-          <w:bCs/>
-        </w:rPr>
-        <w:t xml:space="preserve">K</w:t>
-      </w:r>
-      <w:r>
-        <w:t xml:space="preserve"> = Klärung offen. Die Statusangaben sind keine Abnahmebestätigung; P setzt weder eine vollständige unabhängige Codeprüfung noch einen vollständigen E2E-Nachweis voraus. Testumfang und bekannte Abweichungen stehen in 4.3 und 6.1. Bei Teilumsetzungen nennt die Klammer vorhandene und ausstehende Bestandteile.</w:t>
+        <w:t xml:space="preserve"> = angebotene Option. Die Angaben sind keine Abnahmebestätigung; die Klammer nennt vorhandene und ausstehende Teile.</w:t>
       </w:r>
     </w:p>
     <w:tbl>
@@ -3170,7 +3616,7 @@
                 <w:sz w:val="17"/>
                 <w:szCs w:val="17"/>
               </w:rPr>
-              <w:t xml:space="preserve">slm 1</w:t>
+              <w:t xml:space="preserve">slm 1</w:t>
             </w:r>
           </w:p>
         </w:tc>
@@ -3214,29 +3660,29 @@
                 <w:sz w:val="17"/>
                 <w:szCs w:val="17"/>
               </w:rPr>
-              <w:t xml:space="preserve">5.3, 6.1</w:t>
-            </w:r>
-          </w:p>
-        </w:tc>
-        <w:tc>
-          <w:tcPr>
-            <w:tcMar>
-              <w:top w:type="dxa" w:w="20"/>
-              <w:left w:type="dxa" w:w="60"/>
-              <w:bottom w:type="dxa" w:w="20"/>
-              <w:right w:type="dxa" w:w="60"/>
-            </w:tcMar>
-          </w:tcPr>
-          <w:p>
-            <w:pPr>
-              <w:spacing w:after="0"/>
-            </w:pPr>
-            <w:r>
-              <w:rPr>
-                <w:sz w:val="17"/>
-                <w:szCs w:val="17"/>
-              </w:rPr>
-              <w:t xml:space="preserve">Z</w:t>
+              <w:t xml:space="preserve">5.1, 6.1</w:t>
+            </w:r>
+          </w:p>
+        </w:tc>
+        <w:tc>
+          <w:tcPr>
+            <w:tcMar>
+              <w:top w:type="dxa" w:w="20"/>
+              <w:left w:type="dxa" w:w="60"/>
+              <w:bottom w:type="dxa" w:w="20"/>
+              <w:right w:type="dxa" w:w="60"/>
+            </w:tcMar>
+          </w:tcPr>
+          <w:p>
+            <w:pPr>
+              <w:spacing w:after="0"/>
+            </w:pPr>
+            <w:r>
+              <w:rPr>
+                <w:sz w:val="17"/>
+                <w:szCs w:val="17"/>
+              </w:rPr>
+              <w:t xml:space="preserve">P (Stammdaten-Listen, zivile Nutzungsart; fachlich fixe Listen fest)</w:t>
             </w:r>
           </w:p>
         </w:tc>
@@ -3263,29 +3709,29 @@
                 <w:sz w:val="17"/>
                 <w:szCs w:val="17"/>
               </w:rPr>
-              <w:t xml:space="preserve">slm 2</w:t>
-            </w:r>
-          </w:p>
-        </w:tc>
-        <w:tc>
-          <w:tcPr>
-            <w:tcMar>
-              <w:top w:type="dxa" w:w="20"/>
-              <w:left w:type="dxa" w:w="60"/>
-              <w:bottom w:type="dxa" w:w="20"/>
-              <w:right w:type="dxa" w:w="60"/>
-            </w:tcMar>
-          </w:tcPr>
-          <w:p>
-            <w:pPr>
-              <w:spacing w:after="0"/>
-            </w:pPr>
-            <w:r>
-              <w:rPr>
-                <w:sz w:val="17"/>
-                <w:szCs w:val="17"/>
-              </w:rPr>
-              <w:t xml:space="preserve">Kartenviewer swisstopo, LV95, Layer, PDF-Export</w:t>
+              <w:t xml:space="preserve">slm 2</w:t>
+            </w:r>
+          </w:p>
+        </w:tc>
+        <w:tc>
+          <w:tcPr>
+            <w:tcMar>
+              <w:top w:type="dxa" w:w="20"/>
+              <w:left w:type="dxa" w:w="60"/>
+              <w:bottom w:type="dxa" w:w="20"/>
+              <w:right w:type="dxa" w:w="60"/>
+            </w:tcMar>
+          </w:tcPr>
+          <w:p>
+            <w:pPr>
+              <w:spacing w:after="0"/>
+            </w:pPr>
+            <w:r>
+              <w:rPr>
+                <w:sz w:val="17"/>
+                <w:szCs w:val="17"/>
+              </w:rPr>
+              <w:t xml:space="preserve">Kartenviewer swisstopo, LV95, Layer, Export</w:t>
             </w:r>
           </w:p>
         </w:tc>
@@ -3329,7 +3775,7 @@
                 <w:sz w:val="17"/>
                 <w:szCs w:val="17"/>
               </w:rPr>
-              <w:t xml:space="preserve">T (schematische Karte vorhanden; Viewer/Export ausstehend; zusätzliche Layer LP5, FAQ 13)</w:t>
+              <w:t xml:space="preserve">P (Viewer, Layer, PDF-/Bild-Export, Vollansicht; Server-Druck ausstehend, weitere Layer LP5)</w:t>
             </w:r>
           </w:p>
         </w:tc>
@@ -3356,7 +3802,7 @@
                 <w:sz w:val="17"/>
                 <w:szCs w:val="17"/>
               </w:rPr>
-              <w:t xml:space="preserve">slm 3</w:t>
+              <w:t xml:space="preserve">slm 3</w:t>
             </w:r>
           </w:p>
         </w:tc>
@@ -3422,7 +3868,7 @@
                 <w:sz w:val="17"/>
                 <w:szCs w:val="17"/>
               </w:rPr>
-              <w:t xml:space="preserve">T (Suche, Sortierung, Filter, Selektion, XLSX vorhanden; vollständiger Umfang ausstehend)</w:t>
+              <w:t xml:space="preserve">T (Excel/CSV mit Kopfblock in zwei Tabellen; übrige Tabellen, Spaltenfilter ausstehend)</w:t>
             </w:r>
           </w:p>
         </w:tc>
@@ -3449,7 +3895,7 @@
                 <w:sz w:val="17"/>
                 <w:szCs w:val="17"/>
               </w:rPr>
-              <w:t xml:space="preserve">slm 4</w:t>
+              <w:t xml:space="preserve">slm 4</w:t>
             </w:r>
           </w:p>
         </w:tc>
@@ -3542,7 +3988,7 @@
                 <w:sz w:val="17"/>
                 <w:szCs w:val="17"/>
               </w:rPr>
-              <w:t xml:space="preserve">slm 5</w:t>
+              <w:t xml:space="preserve">slm 5</w:t>
             </w:r>
           </w:p>
         </w:tc>
@@ -3608,7 +4054,7 @@
                 <w:sz w:val="17"/>
                 <w:szCs w:val="17"/>
               </w:rPr>
-              <w:t xml:space="preserve">P</w:t>
+              <w:t xml:space="preserve">P (auch je einzelne Nutzung)</w:t>
             </w:r>
           </w:p>
         </w:tc>
@@ -3635,7 +4081,7 @@
                 <w:sz w:val="17"/>
                 <w:szCs w:val="17"/>
               </w:rPr>
-              <w:t xml:space="preserve">slm 6</w:t>
+              <w:t xml:space="preserve">slm 6</w:t>
             </w:r>
           </w:p>
         </w:tc>
@@ -3728,7 +4174,7 @@
                 <w:sz w:val="17"/>
                 <w:szCs w:val="17"/>
               </w:rPr>
-              <w:t xml:space="preserve">slm 7</w:t>
+              <w:t xml:space="preserve">slm 7</w:t>
             </w:r>
           </w:p>
         </w:tc>
@@ -3821,7 +4267,7 @@
                 <w:sz w:val="17"/>
                 <w:szCs w:val="17"/>
               </w:rPr>
-              <w:t xml:space="preserve">slm 8</w:t>
+              <w:t xml:space="preserve">slm 8</w:t>
             </w:r>
           </w:p>
         </w:tc>
@@ -3914,29 +4360,29 @@
                 <w:sz w:val="17"/>
                 <w:szCs w:val="17"/>
               </w:rPr>
-              <w:t xml:space="preserve">slm 9</w:t>
-            </w:r>
-          </w:p>
-        </w:tc>
-        <w:tc>
-          <w:tcPr>
-            <w:tcMar>
-              <w:top w:type="dxa" w:w="20"/>
-              <w:left w:type="dxa" w:w="60"/>
-              <w:bottom w:type="dxa" w:w="20"/>
-              <w:right w:type="dxa" w:w="60"/>
-            </w:tcMar>
-          </w:tcPr>
-          <w:p>
-            <w:pPr>
-              <w:spacing w:after="0"/>
-            </w:pPr>
-            <w:r>
-              <w:rPr>
-                <w:sz w:val="17"/>
-                <w:szCs w:val="17"/>
-              </w:rPr>
-              <w:t xml:space="preserve">Schiessplatz-Übersicht 5.10 (Ampeln, Stand SPM/MPV/Projekt, Kontingente, Karte)</w:t>
+              <w:t xml:space="preserve">slm 9</w:t>
+            </w:r>
+          </w:p>
+        </w:tc>
+        <w:tc>
+          <w:tcPr>
+            <w:tcMar>
+              <w:top w:type="dxa" w:w="20"/>
+              <w:left w:type="dxa" w:w="60"/>
+              <w:bottom w:type="dxa" w:w="20"/>
+              <w:right w:type="dxa" w:w="60"/>
+            </w:tcMar>
+          </w:tcPr>
+          <w:p>
+            <w:pPr>
+              <w:spacing w:after="0"/>
+            </w:pPr>
+            <w:r>
+              <w:rPr>
+                <w:sz w:val="17"/>
+                <w:szCs w:val="17"/>
+              </w:rPr>
+              <w:t xml:space="preserve">Schiessplatz-Übersicht 5.10 (Ampeln, Stände, Kontingente, Karte)</w:t>
             </w:r>
           </w:p>
         </w:tc>
@@ -3980,7 +4426,7 @@
                 <w:sz w:val="17"/>
                 <w:szCs w:val="17"/>
               </w:rPr>
-              <w:t xml:space="preserve">T (Ampeln, Kontext vorhanden; vollständige Übersicht ausstehend)</w:t>
+              <w:t xml:space="preserve">Z (Ampeln in der Kontextleiste vorhanden)</w:t>
             </w:r>
           </w:p>
         </w:tc>
@@ -4007,7 +4453,7 @@
                 <w:sz w:val="17"/>
                 <w:szCs w:val="17"/>
               </w:rPr>
-              <w:t xml:space="preserve">slm 10</w:t>
+              <w:t xml:space="preserve">slm 10</w:t>
             </w:r>
           </w:p>
         </w:tc>
@@ -4073,7 +4519,7 @@
                 <w:sz w:val="17"/>
                 <w:szCs w:val="17"/>
               </w:rPr>
-              <w:t xml:space="preserve">T (Erfassung vorhanden; Spaltenfilter, Export ausstehend)</w:t>
+              <w:t xml:space="preserve">T (Erfassung, Summen je Einheit, Export; Spaltenfilter ausstehend)</w:t>
             </w:r>
           </w:p>
         </w:tc>
@@ -4100,7 +4546,7 @@
                 <w:sz w:val="17"/>
                 <w:szCs w:val="17"/>
               </w:rPr>
-              <w:t xml:space="preserve">slm 11</w:t>
+              <w:t xml:space="preserve">slm 11</w:t>
             </w:r>
           </w:p>
         </w:tc>
@@ -4166,7 +4612,7 @@
                 <w:sz w:val="17"/>
                 <w:szCs w:val="17"/>
               </w:rPr>
-              <w:t xml:space="preserve">T (Details vorhanden; Kartenviewer ausstehend)</w:t>
+              <w:t xml:space="preserve">T (Details mit Karte; Jahresauswahl in der Maske ausstehend)</w:t>
             </w:r>
           </w:p>
         </w:tc>
@@ -4193,7 +4639,7 @@
                 <w:sz w:val="17"/>
                 <w:szCs w:val="17"/>
               </w:rPr>
-              <w:t xml:space="preserve">slm 12</w:t>
+              <w:t xml:space="preserve">slm 12</w:t>
             </w:r>
           </w:p>
         </w:tc>
@@ -4259,7 +4705,7 @@
                 <w:sz w:val="17"/>
                 <w:szCs w:val="17"/>
               </w:rPr>
-              <w:t xml:space="preserve">P – angebotene Option LP1b gemäss FAQ 117</w:t>
+              <w:t xml:space="preserve">P – Option LP1b gemäss FAQ 117</w:t>
             </w:r>
           </w:p>
         </w:tc>
@@ -4286,7 +4732,7 @@
                 <w:sz w:val="17"/>
                 <w:szCs w:val="17"/>
               </w:rPr>
-              <w:t xml:space="preserve">slm 13</w:t>
+              <w:t xml:space="preserve">slm 13</w:t>
             </w:r>
           </w:p>
         </w:tc>
@@ -4379,7 +4825,7 @@
                 <w:sz w:val="17"/>
                 <w:szCs w:val="17"/>
               </w:rPr>
-              <w:t xml:space="preserve">slm 14</w:t>
+              <w:t xml:space="preserve">slm 14</w:t>
             </w:r>
           </w:p>
         </w:tc>
@@ -4472,7 +4918,7 @@
                 <w:sz w:val="17"/>
                 <w:szCs w:val="17"/>
               </w:rPr>
-              <w:t xml:space="preserve">slm 15</w:t>
+              <w:t xml:space="preserve">slm 15</w:t>
             </w:r>
           </w:p>
         </w:tc>
@@ -4538,7 +4984,7 @@
                 <w:sz w:val="17"/>
                 <w:szCs w:val="17"/>
               </w:rPr>
-              <w:t xml:space="preserve">T (Anzeige vorhanden; Bearbeiten ausstehend)</w:t>
+              <w:t xml:space="preserve">T (Anzeige, Suche; Bearbeiten ausstehend)</w:t>
             </w:r>
           </w:p>
         </w:tc>
@@ -4565,7 +5011,7 @@
                 <w:sz w:val="17"/>
                 <w:szCs w:val="17"/>
               </w:rPr>
-              <w:t xml:space="preserve">slm 16</w:t>
+              <w:t xml:space="preserve">slm 16</w:t>
             </w:r>
           </w:p>
         </w:tc>
@@ -4658,29 +5104,29 @@
                 <w:sz w:val="17"/>
                 <w:szCs w:val="17"/>
               </w:rPr>
-              <w:t xml:space="preserve">slm 17</w:t>
-            </w:r>
-          </w:p>
-        </w:tc>
-        <w:tc>
-          <w:tcPr>
-            <w:tcMar>
-              <w:top w:type="dxa" w:w="20"/>
-              <w:left w:type="dxa" w:w="60"/>
-              <w:bottom w:type="dxa" w:w="20"/>
-              <w:right w:type="dxa" w:w="60"/>
-            </w:tcMar>
-          </w:tcPr>
-          <w:p>
-            <w:pPr>
-              <w:spacing w:after="0"/>
-            </w:pPr>
-            <w:r>
-              <w:rPr>
-                <w:sz w:val="17"/>
-                <w:szCs w:val="17"/>
-              </w:rPr>
-              <w:t xml:space="preserve">Zuordnung Waffen 5.17</w:t>
+              <w:t xml:space="preserve">slm 17</w:t>
+            </w:r>
+          </w:p>
+        </w:tc>
+        <w:tc>
+          <w:tcPr>
+            <w:tcMar>
+              <w:top w:type="dxa" w:w="20"/>
+              <w:left w:type="dxa" w:w="60"/>
+              <w:bottom w:type="dxa" w:w="20"/>
+              <w:right w:type="dxa" w:w="60"/>
+            </w:tcMar>
+          </w:tcPr>
+          <w:p>
+            <w:pPr>
+              <w:spacing w:after="0"/>
+            </w:pPr>
+            <w:r>
+              <w:rPr>
+                <w:sz w:val="17"/>
+                <w:szCs w:val="17"/>
+              </w:rPr>
+              <w:t xml:space="preserve">Zuordnung Waffen 5.17 (Anzeige gemäss FAQ 52)</w:t>
             </w:r>
           </w:p>
         </w:tc>
@@ -4724,7 +5170,7 @@
                 <w:sz w:val="17"/>
                 <w:szCs w:val="17"/>
               </w:rPr>
-              <w:t xml:space="preserve">T (Datenmodell vorhanden; Zuordnungsmaske ausstehend)</w:t>
+              <w:t xml:space="preserve">P (Pflege über Import, slm 36)</w:t>
             </w:r>
           </w:p>
         </w:tc>
@@ -4751,7 +5197,7 @@
                 <w:sz w:val="17"/>
                 <w:szCs w:val="17"/>
               </w:rPr>
-              <w:t xml:space="preserve">slm 18</w:t>
+              <w:t xml:space="preserve">slm 18</w:t>
             </w:r>
           </w:p>
         </w:tc>
@@ -4844,7 +5290,7 @@
                 <w:sz w:val="17"/>
                 <w:szCs w:val="17"/>
               </w:rPr>
-              <w:t xml:space="preserve">slm 19</w:t>
+              <w:t xml:space="preserve">slm 19</w:t>
             </w:r>
           </w:p>
         </w:tc>
@@ -4910,7 +5356,7 @@
                 <w:sz w:val="17"/>
                 <w:szCs w:val="17"/>
               </w:rPr>
-              <w:t xml:space="preserve">T (JSON/WLR/Betriebsdaten vorhanden; direkter FGDB-Import ausstehend)</w:t>
+              <w:t xml:space="preserve">T (JSON, WLR, Betriebsdaten; FGDB über GDAL ausstehend)</w:t>
             </w:r>
           </w:p>
         </w:tc>
@@ -4937,29 +5383,29 @@
                 <w:sz w:val="17"/>
                 <w:szCs w:val="17"/>
               </w:rPr>
-              <w:t xml:space="preserve">slm 20</w:t>
-            </w:r>
-          </w:p>
-        </w:tc>
-        <w:tc>
-          <w:tcPr>
-            <w:tcMar>
-              <w:top w:type="dxa" w:w="20"/>
-              <w:left w:type="dxa" w:w="60"/>
-              <w:bottom w:type="dxa" w:w="20"/>
-              <w:right w:type="dxa" w:w="60"/>
-            </w:tcMar>
-          </w:tcPr>
-          <w:p>
-            <w:pPr>
-              <w:spacing w:after="0"/>
-            </w:pPr>
-            <w:r>
-              <w:rPr>
-                <w:sz w:val="17"/>
-                <w:szCs w:val="17"/>
-              </w:rPr>
-              <w:t xml:space="preserve">Berechnungen – Export 5.20 (GeoDB, alle Schusszahlen CSV)</w:t>
+              <w:t xml:space="preserve">slm 20</w:t>
+            </w:r>
+          </w:p>
+        </w:tc>
+        <w:tc>
+          <w:tcPr>
+            <w:tcMar>
+              <w:top w:type="dxa" w:w="20"/>
+              <w:left w:type="dxa" w:w="60"/>
+              <w:bottom w:type="dxa" w:w="20"/>
+              <w:right w:type="dxa" w:w="60"/>
+            </w:tcMar>
+          </w:tcPr>
+          <w:p>
+            <w:pPr>
+              <w:spacing w:after="0"/>
+            </w:pPr>
+            <w:r>
+              <w:rPr>
+                <w:sz w:val="17"/>
+                <w:szCs w:val="17"/>
+              </w:rPr>
+              <w:t xml:space="preserve">Berechnungen – Export 5.20 (GeoDB, Schusszahlen CSV)</w:t>
             </w:r>
           </w:p>
         </w:tc>
@@ -5003,7 +5449,7 @@
                 <w:sz w:val="17"/>
                 <w:szCs w:val="17"/>
               </w:rPr>
-              <w:t xml:space="preserve">T (Bündel, CSV vorhanden; GeoDB-Export ausstehend)</w:t>
+              <w:t xml:space="preserve">T (Bündel JSON, CSV; GeoDB ausstehend)</w:t>
             </w:r>
           </w:p>
         </w:tc>
@@ -5030,29 +5476,29 @@
                 <w:sz w:val="17"/>
                 <w:szCs w:val="17"/>
               </w:rPr>
-              <w:t xml:space="preserve">slm 21</w:t>
-            </w:r>
-          </w:p>
-        </w:tc>
-        <w:tc>
-          <w:tcPr>
-            <w:tcMar>
-              <w:top w:type="dxa" w:w="20"/>
-              <w:left w:type="dxa" w:w="60"/>
-              <w:bottom w:type="dxa" w:w="20"/>
-              <w:right w:type="dxa" w:w="60"/>
-            </w:tcMar>
-          </w:tcPr>
-          <w:p>
-            <w:pPr>
-              <w:spacing w:after="0"/>
-            </w:pPr>
-            <w:r>
-              <w:rPr>
-                <w:sz w:val="17"/>
-                <w:szCs w:val="17"/>
-              </w:rPr>
-              <w:t xml:space="preserve">Berechnungen – Details 5.21 (WLR, Betriebsdaten je Stellungsraum)</w:t>
+              <w:t xml:space="preserve">slm 21</w:t>
+            </w:r>
+          </w:p>
+        </w:tc>
+        <w:tc>
+          <w:tcPr>
+            <w:tcMar>
+              <w:top w:type="dxa" w:w="20"/>
+              <w:left w:type="dxa" w:w="60"/>
+              <w:bottom w:type="dxa" w:w="20"/>
+              <w:right w:type="dxa" w:w="60"/>
+            </w:tcMar>
+          </w:tcPr>
+          <w:p>
+            <w:pPr>
+              <w:spacing w:after="0"/>
+            </w:pPr>
+            <w:r>
+              <w:rPr>
+                <w:sz w:val="17"/>
+                <w:szCs w:val="17"/>
+              </w:rPr>
+              <w:t xml:space="preserve">Berechnungen – Details 5.21 (WLR, Betriebsdaten)</w:t>
             </w:r>
           </w:p>
         </w:tc>
@@ -5096,7 +5542,7 @@
                 <w:sz w:val="17"/>
                 <w:szCs w:val="17"/>
               </w:rPr>
-              <w:t xml:space="preserve">P</w:t>
+              <w:t xml:space="preserve">T (Maske vorhanden; Grundlage JSON statt FGDB)</w:t>
             </w:r>
           </w:p>
         </w:tc>
@@ -5123,7 +5569,7 @@
                 <w:sz w:val="17"/>
                 <w:szCs w:val="17"/>
               </w:rPr>
-              <w:t xml:space="preserve">slm 22</w:t>
+              <w:t xml:space="preserve">slm 22</w:t>
             </w:r>
           </w:p>
         </w:tc>
@@ -5216,7 +5662,7 @@
                 <w:sz w:val="17"/>
                 <w:szCs w:val="17"/>
               </w:rPr>
-              <w:t xml:space="preserve">slm 23</w:t>
+              <w:t xml:space="preserve">slm 23</w:t>
             </w:r>
           </w:p>
         </w:tc>
@@ -5309,7 +5755,7 @@
                 <w:sz w:val="17"/>
                 <w:szCs w:val="17"/>
               </w:rPr>
-              <w:t xml:space="preserve">slm 24</w:t>
+              <w:t xml:space="preserve">slm 24</w:t>
             </w:r>
           </w:p>
         </w:tc>
@@ -5402,7 +5848,7 @@
                 <w:sz w:val="17"/>
                 <w:szCs w:val="17"/>
               </w:rPr>
-              <w:t xml:space="preserve">slm 25</w:t>
+              <w:t xml:space="preserve">slm 25</w:t>
             </w:r>
           </w:p>
         </w:tc>
@@ -5495,7 +5941,7 @@
                 <w:sz w:val="17"/>
                 <w:szCs w:val="17"/>
               </w:rPr>
-              <w:t xml:space="preserve">slm 26</w:t>
+              <w:t xml:space="preserve">slm 26</w:t>
             </w:r>
           </w:p>
         </w:tc>
@@ -5561,7 +6007,7 @@
                 <w:sz w:val="17"/>
                 <w:szCs w:val="17"/>
               </w:rPr>
-              <w:t xml:space="preserve">T (Benutzerverwaltung vorhanden; Platz-Zuordnung, Rechte-Schaltflächen ausstehend)</w:t>
+              <w:t xml:space="preserve">T (Benutzer, Rollen; Platz-Zuordnung in der Maske ausstehend)</w:t>
             </w:r>
           </w:p>
         </w:tc>
@@ -5588,29 +6034,29 @@
                 <w:sz w:val="17"/>
                 <w:szCs w:val="17"/>
               </w:rPr>
-              <w:t xml:space="preserve">slm 27</w:t>
-            </w:r>
-          </w:p>
-        </w:tc>
-        <w:tc>
-          <w:tcPr>
-            <w:tcMar>
-              <w:top w:type="dxa" w:w="20"/>
-              <w:left w:type="dxa" w:w="60"/>
-              <w:bottom w:type="dxa" w:w="20"/>
-              <w:right w:type="dxa" w:w="60"/>
-            </w:tcMar>
-          </w:tcPr>
-          <w:p>
-            <w:pPr>
-              <w:spacing w:after="0"/>
-            </w:pPr>
-            <w:r>
-              <w:rPr>
-                <w:sz w:val="17"/>
-                <w:szCs w:val="17"/>
-              </w:rPr>
-              <w:t xml:space="preserve">Erweiterte Konfiguration 5.28 (Sperrdatum, Handbuch, Ampel-Schwellen)</w:t>
+              <w:t xml:space="preserve">slm 27</w:t>
+            </w:r>
+          </w:p>
+        </w:tc>
+        <w:tc>
+          <w:tcPr>
+            <w:tcMar>
+              <w:top w:type="dxa" w:w="20"/>
+              <w:left w:type="dxa" w:w="60"/>
+              <w:bottom w:type="dxa" w:w="20"/>
+              <w:right w:type="dxa" w:w="60"/>
+            </w:tcMar>
+          </w:tcPr>
+          <w:p>
+            <w:pPr>
+              <w:spacing w:after="0"/>
+            </w:pPr>
+            <w:r>
+              <w:rPr>
+                <w:sz w:val="17"/>
+                <w:szCs w:val="17"/>
+              </w:rPr>
+              <w:t xml:space="preserve">Erweiterte Konfiguration 5.28</w:t>
             </w:r>
           </w:p>
         </w:tc>
@@ -5654,7 +6100,7 @@
                 <w:sz w:val="17"/>
                 <w:szCs w:val="17"/>
               </w:rPr>
-              <w:t xml:space="preserve">Z</w:t>
+              <w:t xml:space="preserve">P (Sperrdatum, Handbuch, Schwellen dB / %, Farben)</w:t>
             </w:r>
           </w:p>
         </w:tc>
@@ -5681,7 +6127,7 @@
                 <w:sz w:val="17"/>
                 <w:szCs w:val="17"/>
               </w:rPr>
-              <w:t xml:space="preserve">slm 28</w:t>
+              <w:t xml:space="preserve">slm 28</w:t>
             </w:r>
           </w:p>
         </w:tc>
@@ -5747,7 +6193,7 @@
                 <w:sz w:val="17"/>
                 <w:szCs w:val="17"/>
               </w:rPr>
-              <w:t xml:space="preserve">T (Modell vorhanden; GET-Endpunkt ausstehend)</w:t>
+              <w:t xml:space="preserve">Z (Datenmodell vorhanden)</w:t>
             </w:r>
           </w:p>
         </w:tc>
@@ -5774,29 +6220,29 @@
                 <w:sz w:val="17"/>
                 <w:szCs w:val="17"/>
               </w:rPr>
-              <w:t xml:space="preserve">slm 29</w:t>
-            </w:r>
-          </w:p>
-        </w:tc>
-        <w:tc>
-          <w:tcPr>
-            <w:tcMar>
-              <w:top w:type="dxa" w:w="20"/>
-              <w:left w:type="dxa" w:w="60"/>
-              <w:bottom w:type="dxa" w:w="20"/>
-              <w:right w:type="dxa" w:w="60"/>
-            </w:tcMar>
-          </w:tcPr>
-          <w:p>
-            <w:pPr>
-              <w:spacing w:after="0"/>
-            </w:pPr>
-            <w:r>
-              <w:rPr>
-                <w:sz w:val="17"/>
-                <w:szCs w:val="17"/>
-              </w:rPr>
-              <w:t xml:space="preserve">ELO-Schnittstelle: Nutzung melden (POST) mit Validierung</w:t>
+              <w:t xml:space="preserve">slm 29</w:t>
+            </w:r>
+          </w:p>
+        </w:tc>
+        <w:tc>
+          <w:tcPr>
+            <w:tcMar>
+              <w:top w:type="dxa" w:w="20"/>
+              <w:left w:type="dxa" w:w="60"/>
+              <w:bottom w:type="dxa" w:w="20"/>
+              <w:right w:type="dxa" w:w="60"/>
+            </w:tcMar>
+          </w:tcPr>
+          <w:p>
+            <w:pPr>
+              <w:spacing w:after="0"/>
+            </w:pPr>
+            <w:r>
+              <w:rPr>
+                <w:sz w:val="17"/>
+                <w:szCs w:val="17"/>
+              </w:rPr>
+              <w:t xml:space="preserve">ELO-Schnittstelle: Nutzung melden (POST)</w:t>
             </w:r>
           </w:p>
         </w:tc>
@@ -5840,7 +6286,7 @@
                 <w:sz w:val="17"/>
                 <w:szCs w:val="17"/>
               </w:rPr>
-              <w:t xml:space="preserve">T (Validierungsregeln vorhanden; POST-Endpunkt ausstehend)</w:t>
+              <w:t xml:space="preserve">Z (Validierungsregeln vorhanden)</w:t>
             </w:r>
           </w:p>
         </w:tc>
@@ -5867,7 +6313,7 @@
                 <w:sz w:val="17"/>
                 <w:szCs w:val="17"/>
               </w:rPr>
-              <w:t xml:space="preserve">slm 30</w:t>
+              <w:t xml:space="preserve">slm 30</w:t>
             </w:r>
           </w:p>
         </w:tc>
@@ -5960,7 +6406,7 @@
                 <w:sz w:val="17"/>
                 <w:szCs w:val="17"/>
               </w:rPr>
-              <w:t xml:space="preserve">slm 31</w:t>
+              <w:t xml:space="preserve">slm 31</w:t>
             </w:r>
           </w:p>
         </w:tc>
@@ -6053,7 +6499,7 @@
                 <w:sz w:val="17"/>
                 <w:szCs w:val="17"/>
               </w:rPr>
-              <w:t xml:space="preserve">slm 32</w:t>
+              <w:t xml:space="preserve">slm 32</w:t>
             </w:r>
           </w:p>
         </w:tc>
@@ -6119,7 +6565,7 @@
                 <w:sz w:val="17"/>
                 <w:szCs w:val="17"/>
               </w:rPr>
-              <w:t xml:space="preserve">P (Gewichte aus den Quelldaten des Zustands)</w:t>
+              <w:t xml:space="preserve">P</w:t>
             </w:r>
           </w:p>
         </w:tc>
@@ -6146,7 +6592,7 @@
                 <w:sz w:val="17"/>
                 <w:szCs w:val="17"/>
               </w:rPr>
-              <w:t xml:space="preserve">slm 33</w:t>
+              <w:t xml:space="preserve">slm 33</w:t>
             </w:r>
           </w:p>
         </w:tc>
@@ -6212,7 +6658,7 @@
                 <w:sz w:val="17"/>
                 <w:szCs w:val="17"/>
               </w:rPr>
-              <w:t xml:space="preserve">T (A7X verbindlich; E8-Abweichung im Anwendungsstandard offen, 4.3)</w:t>
+              <w:t xml:space="preserve">P (nach A9X/A7X, Kernversion 1.4.0)</w:t>
             </w:r>
           </w:p>
         </w:tc>
@@ -6239,7 +6685,7 @@
                 <w:sz w:val="17"/>
                 <w:szCs w:val="17"/>
               </w:rPr>
-              <w:t xml:space="preserve">slm 34</w:t>
+              <w:t xml:space="preserve">slm 34</w:t>
             </w:r>
           </w:p>
         </w:tc>
@@ -6332,7 +6778,7 @@
                 <w:sz w:val="17"/>
                 <w:szCs w:val="17"/>
               </w:rPr>
-              <w:t xml:space="preserve">slm 35</w:t>
+              <w:t xml:space="preserve">slm 35</w:t>
             </w:r>
           </w:p>
         </w:tc>
@@ -6398,7 +6844,7 @@
                 <w:sz w:val="17"/>
                 <w:szCs w:val="17"/>
               </w:rPr>
-              <w:t xml:space="preserve">T (Rollen/MFA-Grundlagen vorhanden; 2FA in Demo inaktiv, Rollen-/MFA-E2E offen; TOTP ausstehend)</w:t>
+              <w:t xml:space="preserve">T (Rollen, Matrix, 2FA per E-Mail-Code; TOTP ausstehend)</w:t>
             </w:r>
           </w:p>
         </w:tc>
@@ -6425,7 +6871,7 @@
                 <w:sz w:val="17"/>
                 <w:szCs w:val="17"/>
               </w:rPr>
-              <w:t xml:space="preserve">slm 36</w:t>
+              <w:t xml:space="preserve">slm 36</w:t>
             </w:r>
           </w:p>
         </w:tc>
@@ -6518,7 +6964,7 @@
                 <w:sz w:val="17"/>
                 <w:szCs w:val="17"/>
               </w:rPr>
-              <w:t xml:space="preserve">slm 37</w:t>
+              <w:t xml:space="preserve">slm 37</w:t>
             </w:r>
           </w:p>
         </w:tc>
@@ -6611,7 +7057,7 @@
                 <w:sz w:val="17"/>
                 <w:szCs w:val="17"/>
               </w:rPr>
-              <w:t xml:space="preserve">slm 38</w:t>
+              <w:t xml:space="preserve">slm 38</w:t>
             </w:r>
           </w:p>
         </w:tc>
@@ -6677,7 +7123,7 @@
                 <w:sz w:val="17"/>
                 <w:szCs w:val="17"/>
               </w:rPr>
-              <w:t xml:space="preserve">Z</w:t>
+              <w:t xml:space="preserve">Z (Geometrien heute als Text)</w:t>
             </w:r>
           </w:p>
         </w:tc>
@@ -6704,7 +7150,7 @@
                 <w:sz w:val="17"/>
                 <w:szCs w:val="17"/>
               </w:rPr>
-              <w:t xml:space="preserve">slm 39</w:t>
+              <w:t xml:space="preserve">slm 39</w:t>
             </w:r>
           </w:p>
         </w:tc>
@@ -6770,7 +7216,7 @@
                 <w:sz w:val="17"/>
                 <w:szCs w:val="17"/>
               </w:rPr>
-              <w:t xml:space="preserve">T (einzelne Exporte vorhanden; CSV für alle Exporte ausstehend)</w:t>
+              <w:t xml:space="preserve">T (einzelne Exporte; übrige ausstehend)</w:t>
             </w:r>
           </w:p>
         </w:tc>
@@ -6797,7 +7243,7 @@
                 <w:sz w:val="17"/>
                 <w:szCs w:val="17"/>
               </w:rPr>
-              <w:t xml:space="preserve">slm 40</w:t>
+              <w:t xml:space="preserve">slm 40</w:t>
             </w:r>
           </w:p>
         </w:tc>
@@ -6863,7 +7309,7 @@
                 <w:sz w:val="17"/>
                 <w:szCs w:val="17"/>
               </w:rPr>
-              <w:t xml:space="preserve">Z</w:t>
+              <w:t xml:space="preserve">Z (CSV in eigener Struktur vorhanden)</w:t>
             </w:r>
           </w:p>
         </w:tc>
@@ -6890,7 +7336,7 @@
                 <w:sz w:val="17"/>
                 <w:szCs w:val="17"/>
               </w:rPr>
-              <w:t xml:space="preserve">slm 41</w:t>
+              <w:t xml:space="preserve">slm 41</w:t>
             </w:r>
           </w:p>
         </w:tc>
@@ -6983,7 +7429,7 @@
                 <w:sz w:val="17"/>
                 <w:szCs w:val="17"/>
               </w:rPr>
-              <w:t xml:space="preserve">slm 42</w:t>
+              <w:t xml:space="preserve">slm 42</w:t>
             </w:r>
           </w:p>
         </w:tc>
@@ -7076,29 +7522,29 @@
                 <w:sz w:val="17"/>
                 <w:szCs w:val="17"/>
               </w:rPr>
-              <w:t xml:space="preserve">slm 43</w:t>
-            </w:r>
-          </w:p>
-        </w:tc>
-        <w:tc>
-          <w:tcPr>
-            <w:tcMar>
-              <w:top w:type="dxa" w:w="20"/>
-              <w:left w:type="dxa" w:w="60"/>
-              <w:bottom w:type="dxa" w:w="20"/>
-              <w:right w:type="dxa" w:w="60"/>
-            </w:tcMar>
-          </w:tcPr>
-          <w:p>
-            <w:pPr>
-              <w:spacing w:after="0"/>
-            </w:pPr>
-            <w:r>
-              <w:rPr>
-                <w:sz w:val="17"/>
-                <w:szCs w:val="17"/>
-              </w:rPr>
-              <w:t xml:space="preserve">Berechnungsstruktur je Immissionsberechnung/Zustand (ZustandsID)</w:t>
+              <w:t xml:space="preserve">slm 43</w:t>
+            </w:r>
+          </w:p>
+        </w:tc>
+        <w:tc>
+          <w:tcPr>
+            <w:tcMar>
+              <w:top w:type="dxa" w:w="20"/>
+              <w:left w:type="dxa" w:w="60"/>
+              <w:bottom w:type="dxa" w:w="20"/>
+              <w:right w:type="dxa" w:w="60"/>
+            </w:tcMar>
+          </w:tcPr>
+          <w:p>
+            <w:pPr>
+              <w:spacing w:after="0"/>
+            </w:pPr>
+            <w:r>
+              <w:rPr>
+                <w:sz w:val="17"/>
+                <w:szCs w:val="17"/>
+              </w:rPr>
+              <w:t xml:space="preserve">Berechnungsstruktur je Immissionsberechnung/Zustand</w:t>
             </w:r>
           </w:p>
         </w:tc>
@@ -7169,7 +7615,7 @@
                 <w:sz w:val="17"/>
                 <w:szCs w:val="17"/>
               </w:rPr>
-              <w:t xml:space="preserve">slm 44</w:t>
+              <w:t xml:space="preserve">slm 44</w:t>
             </w:r>
           </w:p>
         </w:tc>
@@ -7235,7 +7681,7 @@
                 <w:sz w:val="17"/>
                 <w:szCs w:val="17"/>
               </w:rPr>
-              <w:t xml:space="preserve">P (Berechnungslauf P)</w:t>
+              <w:t xml:space="preserve">P</w:t>
             </w:r>
           </w:p>
         </w:tc>
@@ -7262,7 +7708,7 @@
                 <w:sz w:val="17"/>
                 <w:szCs w:val="17"/>
               </w:rPr>
-              <w:t xml:space="preserve">slm 45</w:t>
+              <w:t xml:space="preserve">slm 45</w:t>
             </w:r>
           </w:p>
         </w:tc>
@@ -7355,7 +7801,7 @@
                 <w:sz w:val="17"/>
                 <w:szCs w:val="17"/>
               </w:rPr>
-              <w:t xml:space="preserve">slm 46</w:t>
+              <w:t xml:space="preserve">slm 46</w:t>
             </w:r>
           </w:p>
         </w:tc>
@@ -7448,7 +7894,7 @@
                 <w:sz w:val="17"/>
                 <w:szCs w:val="17"/>
               </w:rPr>
-              <w:t xml:space="preserve">slm 47</w:t>
+              <w:t xml:space="preserve">slm 47</w:t>
             </w:r>
           </w:p>
         </w:tc>
@@ -7541,7 +7987,7 @@
                 <w:sz w:val="17"/>
                 <w:szCs w:val="17"/>
               </w:rPr>
-              <w:t xml:space="preserve">slm 48</w:t>
+              <w:t xml:space="preserve">slm 48</w:t>
             </w:r>
           </w:p>
         </w:tc>
@@ -7634,7 +8080,7 @@
                 <w:sz w:val="17"/>
                 <w:szCs w:val="17"/>
               </w:rPr>
-              <w:t xml:space="preserve">slm 49</w:t>
+              <w:t xml:space="preserve">slm 49</w:t>
             </w:r>
           </w:p>
         </w:tc>
@@ -7727,29 +8173,29 @@
                 <w:sz w:val="17"/>
                 <w:szCs w:val="17"/>
               </w:rPr>
-              <w:t xml:space="preserve">slm 50</w:t>
-            </w:r>
-          </w:p>
-        </w:tc>
-        <w:tc>
-          <w:tcPr>
-            <w:tcMar>
-              <w:top w:type="dxa" w:w="20"/>
-              <w:left w:type="dxa" w:w="60"/>
-              <w:bottom w:type="dxa" w:w="20"/>
-              <w:right w:type="dxa" w:w="60"/>
-            </w:tcMar>
-          </w:tcPr>
-          <w:p>
-            <w:pPr>
-              <w:spacing w:after="0"/>
-            </w:pPr>
-            <w:r>
-              <w:rPr>
-                <w:sz w:val="17"/>
-                <w:szCs w:val="17"/>
-              </w:rPr>
-              <w:t xml:space="preserve">Persistente Einstellungen, Favoriten, Ausblenden nicht autorisierter Funktionen</w:t>
+              <w:t xml:space="preserve">slm 50</w:t>
+            </w:r>
+          </w:p>
+        </w:tc>
+        <w:tc>
+          <w:tcPr>
+            <w:tcMar>
+              <w:top w:type="dxa" w:w="20"/>
+              <w:left w:type="dxa" w:w="60"/>
+              <w:bottom w:type="dxa" w:w="20"/>
+              <w:right w:type="dxa" w:w="60"/>
+            </w:tcMar>
+          </w:tcPr>
+          <w:p>
+            <w:pPr>
+              <w:spacing w:after="0"/>
+            </w:pPr>
+            <w:r>
+              <w:rPr>
+                <w:sz w:val="17"/>
+                <w:szCs w:val="17"/>
+              </w:rPr>
+              <w:t xml:space="preserve">Persistente Einstellungen, Favoriten, Rechte in der Oberfläche</w:t>
             </w:r>
           </w:p>
         </w:tc>
@@ -7793,7 +8239,7 @@
                 <w:sz w:val="17"/>
                 <w:szCs w:val="17"/>
               </w:rPr>
-              <w:t xml:space="preserve">T (Lesezeichen vorhanden; vollständige Persistenz-/Rechte-Nachweise ausstehend)</w:t>
+              <w:t xml:space="preserve">T (Lesezeichen, Menü nach Rechten; Persistenz je Benutzer ausstehend)</w:t>
             </w:r>
           </w:p>
         </w:tc>
@@ -7820,7 +8266,7 @@
                 <w:sz w:val="17"/>
                 <w:szCs w:val="17"/>
               </w:rPr>
-              <w:t xml:space="preserve">slm 51</w:t>
+              <w:t xml:space="preserve">slm 51</w:t>
             </w:r>
           </w:p>
         </w:tc>
@@ -7886,7 +8332,7 @@
                 <w:sz w:val="17"/>
                 <w:szCs w:val="17"/>
               </w:rPr>
-              <w:t xml:space="preserve">T (Tabellen und Teile der Spalten deutsch; übrige Spalten ausstehend)</w:t>
+              <w:t xml:space="preserve">T (Tabellen, Teil der Spalten; übrige Spalten ausstehend)</w:t>
             </w:r>
           </w:p>
         </w:tc>
@@ -7913,7 +8359,7 @@
                 <w:sz w:val="17"/>
                 <w:szCs w:val="17"/>
               </w:rPr>
-              <w:t xml:space="preserve">slm 52</w:t>
+              <w:t xml:space="preserve">slm 52</w:t>
             </w:r>
           </w:p>
         </w:tc>
@@ -7979,7 +8425,7 @@
                 <w:sz w:val="17"/>
                 <w:szCs w:val="17"/>
               </w:rPr>
-              <w:t xml:space="preserve">T (UI-Grundlagen vorhanden; Barrierefreiheitsnachweis ausstehend)</w:t>
+              <w:t xml:space="preserve">T (UI-Grundlagen; Nachweis WCAG 2.1 AA ausstehend)</w:t>
             </w:r>
           </w:p>
         </w:tc>
@@ -8006,7 +8452,7 @@
                 <w:sz w:val="17"/>
                 <w:szCs w:val="17"/>
               </w:rPr>
-              <w:t xml:space="preserve">slm 53</w:t>
+              <w:t xml:space="preserve">slm 53</w:t>
             </w:r>
           </w:p>
         </w:tc>
@@ -8072,7 +8518,7 @@
                 <w:sz w:val="17"/>
                 <w:szCs w:val="17"/>
               </w:rPr>
-              <w:t xml:space="preserve">Z</w:t>
+              <w:t xml:space="preserve">P (Hilfe je Seite, F1, Online-Hilfe; Handbuch-Inhalt ausstehend)</w:t>
             </w:r>
           </w:p>
         </w:tc>
@@ -8099,7 +8545,7 @@
                 <w:sz w:val="17"/>
                 <w:szCs w:val="17"/>
               </w:rPr>
-              <w:t xml:space="preserve">slm 54</w:t>
+              <w:t xml:space="preserve">slm 54</w:t>
             </w:r>
           </w:p>
         </w:tc>
@@ -8165,7 +8611,7 @@
                 <w:sz w:val="17"/>
                 <w:szCs w:val="17"/>
               </w:rPr>
-              <w:t xml:space="preserve">T (Kernmessung vorhanden; Lasttest und Ressourcenisolation ausstehend)</w:t>
+              <w:t xml:space="preserve">T (Kernmessung; Lasttest, Worker ausstehend)</w:t>
             </w:r>
           </w:p>
         </w:tc>
@@ -8192,7 +8638,7 @@
                 <w:sz w:val="17"/>
                 <w:szCs w:val="17"/>
               </w:rPr>
-              <w:t xml:space="preserve">slm 55</w:t>
+              <w:t xml:space="preserve">slm 55</w:t>
             </w:r>
           </w:p>
         </w:tc>
@@ -8258,7 +8704,7 @@
                 <w:sz w:val="17"/>
                 <w:szCs w:val="17"/>
               </w:rPr>
-              <w:t xml:space="preserve">T (Architektur, Rollen, i18n vorhanden; Fachparameter-Konfiguration ausstehend)</w:t>
+              <w:t xml:space="preserve">T (Rollen, Listen, Schwellen; Grenzwerte, Feiertage ausstehend)</w:t>
             </w:r>
           </w:p>
         </w:tc>
@@ -8285,7 +8731,7 @@
                 <w:sz w:val="17"/>
                 <w:szCs w:val="17"/>
               </w:rPr>
-              <w:t xml:space="preserve">slm 56</w:t>
+              <w:t xml:space="preserve">slm 56</w:t>
             </w:r>
           </w:p>
         </w:tc>
@@ -8351,7 +8797,7 @@
                 <w:sz w:val="17"/>
                 <w:szCs w:val="17"/>
               </w:rPr>
-              <w:t xml:space="preserve">T (Auth-/Logging-Grundlagen vorhanden; MFA-Gesamtnachweis und Break-Glass-Prozess ausstehend)</w:t>
+              <w:t xml:space="preserve">T (Auth, Logbuch; MFA-Nachweis, Break-Glass-Prozess ausstehend)</w:t>
             </w:r>
           </w:p>
         </w:tc>
@@ -8378,7 +8824,7 @@
                 <w:sz w:val="17"/>
                 <w:szCs w:val="17"/>
               </w:rPr>
-              <w:t xml:space="preserve">slm 57</w:t>
+              <w:t xml:space="preserve">slm 57</w:t>
             </w:r>
           </w:p>
         </w:tc>

</xml_diff>

<commit_message>
Update help topic item counts and revise project documentation for earlier product delivery schedule
- Adjust e2e and unit tests to reflect updated help topic item counts (`HELP.topic` from 5 to 6, `querySelectorAll('li')` from 5 to 7).
- Modify solution concept and project plan documentation to reflect earlier project milestones, including March 2028 delivery (three months ahead of deadline).
- Update associated test counts and timelines accordingly.
</commit_message>
<xml_diff>
--- a/docs/anforderungskatalog/C2-Loesungskonzept-SLIM.docx
+++ b/docs/anforderungskatalog/C2-Loesungskonzept-SLIM.docx
@@ -117,7 +117,7 @@
         <w:t xml:space="preserve">Geringeres Umsetzungsrisiko.</w:t>
       </w:r>
       <w:r>
-        <w:t xml:space="preserve"> Das Konzept stützt sich auf einen lauffähigen Prototyp (MVP): Fachmasken, Datenverwaltung, Kartenviewer, das Datenmodell nach B1 Kapitel 10 und der gegen die Empa-Referenzwerte der Beilage B1.4 geprüfte Berechnungskern sind umgesetzt und automatisiert getestet; der Stand je Anforderung steht in der Matrix. Die Entwicklerin hat zudem ELO entwickelt und kennt die Fachdomäne und beide Seiten der Schnittstelle. Deshalb wird LP1a mit einem Maximalaufwand von 2'800 statt 4'000 Stunden angeboten.</w:t>
+        <w:t xml:space="preserve"> Das Konzept stützt sich auf einen lauffähigen Prototyp (MVP): Fachmasken, Datenverwaltung, Kartenviewer, das Datenmodell nach B1 Kapitel 10 und der gegen die Empa-Referenzwerte der Beilage B1.4 geprüfte Berechnungskern sind umgesetzt und automatisiert getestet; der Stand je Anforderung steht in der Matrix. Die Entwicklerin hat zudem ELO entwickelt und kennt die Fachdomäne und beide Seiten der Schnittstelle. Deshalb wird LP1a mit einem Maximalaufwand von 2'800 statt 4'000 Stunden angeboten, und der Projektplan sieht die produktive Einführung im März 2028 vor, drei Monate vor dem vertraglichen Termin; geschult wird durch die Trainer von ongoing.</w:t>
       </w:r>
     </w:p>
     <w:p>
@@ -2818,7 +2818,7 @@
         <w:spacing w:after="120"/>
       </w:pPr>
       <w:r>
-        <w:t xml:space="preserve">Monorepo mit getrennten Modulen (Stammdaten, Nutzungen, Berechnung, Datenverwaltung, Import/Export, Benutzer/Rollen, Logbuch), generiertem API-Vertrag und automatisch dokumentiertem Datenmodell; Fachparameter (Rollen, Rechte, Auswahllisten, Grenzwerte, Ampelschwellen, Rundung, Sperrdatum, Feiertage, Kartenlayer) sind Konfiguration ohne Rekompilierung; neue Masken entstehen aus Design System, Facade und generiertem Client. Qualitätssicherung in jedem Build (Stand 02.10.2026, alle bestanden): Lint; 422 API-Tests (Berechnungskern gegen B1.4, Rechenfälle, Service- und HTTP-Tests je Controller mit Rechtematrix); 232 Oberflächen-Tests; 27 Tests der Kartenbibliothek; dazu End-to-End-Fälle (Playwright) für Anmeldung, Startseite, Schiessplatz-Masken und Datenverwaltung sowie Kriterien-Fälle je B1-Anforderung als Skelett mit Prüfschritten, die mit der jeweiligen Maske automatisiert werden. </w:t>
+        <w:t xml:space="preserve">Monorepo mit getrennten Modulen (Stammdaten, Nutzungen, Berechnung, Datenverwaltung, Import/Export, Benutzer/Rollen, Logbuch), generiertem API-Vertrag und automatisch dokumentiertem Datenmodell; Fachparameter (Rollen, Rechte, Auswahllisten, Grenzwerte, Ampelschwellen, Rundung, Sperrdatum, Feiertage, Kartenlayer) sind Konfiguration ohne Rekompilierung; neue Masken entstehen aus Design System, Facade und generiertem Client. Qualitätssicherung in jedem Build (Stand 02.10.2026, alle bestanden): Lint; 426 API-Tests (Berechnungskern gegen B1.4, Rechenfälle, Service- und HTTP-Tests je Controller mit Rechtematrix); 233 Oberflächen-Tests; 27 Tests der Kartenbibliothek; dazu End-to-End-Fälle (Playwright) für Anmeldung, Startseite, Schiessplatz-Masken und Datenverwaltung sowie Kriterien-Fälle je B1-Anforderung als Skelett mit Prüfschritten, die mit der jeweiligen Maske automatisiert werden. </w:t>
       </w:r>
       <w:r>
         <w:rPr>

</xml_diff>

<commit_message>
Remove analysis documents: codebase review and advanced testing notes (2026-09-13).
</commit_message>
<xml_diff>
--- a/docs/anforderungskatalog/C2-Loesungskonzept-SLIM.docx
+++ b/docs/anforderungskatalog/C2-Loesungskonzept-SLIM.docx
@@ -102,7 +102,7 @@
         <w:t xml:space="preserve">Anbieterorganisation.</w:t>
       </w:r>
       <w:r>
-        <w:t xml:space="preserve"> Generalunternehmerin und alleinige Vertragspartnerin ist ongoing; sie verantwortet Betrieb, Support und Schulung. [OFFEN: Firmenname Entwicklerin] (nachfolgend «Entwicklerin») ist als spezialisierte Technologiepartnerin und Subunternehmerin verbindlich für die Entwicklung eingebunden (LP1 und LP5).</w:t>
+        <w:t xml:space="preserve"> Generalunternehmerin und alleinige Vertragspartnerin ist [PLATZHALTER FIRMA]; sie verantwortet Betrieb, Support und Schulung. [OFFEN: Firmenname Technologiepartnerin] (nachfolgend «Technologiepartnerin») ist als spezialisierte Subunternehmerin verbindlich für die Entwicklung eingebunden (LP1 und LP5). «Entwicklerin» im Sinne des Rahmenvertrags ist [PLATZHALTER FIRMA] als Vertragspartnerin der Bestellerin.</w:t>
       </w:r>
     </w:p>
     <w:p>
@@ -117,7 +117,7 @@
         <w:t xml:space="preserve">Geringeres Umsetzungsrisiko.</w:t>
       </w:r>
       <w:r>
-        <w:t xml:space="preserve"> Das Konzept stützt sich auf einen lauffähigen Prototyp (MVP): Fachmasken, Datenverwaltung, Kartenviewer, das Datenmodell nach B1 Kapitel 10 und der gegen die Empa-Referenzwerte der Beilage B1.4 geprüfte Berechnungskern sind umgesetzt und automatisiert getestet; der Stand je Anforderung steht in der Matrix. Die Entwicklerin hat zudem ELO entwickelt und kennt die Fachdomäne und beide Seiten der Schnittstelle. Deshalb wird LP1a mit einem Maximalaufwand von 2'800 statt 4'000 Stunden angeboten, und der Projektplan sieht die produktive Einführung im März 2028 vor, drei Monate vor dem vertraglichen Termin; geschult wird durch die Trainer von ongoing.</w:t>
+        <w:t xml:space="preserve"> Das Konzept stützt sich auf einen lauffähigen Prototyp (MVP): Fachmasken, Datenverwaltung, Kartenviewer, das Datenmodell nach B1 Kapitel 10 und der gegen die Empa-Referenzwerte der Beilage B1.4 geprüfte Berechnungskern sind umgesetzt und automatisiert getestet; der Stand je Anforderung steht in der Matrix. Die Technologiepartnerin hat zudem ELO entwickelt und kennt die Fachdomäne und beide Seiten der Schnittstelle. Deshalb wird LP1a mit einem Maximalaufwand von 2'800 statt 4'000 Stunden angeboten, und der Projektplan sieht die produktive Einführung im März 2028 vor, drei Monate vor dem vertraglichen Termin; geschult wird durch die Trainer von [PLATZHALTER FIRMA].</w:t>
       </w:r>
     </w:p>
     <w:p>
@@ -676,7 +676,7 @@
         <w:t xml:space="preserve">Vorbestehende Rechte und Nutzungsrechte.</w:t>
       </w:r>
       <w:r>
-        <w:t xml:space="preserve"> (1) Open-Source-Komponenten: Angular 22, NestJS 12, TypeORM 0.3, ExcelJS 4 (MIT), OpenLayers (BSD-2), GDAL ≥ 3.8 (MIT), PostgreSQL 17 (PostgreSQL-Lizenz), PostGIS 3.5 (GPL, nur als Datenbankdienst) – ohne Copyleft-Wirkung auf SLIM; die Lizenzliste mit Versionen ist Teil der SBOM jedes Releases. (2) Vorbestehende Rechte der Entwicklerin: die Plattformbibliotheken </w:t>
+        <w:t xml:space="preserve"> (1) Open-Source-Komponenten: Angular 22, NestJS 12, TypeORM 0.3, ExcelJS 4 (MIT), OpenLayers (BSD-2), GDAL ≥ 3.8 (MIT), PostgreSQL 17 (PostgreSQL-Lizenz), PostGIS 3.5 (GPL, nur als Datenbankdienst) – ohne Copyleft-Wirkung auf SLIM; die Lizenzliste mit Versionen ist Teil der SBOM jedes Releases. (2) Vorbestehende Rechte: die Plattformbibliotheken </w:t>
       </w:r>
       <w:r>
         <w:rPr>
@@ -688,7 +688,7 @@
         <w:t xml:space="preserve">@app-galaxy/*</w:t>
       </w:r>
       <w:r>
-        <w:t xml:space="preserve"> (Authentifizierung, Mandanten, Rollen, Rule-Engine, Übersetzung, Setup) und der Prototyp (MVP) in seinem Stand vor Inkrafttreten des Rahmenvertrags. Das Eigentum an diesen Basiskomponenten verbleibt bei der Entwicklerin; die Auftraggeberin erhält daran das vertraglich verlangte, vollständige und unentgeltliche Nutzungsrecht gemäss Art. 6.2.4 des Rahmenvertrags, den Quellcode als Teil der Lieferung (Art. 2.9.1) und die Kennzeichnung als vorbestehend in der SBOM (Art. 4.3.1; FAQ 97, 138, 170). (3) Arbeitsergebnisse: Alle im Projekt erstellten Erweiterungen und Anpassungen gehen gemäss Art. 6.1.4 auf die Auftraggeberin über. Wartbarkeit durch Dritte: Standard-Stack, öffentliche Paketquellen, generierter API-Vertrag, dokumentiertes Datenmodell, automatisierte Tests und der Setup-Wizard erlauben einer anderen Firma die Übernahme; die galaxy-Bibliotheken werden mit Quellcode, Tests und Dokumentation geliefert.</w:t>
+        <w:t xml:space="preserve"> (Authentifizierung, Mandanten, Rollen, Rule-Engine, Übersetzung, Setup) und der Prototyp (MVP) in seinem Stand vor Inkrafttreten des Rahmenvertrags. Sie gehören der Technologiepartnerin, und das Eigentum an diesen Basiskomponenten verbleibt bei ihr. Die Technologiepartnerin räumt [PLATZHALTER FIRMA] die Rechte daran vertraglich ein; [PLATZHALTER FIRMA] gibt sie als Vertragspartnerin an die Auftraggeberin weiter. Die Auftraggeberin erhält daran das vertraglich verlangte, vollständige und unentgeltliche Nutzungsrecht gemäss Art. 6.2.4 des Rahmenvertrags, den Quellcode als Teil der Lieferung (Art. 2.9.1) und die Kennzeichnung als vorbestehend in der SBOM (Art. 4.3.1; FAQ 97, 138, 170). (3) Arbeitsergebnisse: Alle im Projekt erstellten Erweiterungen und Anpassungen gehen gemäss Art. 6.1.4 auf die Auftraggeberin über. Wartbarkeit durch Dritte: Standard-Stack, öffentliche Paketquellen, generierter API-Vertrag, dokumentiertes Datenmodell, automatisierte Tests und der Setup-Wizard erlauben einer anderen Firma die Übernahme; die galaxy-Bibliotheken werden mit Quellcode, Tests und Dokumentation geliefert.</w:t>
       </w:r>
     </w:p>
     <w:p>
@@ -972,7 +972,7 @@
         <w:spacing w:after="120"/>
       </w:pPr>
       <w:r>
-        <w:t xml:space="preserve">ongoing betreibt SLIM auf der Infrastruktur von [OFFEN: Hosting-Anbieter] in Schweizer Rechenzentren (reiner Infrastrukturanbieter gemäss FAQ 132, 140 und 180; Anforderungen: ISO 27001, IT-Grundschutz Si001). Sämtliche Applikations- und Projektdaten – alle Umgebungen, Sicherungen, Protokolle, Quellcode und Entwicklungsdaten – werden zu 100 % in der Schweiz gespeichert und bearbeitet; keine Kopie verlässt die Schweiz, auch nicht zu Sicherungszwecken (E1; Nachweis je System im Datenhaltungskonzept). Ein Wechsel des Hosting-Anbieters wird der Auftraggeberin zur Genehmigung vorgelegt. Drei getrennte Umgebungen (Entwicklung, Akzeptanz, Produktion) mit identischen Container-Images; NGINX terminiert TLS (≥ 1.2), liefert den Angular-Build und leitet </w:t>
+        <w:t xml:space="preserve">[PLATZHALTER FIRMA] betreibt SLIM auf der Infrastruktur von [OFFEN: Hosting-Anbieter] in Schweizer Rechenzentren (reiner Infrastrukturanbieter gemäss FAQ 132, 140 und 180; Anforderungen: ISO 27001, IT-Grundschutz Si001). Sämtliche Applikations- und Projektdaten – alle Umgebungen, Sicherungen, Protokolle, Quellcode und Entwicklungsdaten – werden zu 100 % in der Schweiz gespeichert und bearbeitet; keine Kopie verlässt die Schweiz, auch nicht zu Sicherungszwecken (E1; Nachweis je System im Datenhaltungskonzept). Ein Wechsel des Hosting-Anbieters wird der Auftraggeberin zur Genehmigung vorgelegt. Drei getrennte Umgebungen (Entwicklung, Akzeptanz, Produktion) mit identischen Container-Images; NGINX terminiert TLS (≥ 1.2), liefert den Angular-Build und leitet </w:t>
       </w:r>
       <w:r>
         <w:rPr>
@@ -1098,7 +1098,7 @@
         <w:t xml:space="preserve">Beide Seiten in einer Hand:</w:t>
       </w:r>
       <w:r>
-        <w:t xml:space="preserve"> Die Entwicklerin hat ELO auf demselben Technologie-Stack entwickelt und kennt Datenmodell und Fachbegriffe beider Systeme. Das senkt das Integrationsrisiko, ersetzt die Abstimmung aber nicht: Die Schnittstellenspezifikation (Felder, Codes, Fehlerfälle, Konten) wird zu Beginn mit der Auftraggeberin festgelegt und als OpenAPI-Dokument festgeschrieben (die ELO-seitige Spezifikation verantwortet gemäss FAQ 17 die Auftraggeberin unter Zuzug der ELO-Entwicklerfirma, Anpassungen an ELO trägt die Auftraggeberin); SLIM stellt früh eine Testumgebung mit Demo-Daten bereit; Integrationstests über beide Systeme (Anlagenabruf, Meldung, alle Fehlerfälle) gehören zur Abnahme. </w:t>
+        <w:t xml:space="preserve"> Die Technologiepartnerin hat ELO auf demselben Technologie-Stack entwickelt und kennt Datenmodell und Fachbegriffe beider Systeme. Das senkt das Integrationsrisiko, ersetzt die Abstimmung aber nicht: Die Schnittstellenspezifikation (Felder, Codes, Fehlerfälle, Konten) wird zu Beginn mit der Auftraggeberin festgelegt und als OpenAPI-Dokument festgeschrieben (die ELO-seitige Spezifikation verantwortet gemäss FAQ 17 die Auftraggeberin unter Zuzug der ELO-Entwicklerfirma, Anpassungen an ELO trägt die Auftraggeberin); SLIM stellt früh eine Testumgebung mit Demo-Daten bereit; Integrationstests über beide Systeme (Anlagenabruf, Meldung, alle Fehlerfälle) gehören zur Abnahme. </w:t>
       </w:r>
       <w:r>
         <w:rPr>
@@ -2722,7 +2722,7 @@
         <w:t xml:space="preserve">Barrierefreiheit:</w:t>
       </w:r>
       <w:r>
-        <w:t xml:space="preserve"> SLIM wird verbindlich nach eCH-0059 / WCAG 2.1 Konformitätsstufe AA umgesetzt, in Anlehnung an die Erklärung zur Barrierefreiheit von armasuisse (FAQ 9, 128): Tastaturbedienung, sichtbarer Fokus, beschriftete Steuerelemente, Ampeln zusätzlich mit Symbol und Text, Karteninhalte als Tabelle, PDF-Ausgaben mit Struktur (Tagged PDF). Geprüft wird automatisiert im Build (axe) und manuell an den Kernmasken je Release (Tastatur, Screenreader, Kontrast, Zoom 200 %). Optionale QR-Erfassung (slm 46–49): Der QR-Code je Stellungsraum enthält einen Deep Link mit signiertem Token (Schiessplatz, Stellungsraum, Ausgabedatum, Gültigkeit; HMAC mit mandantenspezifischem Schlüssel, Schlüsselwechsel macht alte Codes ungültig). Die API prüft Signatur, Gültigkeit und Zuordnung, bevor die Erfassungsmaske vorbelegt wird; ein ungültiger oder abgelaufener Code führt zu einer klaren Fehlermeldung ohne Erfassungsmöglichkeit, der Versuch wird protokolliert. Die Erfassungsmaske (B1 11.2) zeigt Schiessplatz und Stellungsraum gesperrt vorbelegt, Tagesdatum editierbar, Beginn/Ende im Viertelstundenraster, Einheit mit Autovervollständigung, Nutzungskategorie, Anzahl Personen, mehrere Zeilen Waffe/Kaliber mit Menge in Stück oder kg; Prüfung wie in 5.11; der Entwurf wird lokal in der PWA gehalten und bei Verbindungsabbruch beim nächsten Kontakt gesendet – mit Idempotenz-Schlüssel, damit Wiederholungen keine Doppelmeldung erzeugen. </w:t>
+        <w:t xml:space="preserve"> SLIM orientiert sich an eCH-0059 / WCAG 2.1 AA (Tastaturbedienung, sichtbarer Fokus, Kontraste, beschriftete Steuerelemente; Ampeln zusätzlich mit Symbol und Text), in Anlehnung an die Richtlinien der armasuisse (FAQ 9, 128). Die Kernmasken werden je Release auf Tastaturbedienung und Kontrast geprüft. Optionale QR-Erfassung (slm 46–49): Der QR-Code je Stellungsraum enthält einen Deep Link mit signiertem Token (Schiessplatz, Stellungsraum, Ausgabedatum, Gültigkeit; HMAC mit mandantenspezifischem Schlüssel, Schlüsselwechsel macht alte Codes ungültig). Die API prüft Signatur, Gültigkeit und Zuordnung, bevor die Erfassungsmaske vorbelegt wird; ein ungültiger oder abgelaufener Code führt zu einer klaren Fehlermeldung ohne Erfassungsmöglichkeit, der Versuch wird protokolliert. Die Erfassungsmaske (B1 11.2) zeigt Schiessplatz und Stellungsraum gesperrt vorbelegt, Tagesdatum editierbar, Beginn/Ende im Viertelstundenraster, Einheit mit Autovervollständigung, Nutzungskategorie, Anzahl Personen, mehrere Zeilen Waffe/Kaliber mit Menge in Stück oder kg; Prüfung wie in 5.11; der Entwurf wird lokal in der PWA gehalten und bei Verbindungsabbruch beim nächsten Kontakt gesendet – mit Idempotenz-Schlüssel, damit Wiederholungen keine Doppelmeldung erzeugen. </w:t>
       </w:r>
       <w:r>
         <w:rPr>
@@ -2870,7 +2870,7 @@
         <w:t xml:space="preserve">Betrieb (LP4):</w:t>
       </w:r>
       <w:r>
-        <w:t xml:space="preserve"> ongoing betreibt SLIM als SaaS über die gesamte Betriebsphase von zehn Jahren und trägt die volle Betriebsverantwortung: 99 % Verfügbarkeit Mo–Fr 07–19 Uhr, monatlich gemessen und berichtet, genehmigte Wartungsfenster, Sicherung und Monitoring nach 2.5. </w:t>
+        <w:t xml:space="preserve"> [PLATZHALTER FIRMA] betreibt SLIM als SaaS über die gesamte Betriebsphase von zehn Jahren und trägt die volle Betriebsverantwortung: 99 % Verfügbarkeit Mo–Fr 07–19 Uhr, monatlich gemessen und berichtet, genehmigte Wartungsfenster, Sicherung und Monitoring nach 2.5. </w:t>
       </w:r>
       <w:r>
         <w:rPr>
@@ -2880,7 +2880,7 @@
         <w:t xml:space="preserve">Support:</w:t>
       </w:r>
       <w:r>
-        <w:t xml:space="preserve"> 1st Level durch die Trainer der Auftraggeberin (2–15 Personen, FAQ 20); 2nd und 3rd Level durch ongoing, Mo–Fr 08–17 Uhr, Standort [OFFEN: Standort 2nd-/3rd-Level-Support]: Reaktion innerhalb vier Stunden, Behebungsbeginn innerhalb 24 Stunden, Behebung erheblicher Störungen in der Regel innerhalb 48 Stunden. Codeänderungen im 3rd Level erstellt die Entwicklerin; sie gelangen ausschliesslich über die CI/CD-Pipeline (Build, automatisierte Tests, Akzeptanzsystem, Freigabe) von der Entwicklung in den Betrieb, die Gesamtverantwortung bleibt bei ongoing. Fristbeginn gemäss FAQ 115: bei Eingang innerhalb der Supportzeit mit der Meldung, sonst mit der nächsten Erreichbarkeit; danach laufen die Fristen kalendarisch, auch an Wochenenden und Feiertagen, gesichert durch einen Bereitschafts- und Eskalationsprozess. Schweregrade (FAQ 4): kritisch = Produktion nicht nutzbar, hoch = Kernfunktion gestört ohne Umgehung, mittel = Umgehung vorhanden, niedrig = kosmetisch; Meldeweg über Ticketsystem und Hotline, Stellvertretung im Support, Incident-/Problem-/Change-Prozess, Vor-Ort-Einsatz in Bern innerhalb eines Arbeitstags (Teil B 2.6.2/2.8). </w:t>
+        <w:t xml:space="preserve"> 1st Level durch die Trainer der Auftraggeberin (2–15 Personen, FAQ 20); 2nd und 3rd Level durch [PLATZHALTER FIRMA], Mo–Fr 08–17 Uhr, Standort [OFFEN: Standort 2nd-/3rd-Level-Support]: Reaktion innerhalb vier Stunden, Behebungsbeginn innerhalb 24 Stunden, Behebung erheblicher Störungen in der Regel innerhalb 48 Stunden. Codeänderungen im 3rd Level erstellt die Technologiepartnerin; sie gelangen ausschliesslich über die CI/CD-Pipeline (Build, automatisierte Tests, Akzeptanzsystem, Freigabe) von der Entwicklung in den Betrieb, die Gesamtverantwortung bleibt bei [PLATZHALTER FIRMA]. Fristbeginn gemäss FAQ 115: bei Eingang innerhalb der Supportzeit mit der Meldung, sonst mit der nächsten Erreichbarkeit; danach laufen die Fristen kalendarisch, auch an Wochenenden und Feiertagen, gesichert durch einen Bereitschafts- und Eskalationsprozess. Schweregrade (FAQ 4): kritisch = Produktion nicht nutzbar, hoch = Kernfunktion gestört ohne Umgehung, mittel = Umgehung vorhanden, niedrig = kosmetisch; Meldeweg über Ticketsystem und Hotline, Stellvertretung im Support, Incident-/Problem-/Change-Prozess, Vor-Ort-Einsatz in Bern innerhalb eines Arbeitstags (Teil B 2.6.2/2.8). </w:t>
       </w:r>
       <w:r>
         <w:rPr>
@@ -2900,7 +2900,7 @@
         <w:t xml:space="preserve">Datenhaltung in der Schweiz (E1, E5):</w:t>
       </w:r>
       <w:r>
-        <w:t xml:space="preserve"> Das Datenhaltungskonzept inventarisiert alle Dienste mit Applikations- oder Projektdaten – Repository, Dokumentation, CI/CD, Container-Registry, Logs und Monitoring, E-Mail-Versand, Ticketsystem, Druckdienst, Demo, KI-Werkzeuge – mit Datenkategorien, Datenflüssen, Standorten und Unterauftragnehmern; ongoing und die Entwicklerin legen je ein eigenes Konzept vor (FAQ 132). Verbindlich gilt: Applikations- und Projektdaten werden in allen Umgebungen ausschliesslich auf Informatiksystemen in der Schweiz gespeichert und bearbeitet (FAQ 49, 174) – einschliesslich Quellcode (selbst betriebenes GitLab, FAQ 158), Container-Images und Paketen (selbst betriebenes Nexus), Build-Artefakten, Rand- und Metadaten, Protokollen, Telemetrie, Support und Sicherungen; eine Region «Europa/EU» genügt nicht. Reale Fachdaten liegen nur in Produktion und Akzeptanz; Entwicklung, Tests und Demo arbeiten mit synthetischen Daten. Werkzeuge ausserhalb der Schweiz (z. B. KI-Entwicklungswerkzeuge) werden gemäss FAQ 157, 160 und 172 nur eingesetzt, soweit sie nachweislich keine produktiven oder realen Fachdaten und keine schützenswerten Projektinformationen erhalten; ihr Einsatz ist im Datenhaltungskonzept ausgewiesen. Die Entwicklungsleistungen werden in der Schweiz erbracht.</w:t>
+        <w:t xml:space="preserve"> Das Datenhaltungskonzept inventarisiert alle Dienste mit Applikations- oder Projektdaten – Repository, Dokumentation, CI/CD, Container-Registry, Logs und Monitoring, E-Mail-Versand, Ticketsystem, Druckdienst, Demo, KI-Werkzeuge – mit Datenkategorien, Datenflüssen, Standorten und Unterauftragnehmern; [PLATZHALTER FIRMA] und die Technologiepartnerin legen je ein eigenes Konzept vor (FAQ 132). Verbindlich gilt: Applikations- und Projektdaten werden in allen Umgebungen ausschliesslich auf Informatiksystemen in der Schweiz gespeichert und bearbeitet (FAQ 49, 174) – einschliesslich Quellcode (selbst betriebenes GitLab, FAQ 158), Container-Images und Paketen (selbst betriebenes Nexus), Build-Artefakten, Rand- und Metadaten, Protokollen, Telemetrie, Support und Sicherungen; eine Region «Europa/EU» genügt nicht. Reale Fachdaten liegen nur in Produktion und Akzeptanz; Entwicklung, Tests und Demo arbeiten mit synthetischen Daten. Werkzeuge ausserhalb der Schweiz (z. B. KI-Entwicklungswerkzeuge) werden gemäss FAQ 157, 160 und 172 nur eingesetzt, soweit sie nachweislich keine produktiven oder realen Fachdaten und keine schützenswerten Projektinformationen erhalten; ihr Einsatz ist im Datenhaltungskonzept ausgewiesen. Die Entwicklungsleistungen werden in der Schweiz erbracht.</w:t>
       </w:r>
     </w:p>
     <w:p>
@@ -2936,7 +2936,7 @@
         <w:t xml:space="preserve">Schulung (LP3):</w:t>
       </w:r>
       <w:r>
-        <w:t xml:space="preserve"> Die Trainer von ongoing führen sämtliche Schulungen durch – zehn initiale und zwei wiederkehrende über die Laufzeit, z. B. bei Wechsel der Applikationsverantwortung (FAQ 36/38) – als Train-the-Trainer für die Applikationsverantwortlichen der Auftraggeberin: vor Ort (Bern und weitere Standorte), rund ein halber Tag, zwei bis drei Personen je Schulung, Unterlagen auf Deutsch, Durchführung bei Bedarf auch auf Französisch oder Italienisch (FAQ 37, 70). Annahme für grössere Funktionserweiterungen: eine zusätzliche Trainerschulung je Erweiterungsrelease. </w:t>
+        <w:t xml:space="preserve"> Die Trainer von [PLATZHALTER FIRMA] führen sämtliche Schulungen durch – zehn initiale und zwei wiederkehrende über die Laufzeit, z. B. bei Wechsel der Applikationsverantwortung (FAQ 36/38) – als Train-the-Trainer für die Applikationsverantwortlichen der Auftraggeberin: vor Ort (Bern und weitere Standorte), rund ein halber Tag, zwei bis drei Personen je Schulung, Unterlagen auf Deutsch, Durchführung bei Bedarf auch auf Französisch oder Italienisch (FAQ 37, 70). Annahme für grössere Funktionserweiterungen: eine zusätzliche Trainerschulung je Erweiterungsrelease. </w:t>
       </w:r>
       <w:r>
         <w:rPr>
@@ -2972,7 +2972,7 @@
         <w:spacing w:after="120"/>
       </w:pPr>
       <w:r>
-        <w:t xml:space="preserve">Der Machbarkeitsnachweis stützt sich auf den lauffähigen Prototyp (MVP), der aus denselben Bausteinen besteht wie die angebotene Lösung (Angular, NestJS, TypeORM, galaxy-Plattform, Berechnungskern). Stand 02.10.2026 sind umgesetzt: Anmeldung, Rollen und Objektregeln, Übersicht Schiessplätze mit berechneten Ampeln, die Masken 5.11 Schusszahlen, 5.12 Details und 5.13 Simulation, der GIS-Kartenviewer, die Datenverwaltung 5.14–5.25 (5.17 als Anzeige), Auswahllisten, erweiterte Konfiguration 5.28, Hilfe, das Datenmodell nach B1 Kapitel 10, der Berechnungslauf, Benutzerverwaltung und Logbuch; der Berechnungskern ist gegen Beilage B1.4 geprüft (Kapitel 4.3). Noch nicht umgesetzt sind insbesondere die Seite 5.10, die ELO-Endpunkte, der FGDB-Zugriff über GDAL, der Excel-Import der Schusszahlen, die Exporte nach B1.6 und MPV, die Views, der Betrieb auf PostgreSQL/PostGIS und die Zuordnung Benutzer ↔ Schiessplatz in der Maske. Nicht umgesetzte Masken sind in der Oberfläche als «In Vorbereitung» gekennzeichnet; der Stand je Anforderung steht in der Matrix. Auf diesem Stand und auf der ELO-Erfahrung der Entwicklerin beruht der angebotene Maximalaufwand von 2'800 Stunden für LP1a. Die Risiken der verbleibenden Arbeit sind eingegrenzt:</w:t>
+        <w:t xml:space="preserve">Der Machbarkeitsnachweis stützt sich auf den lauffähigen Prototyp (MVP), der aus denselben Bausteinen besteht wie die angebotene Lösung (Angular, NestJS, TypeORM, galaxy-Plattform, Berechnungskern). Stand 02.10.2026 sind umgesetzt: Anmeldung, Rollen und Objektregeln, Übersicht Schiessplätze mit berechneten Ampeln, die Masken 5.11 Schusszahlen, 5.12 Details und 5.13 Simulation, der GIS-Kartenviewer, die Datenverwaltung 5.14–5.25 (5.17 als Anzeige), Auswahllisten, erweiterte Konfiguration 5.28, Hilfe, das Datenmodell nach B1 Kapitel 10, der Berechnungslauf, Benutzerverwaltung und Logbuch; der Berechnungskern ist gegen Beilage B1.4 geprüft (Kapitel 4.3). Noch nicht umgesetzt sind insbesondere die Seite 5.10, die ELO-Endpunkte, der FGDB-Zugriff über GDAL, der Excel-Import der Schusszahlen, die Exporte nach B1.6 und MPV, die Views, der Betrieb auf PostgreSQL/PostGIS und die Zuordnung Benutzer ↔ Schiessplatz in der Maske. Nicht umgesetzte Masken sind in der Oberfläche als «In Vorbereitung» gekennzeichnet; der Stand je Anforderung steht in der Matrix. Auf diesem Stand und auf der ELO-Erfahrung der Technologiepartnerin beruht der angebotene Maximalaufwand von 2'800 Stunden für LP1a. Die Risiken der verbleibenden Arbeit sind eingegrenzt:</w:t>
       </w:r>
     </w:p>
     <w:tbl>
@@ -3237,7 +3237,7 @@
                 <w:sz w:val="19"/>
                 <w:szCs w:val="19"/>
               </w:rPr>
-              <w:t xml:space="preserve">Beide Systeme sind der Entwicklerin bekannt; OpenAPI-Vertrag im ersten Sprint, Testumgebung, Integrationstests über beide Systeme</w:t>
+              <w:t xml:space="preserve">Beide Systeme sind der Technologiepartnerin bekannt; OpenAPI-Vertrag im ersten Sprint, Testumgebung, Integrationstests über beide Systeme</w:t>
             </w:r>
           </w:p>
         </w:tc>
@@ -8425,7 +8425,7 @@
                 <w:sz w:val="17"/>
                 <w:szCs w:val="17"/>
               </w:rPr>
-              <w:t xml:space="preserve">T (UI-Grundlagen; Nachweis WCAG 2.1 AA ausstehend)</w:t>
+              <w:t xml:space="preserve">T (UI-Grundlagen vorhanden; Orientierung an eCH-0059 / WCAG 2.1 AA)</w:t>
             </w:r>
           </w:p>
         </w:tc>

</xml_diff>

<commit_message>
Add table export functionality for selection lists, simulations, and user management; implement e2e tests for CSV validation (B1 5.5.5, slm 3).
</commit_message>
<xml_diff>
--- a/docs/anforderungskatalog/C2-Loesungskonzept-SLIM.docx
+++ b/docs/anforderungskatalog/C2-Loesungskonzept-SLIM.docx
@@ -2818,7 +2818,7 @@
         <w:spacing w:after="120"/>
       </w:pPr>
       <w:r>
-        <w:t xml:space="preserve">Monorepo mit getrennten Modulen (Stammdaten, Nutzungen, Berechnung, Datenverwaltung, Import/Export, Benutzer/Rollen, Logbuch), generiertem API-Vertrag und automatisch dokumentiertem Datenmodell; Fachparameter (Rollen, Rechte, Auswahllisten, Grenzwerte, Ampelschwellen, Rundung, Sperrdatum, Feiertage, Kartenlayer) sind Konfiguration ohne Rekompilierung; neue Masken entstehen aus Design System, Facade und generiertem Client. Qualitätssicherung in jedem Build (Stand 02.10.2026, alle bestanden): Lint; 426 API-Tests (Berechnungskern gegen B1.4, Rechenfälle, Service- und HTTP-Tests je Controller mit Rechtematrix); 233 Oberflächen-Tests; 27 Tests der Kartenbibliothek; dazu End-to-End-Fälle (Playwright) für Anmeldung, Startseite, Schiessplatz-Masken und Datenverwaltung sowie Kriterien-Fälle je B1-Anforderung als Skelett mit Prüfschritten, die mit der jeweiligen Maske automatisiert werden. </w:t>
+        <w:t xml:space="preserve">Monorepo mit getrennten Modulen (Stammdaten, Nutzungen, Berechnung, Datenverwaltung, Import/Export, Benutzer/Rollen, Logbuch), generiertem API-Vertrag und automatisch dokumentiertem Datenmodell; Fachparameter (Rollen, Rechte, Auswahllisten, Grenzwerte, Ampelschwellen, Rundung, Sperrdatum, Feiertage, Kartenlayer) sind Konfiguration ohne Rekompilierung; neue Masken entstehen aus Design System, Facade und generiertem Client. Qualitätssicherung in jedem Build (Stand 02.10.2026, alle bestanden): Lint; 432 API-Tests (Berechnungskern gegen B1.4, Rechenfälle, Service- und HTTP-Tests je Controller mit Rechtematrix); 255 Oberflächen-Tests; 27 Tests der Kartenbibliothek; dazu End-to-End-Fälle (Playwright) für Anmeldung, Startseite, Schiessplatz-Masken und Datenverwaltung sowie Kriterien-Fälle je B1-Anforderung als Skelett mit Prüfschritten, die mit der jeweiligen Maske automatisiert werden. </w:t>
       </w:r>
       <w:r>
         <w:rPr>
@@ -4426,7 +4426,7 @@
                 <w:sz w:val="17"/>
                 <w:szCs w:val="17"/>
               </w:rPr>
-              <w:t xml:space="preserve">Z (Ampeln in der Kontextleiste vorhanden)</w:t>
+              <w:t xml:space="preserve">P (Seite 5.10 mit Ampeln, Stand, Kontingentvergleich und Karte umgesetzt)</w:t>
             </w:r>
           </w:p>
         </w:tc>

</xml_diff>

<commit_message>
Streamline blob export logic by replacing custom `download` implementations with shared `saveBlob` utility; enhance time validation error messaging and add rounding notes to area assessments and simulations.
</commit_message>
<xml_diff>
--- a/docs/anforderungskatalog/C2-Loesungskonzept-SLIM.docx
+++ b/docs/anforderungskatalog/C2-Loesungskonzept-SLIM.docx
@@ -791,7 +791,7 @@
         <w:t xml:space="preserve">tenantId</w:t>
       </w:r>
       <w:r>
-        <w:t xml:space="preserve"> (fachliche Mandantentrennung, z. B. Demo- neben Produktivmandant; Entwicklung, Akzeptanz und Produktion sind getrennte Instanzen mit eigener Datenbank; SLIM teilt keine Laufzeit mit ELO), Zeitstempel und Löschmarke; das Schema wird per Migration versioniert und als ERD automatisch dokumentiert. </w:t>
+        <w:t xml:space="preserve"> (fachliche Mandantentrennung; reale und synthetische Daten liegen nie in derselben Instanz; Entwicklung, Akzeptanz und Produktion sind getrennte Instanzen mit eigener Datenbank; SLIM teilt keine Laufzeit mit ELO), Zeitstempel und Löschmarke; das Schema wird per Migration versioniert und als ERD automatisch dokumentiert. </w:t>
       </w:r>
       <w:r>
         <w:rPr>
@@ -1156,7 +1156,7 @@
         <w:t xml:space="preserve">Schusszahlen (slm 37):</w:t>
       </w:r>
       <w:r>
-        <w:t xml:space="preserve"> Excel-Import nach der Vorlage B1.6 (B1 9.3) mit denselben Regeln wie Maske 5.11 und ELO; Zeilen mit unbekanntem Stellungsraum oder unzulässiger Kombination werden abgewiesen und im Bericht ausgewiesen.</w:t>
+        <w:t xml:space="preserve"> Der Excel-Import nach der Vorlage B1.6 (B1 9.3) liest die erfassten Schiessblöcke, Zeitkategorien und Tagesanteile ein und ordnet sie den Betriebsdatenfenstern von SLIM zu, mit denselben Regeln wie Maske 5.11 und ELO; Zeilen mit unbekanntem Stellungsraum oder unzulässiger Kombination werden abgewiesen und im Bericht ausgewiesen. Jeder Importlauf trägt eine eindeutige Import-ID. Ein korrigierter Nachimport löscht nicht alle Daten des Schiessplatzes, sondern ersetzt gezielt die Datensätze dieser Import-ID oder des angegebenen Zeitraums nach einer mit KOMZ Lärm abgestimmten Ersatzregel.</w:t>
       </w:r>
     </w:p>
     <w:p>
@@ -1399,7 +1399,7 @@
         <w:t xml:space="preserve">lokal am Standort</w:t>
       </w:r>
       <w:r>
-        <w:t xml:space="preserve"> (B1 S. 71, FAQ 164): je Schiessplatz ein in SLIM gepflegter Kalender aus nationalen, kantonalen und Gemeinde-Feiertagen inklusive halber Feiertage. Schiesshalbtage je Waffenkategorie a–f (Werktag Mo–Sa / Sonn- und Feiertag; Grenze Vormittag/Nachmittag 12:00 Uhr nach B1 7.4.3; ein Halbtag zählt 1 bei mehr als zwei Stunden Schiesszeit, sonst ½, LSV Anhang 7 Ziffer 322; mehrere Nutzungen im selben Halbtag werden zusammengezählt). Betrachtungszeitraum: je Berechnung die repräsentativen Jahre – Standard drei, auch nicht aufeinanderfolgende – oder ein beliebiger Zeitraum (B1 7.4.5); die Betriebsdaten werden als Jahresmittel über diese Auswahl gebildet.</w:t>
+        <w:t xml:space="preserve"> (B1 S. 71, FAQ 164): je Schiessplatz ein in SLIM gepflegter Kalender aus nationalen, kantonalen und Gemeinde-Feiertagen inklusive halber Feiertage. Schiesshalbtage je Waffenkategorie a–f (Werktag Mo–Sa / Sonn- und Feiertag; Grenze Vormittag/Nachmittag 12:00 Uhr nach B1 7.4.3; ein Halbtag zählt 1 bei mehr als zwei Stunden Schiesszeit, sonst ½, LSV Anhang 7 Ziffer 322; die Zeiträume mehrerer Nutzungen im selben Halbtag werden über alle Stellungsräume vereinigt, die Schusszahlen bleiben additiv). Betrachtungszeitraum: je Berechnung die repräsentativen Jahre – Standard drei, auch nicht aufeinanderfolgende – oder ein beliebiger Zeitraum (B1 7.4.5); die Betriebsdaten werden als Jahresmittel über diese Auswahl gebildet.</w:t>
       </w:r>
     </w:p>
     <w:p>
@@ -1966,6 +1966,51 @@
     </w:p>
     <w:p>
       <w:pPr>
+        <w:pStyle w:val="ListParagraph"/>
+        <w:numPr>
+          <w:ilvl w:val="0"/>
+          <w:numId w:val="2"/>
+        </w:numPr>
+        <w:spacing w:after="40"/>
+      </w:pPr>
+      <w:r>
+        <w:rPr>
+          <w:b/>
+          <w:bCs/>
+        </w:rPr>
+        <w:t xml:space="preserve">Teiljahre und unterjährige Inbetriebnahme:</w:t>
+      </w:r>
+      <w:r>
+        <w:t xml:space="preserve"> Schusszahlen werden nicht hochgerechnet. SLIM unterscheidet erfasste Nullnutzung, fehlende Erfassung und verkürzte Betriebsphasen. Der Nenner des Jahresmittels ist die Anzahl der gewählten Kalenderjahre und wird nicht um Zeiten ohne Erfassung gekürzt; er steht mit den Jahren im Berechnungsstand.</w:t>
+      </w:r>
+    </w:p>
+    <w:p>
+      <w:pPr>
+        <w:pStyle w:val="ListParagraph"/>
+        <w:numPr>
+          <w:ilvl w:val="0"/>
+          <w:numId w:val="2"/>
+        </w:numPr>
+        <w:spacing w:after="40"/>
+      </w:pPr>
+      <w:r>
+        <w:rPr>
+          <w:b/>
+          <w:bCs/>
+        </w:rPr>
+        <w:t xml:space="preserve">Gleichzeitige Nutzungen:</w:t>
+      </w:r>
+      <w:r>
+        <w:t xml:space="preserve"> Sind für einen Schiessplatz am selben Tag mehrere Schiessen erfasst, auch auf verschiedenen Stellungsräumen, werden ihre Zeiträume für die Schiesshalbtage nach Anhang 7 über den ganzen Schiessplatz vereinigt (B1 7.4.3 «gesamtheitlich»). Zeitgleiches Schiessen zählt einmal; so entstehen keine zusätzlichen Schiesshalbtage. Im Berechnungskern umgesetzt und getestet.</w:t>
+      </w:r>
+    </w:p>
+    <w:p>
+      <w:pPr>
+        <w:spacing w:after="80"/>
+      </w:pPr>
+    </w:p>
+    <w:p>
+      <w:pPr>
         <w:pStyle w:val="Heading3"/>
       </w:pPr>
       <w:r>
@@ -2332,7 +2377,7 @@
         <w:spacing w:after="120"/>
       </w:pPr>
       <w:r>
-        <w:t xml:space="preserve">Auslegung (FAQ 18, 28, 32): rund 270 Schiessplätze (120 aktive, 150 historische), bis 10'000 Stellungsräume, 50'000 Zuordnungen Waffe/Kaliber, 10 bis über 1'000 Empfangspunkte je Schiessplatz, rund 20 neue FGDB pro Jahr von wenigen MB, zehn gleichzeitige Nutzer. Antwortzeiten nach B1 12.5: Suche Ø 2 s / max. 5 s, Filter und Registerwechsel 0.5 / 1 s, Details Ø 2 s / max. 5 s, Berechnung Ø 5 s / max. 10 s; Vorgänge über 10 s zeigen Fortschritt und lassen sich abbrechen. Gemessen (Entwicklungsrechner, Service-Ebene ohne HTTP, September 2026): Berechnungskern mit synthetischem Mengengerüst (50 Quellen, 300 Empfangspunkte, drei Jahre mit 18'000 Nutzungen) – Betriebsdaten 79 ms, Pegel Anhang 9 und 7 für alle Empfangspunkte 13 ms; Beurteilung durch den Service mit 4'572 Nutzungen über drei Jahre Ø 146 ms (max. 219 ms), Simulation Ø 57 ms. Nicht gemessen sind HTTP-Overhead, Browser-Rendering, gleichzeitige Nutzer und Plätze mit über 1'000 Empfangspunkten; diesen Nachweis erbringt der Lasttest (k6, Akzeptanzsystem, Datenbestand in Zielgrösse) vor der ersten Iterationsabnahme. </w:t>
+        <w:t xml:space="preserve">Auslegung (FAQ 18, 28, 32): rund 270 Schiessplätze (120 aktive, 150 historische), bis 10'000 Stellungsräume, 50'000 Zuordnungen Waffe/Kaliber, 10 bis über 1'000 Empfangspunkte je Schiessplatz, rund 20 neue FGDB pro Jahr von wenigen MB, zehn gleichzeitige Nutzer. Antwortzeiten nach B1 12.5: Suche Ø 2 s / max. 5 s, Filter und Registerwechsel 0.5 / 1 s, Details Ø 2 s / max. 5 s, Berechnung Ø 5 s / max. 10 s; Vorgänge über 10 s zeigen Fortschritt und lassen sich abbrechen. Gemessen (Entwicklungsrechner, Service-Ebene ohne HTTP, September 2026): Berechnungskern mit synthetischem Mengengerüst (50 Quellen, 300 Empfangspunkte, drei Jahre mit 18'000 Nutzungen) – Betriebsdaten 79 ms, Pegel Anhang 9 und 7 für alle Empfangspunkte 13 ms; Beurteilung durch den Service mit 4'572 Nutzungen über drei Jahre Ø 146 ms (max. 219 ms), Simulation Ø 57 ms. Nicht gemessen sind HTTP-Overhead, Browser-Rendering, gleichzeitige Nutzer und Plätze mit über 1'000 Empfangspunkten; Teiltests mit k6 laufen ab PI 1 auf dem Akzeptanzsystem; den vollständigen Nachweis auf der Zielplattform mit Datenbestand in Zielgrösse erbringt der Lasttest bis M4 (Dezember 2027, Projektplan). </w:t>
       </w:r>
       <w:r>
         <w:rPr>
@@ -2386,7 +2431,7 @@
         <w:t xml:space="preserve">Prototyp:</w:t>
       </w:r>
       <w:r>
-        <w:t xml:space="preserve"> Umgesetzt sind Startseite, Übersicht mit berechneten Ampeln (Grund je Ampel im Tooltip), Schiessplatz-Wechsler mit Lesezeichen, Kontextleiste, die Fachmasken 5.11–5.13 (Bilder), eine eigene Adresse je Schiessplatz, Zustand und einzelner Nutzung, die Datenverwaltung 5.14–5.16 (Schiessplätze, Allgemein, Stammdaten mit Kontingenten), 5.17 als Anzeige (FAQ 52: Pflege über Import), 5.18–5.21 (Berechnungen: Zeiger aktuell/MGDM, Import mit Prüfbericht, Export, Details je Stellungsraum), 5.22–5.25 (Waffen mit Löschschutz und Export), die Auswahllisten (slm 1: Werte der Stammdaten-Listen und der zivilen Nutzungsart anlegen, ändern, inaktivieren – nie löschen; Listen, die die Berechnung steuern oder die LSV vorgibt, bleiben fest) und die erweiterte Konfiguration 5.28 (Sperrdatum der Erfassung, Handbuch-Upload, Ampel-Schwellen und -farben, Kontaktangaben). In LP1 folgen die Seite 5.10 (Kontingent-Tabelle Soll/Ist/Ø drei Jahre, Karte), die Zuordnung Benutzer ↔ Schiessplatz in 5.26, die Pflege von Feiertagen und Grenzwerten sowie die Auswahl repräsentativer Jahre in der Maske.</w:t>
+        <w:t xml:space="preserve"> Umgesetzt sind Startseite, Übersicht mit berechneten Ampeln (Grund je Ampel im Tooltip), Schiessplatz-Wechsler mit Lesezeichen, Kontextleiste, die Fachmasken 5.11–5.13 (Bilder), eine eigene Adresse je Schiessplatz, Zustand und einzelner Nutzung, die Datenverwaltung 5.14–5.16 (Schiessplätze, Allgemein, Stammdaten mit Kontingenten), 5.17 als Anzeige (FAQ 52: Pflege über Import), 5.18–5.21 (Berechnungen: Zeiger aktuell/MGDM, Import mit Prüfbericht, Export, Details je Stellungsraum), 5.22–5.25 (Waffen mit Löschschutz und Export), die Auswahllisten (slm 1: Werte der Stammdaten-Listen und der zivilen Nutzungsart anlegen, ändern, inaktivieren – nie löschen; Listen, die die Berechnung steuern oder die LSV vorgibt, bleiben fest) und die erweiterte Konfiguration 5.28 (Sperrdatum der Erfassung, Handbuch-Upload, Ampel-Schwellen und -farben, Kontaktangaben). Umgesetzt ist auch die Seite 5.10 (Beurteilung mit beiden Ampeln, Stand, Kontingent-Tabelle Soll/Ist/Ø drei Jahre, Karte). In LP1 folgen die Zuordnung Benutzer ↔ Schiessplatz in 5.26, die Pflege von Feiertagen und Grenzwerten sowie die Auswahl repräsentativer Jahre in der Maske.</w:t>
       </w:r>
     </w:p>
     <w:p>
@@ -2818,7 +2863,7 @@
         <w:spacing w:after="120"/>
       </w:pPr>
       <w:r>
-        <w:t xml:space="preserve">Monorepo mit getrennten Modulen (Stammdaten, Nutzungen, Berechnung, Datenverwaltung, Import/Export, Benutzer/Rollen, Logbuch), generiertem API-Vertrag und automatisch dokumentiertem Datenmodell; Fachparameter (Rollen, Rechte, Auswahllisten, Grenzwerte, Ampelschwellen, Rundung, Sperrdatum, Feiertage, Kartenlayer) sind Konfiguration ohne Rekompilierung; neue Masken entstehen aus Design System, Facade und generiertem Client. Qualitätssicherung in jedem Build (Stand 02.10.2026, alle bestanden): Lint; 432 API-Tests (Berechnungskern gegen B1.4, Rechenfälle, Service- und HTTP-Tests je Controller mit Rechtematrix); 255 Oberflächen-Tests; 27 Tests der Kartenbibliothek; dazu End-to-End-Fälle (Playwright) für Anmeldung, Startseite, Schiessplatz-Masken und Datenverwaltung sowie Kriterien-Fälle je B1-Anforderung als Skelett mit Prüfschritten, die mit der jeweiligen Maske automatisiert werden. </w:t>
+        <w:t xml:space="preserve">Monorepo mit getrennten Modulen (Stammdaten, Nutzungen, Berechnung, Datenverwaltung, Import/Export, Benutzer/Rollen, Logbuch), generiertem API-Vertrag und automatisch dokumentiertem Datenmodell; Fachparameter (Rollen, Rechte, Auswahllisten, Grenzwerte, Ampelschwellen, Rundung, Sperrdatum, Feiertage, Kartenlayer) sind Konfiguration ohne Rekompilierung; neue Masken entstehen aus Design System, Facade und generiertem Client. Qualitätssicherung in jedem Build (Stand 02.10.2026, alle bestanden): Lint; 433 API-Tests (Berechnungskern gegen B1.4, Rechenfälle, Service- und HTTP-Tests je Controller mit Rechtematrix); 260 Oberflächen-Tests; 27 Tests der Kartenbibliothek; dazu End-to-End-Fälle (Playwright) für Anmeldung, Startseite, Schiessplatz-Masken und Datenverwaltung sowie Kriterien-Fälle je B1-Anforderung als Skelett mit Prüfschritten, die mit der jeweiligen Maske automatisiert werden. </w:t>
       </w:r>
       <w:r>
         <w:rPr>
@@ -2900,7 +2945,7 @@
         <w:t xml:space="preserve">Datenhaltung in der Schweiz (E1, E5):</w:t>
       </w:r>
       <w:r>
-        <w:t xml:space="preserve"> Das Datenhaltungskonzept inventarisiert alle Dienste mit Applikations- oder Projektdaten – Repository, Dokumentation, CI/CD, Container-Registry, Logs und Monitoring, E-Mail-Versand, Ticketsystem, Druckdienst, Demo, KI-Werkzeuge – mit Datenkategorien, Datenflüssen, Standorten und Unterauftragnehmern; [PLATZHALTER FIRMA] und die Technologiepartnerin legen je ein eigenes Konzept vor (FAQ 132). Verbindlich gilt: Applikations- und Projektdaten werden in allen Umgebungen ausschliesslich auf Informatiksystemen in der Schweiz gespeichert und bearbeitet (FAQ 49, 174) – einschliesslich Quellcode (selbst betriebenes GitLab, FAQ 158), Container-Images und Paketen (selbst betriebenes Nexus), Build-Artefakten, Rand- und Metadaten, Protokollen, Telemetrie, Support und Sicherungen; eine Region «Europa/EU» genügt nicht. Reale Fachdaten liegen nur in Produktion und Akzeptanz; Entwicklung, Tests und Demo arbeiten mit synthetischen Daten. Werkzeuge ausserhalb der Schweiz (z. B. KI-Entwicklungswerkzeuge) werden gemäss FAQ 157, 160 und 172 nur eingesetzt, soweit sie nachweislich keine produktiven oder realen Fachdaten und keine schützenswerten Projektinformationen erhalten; ihr Einsatz ist im Datenhaltungskonzept ausgewiesen. Die Entwicklungsleistungen werden in der Schweiz erbracht.</w:t>
+        <w:t xml:space="preserve"> Das Datenhaltungskonzept inventarisiert alle Dienste mit Applikations- oder Projektdaten – Repository, Dokumentation, CI/CD, Container-Registry, Logs und Monitoring, E-Mail-Versand, Ticketsystem, Druckdienst, Demo, KI-Werkzeuge – mit Datenkategorien, Datenflüssen, Standorten und Unterauftragnehmern; [PLATZHALTER FIRMA] und die Technologiepartnerin legen je ein eigenes Konzept vor (FAQ 132). Verbindlich gilt: Applikations- und Projektdaten werden in allen Umgebungen ausschliesslich auf Informatiksystemen in der Schweiz gespeichert und bearbeitet (FAQ 49, 174) – einschliesslich Quellcode (selbst betriebenes GitLab, FAQ 158), Container-Images und Paketen (selbst betriebenes Nexus), Build-Artefakten, Rand- und Metadaten, Protokollen, Telemetrie, Support und Sicherungen; eine Region «Europa/EU» genügt nicht. Reale Fachdaten liegen nur in Produktion und Akzeptanz; Entwicklung, Tests und Demo arbeiten mit synthetischen Daten. KI-Werkzeuge der Entwicklung nutzen ab der Eingabefrist ausschliesslich Dienste mit Verarbeitung in der Schweiz und erhalten keine produktiven oder realen Fachdaten; Art, Umfang und Verwendung sind im Datenhaltungskonzept deklariert (FAQ 53), die Nutzung wird vertraglich geregelt. Die Entwicklungsleistungen werden in der Schweiz erbracht.</w:t>
       </w:r>
     </w:p>
     <w:p>
@@ -2972,7 +3017,7 @@
         <w:spacing w:after="120"/>
       </w:pPr>
       <w:r>
-        <w:t xml:space="preserve">Der Machbarkeitsnachweis stützt sich auf den lauffähigen Prototyp (MVP), der aus denselben Bausteinen besteht wie die angebotene Lösung (Angular, NestJS, TypeORM, galaxy-Plattform, Berechnungskern). Stand 02.10.2026 sind umgesetzt: Anmeldung, Rollen und Objektregeln, Übersicht Schiessplätze mit berechneten Ampeln, die Masken 5.11 Schusszahlen, 5.12 Details und 5.13 Simulation, der GIS-Kartenviewer, die Datenverwaltung 5.14–5.25 (5.17 als Anzeige), Auswahllisten, erweiterte Konfiguration 5.28, Hilfe, das Datenmodell nach B1 Kapitel 10, der Berechnungslauf, Benutzerverwaltung und Logbuch; der Berechnungskern ist gegen Beilage B1.4 geprüft (Kapitel 4.3). Noch nicht umgesetzt sind insbesondere die Seite 5.10, die ELO-Endpunkte, der FGDB-Zugriff über GDAL, der Excel-Import der Schusszahlen, die Exporte nach B1.6 und MPV, die Views, der Betrieb auf PostgreSQL/PostGIS und die Zuordnung Benutzer ↔ Schiessplatz in der Maske. Nicht umgesetzte Masken sind in der Oberfläche als «In Vorbereitung» gekennzeichnet; der Stand je Anforderung steht in der Matrix. Auf diesem Stand und auf der ELO-Erfahrung der Technologiepartnerin beruht der angebotene Maximalaufwand von 2'800 Stunden für LP1a. Die Risiken der verbleibenden Arbeit sind eingegrenzt:</w:t>
+        <w:t xml:space="preserve">Der Machbarkeitsnachweis stützt sich auf den lauffähigen Prototyp (MVP), der aus denselben Bausteinen besteht wie die angebotene Lösung (Angular, NestJS, TypeORM, galaxy-Plattform, Berechnungskern). Stand 02.10.2026 sind umgesetzt: Anmeldung, Rollen und Objektregeln, Übersicht Schiessplätze mit berechneten Ampeln, die Masken 5.11 Schusszahlen, 5.12 Details und 5.13 Simulation, der GIS-Kartenviewer, die Datenverwaltung 5.14–5.25 (5.17 als Anzeige), Auswahllisten, erweiterte Konfiguration 5.28, Hilfe, das Datenmodell nach B1 Kapitel 10, der Berechnungslauf, Benutzerverwaltung und Logbuch; der Berechnungskern ist gegen Beilage B1.4 geprüft (Kapitel 4.3). Noch nicht umgesetzt sind insbesondere die ELO-Endpunkte, der FGDB-Zugriff über GDAL, der Excel-Import der Schusszahlen, die Exporte nach B1.6 und MPV, die Views, der Betrieb auf PostgreSQL/PostGIS und die Zuordnung Benutzer ↔ Schiessplatz in der Maske. Nicht umgesetzte Masken sind in der Oberfläche als «In Vorbereitung» gekennzeichnet; der Stand je Anforderung steht in der Matrix. Auf diesem Stand und auf der ELO-Erfahrung der Technologiepartnerin beruht der angebotene Maximalaufwand von 2'800 Stunden für LP1a. Die Risiken der verbleibenden Arbeit sind eingegrenzt:</w:t>
       </w:r>
     </w:p>
     <w:tbl>
@@ -3188,7 +3233,7 @@
                 <w:sz w:val="19"/>
                 <w:szCs w:val="19"/>
               </w:rPr>
-              <w:t xml:space="preserve">Kern gemessen (4.4), Worker-Isolation, Lasttest auf dem Akzeptanzsystem vor der ersten Iterationsabnahme; Rückfall: tagesaktuelle Vorberechnung der Ampeln</w:t>
+              <w:t xml:space="preserve">Kern gemessen (4.4), Worker-Isolation, Teiltests ab PI 1, vollständiger Lasttest auf der Zielplattform bis M4; Rückfall: tagesaktuelle Vorberechnung der Ampeln</w:t>
             </w:r>
           </w:p>
         </w:tc>
@@ -3407,7 +3452,7 @@
         <w:t xml:space="preserve">Interaktive Demonstration des Prototyps.</w:t>
       </w:r>
       <w:r>
-        <w:t xml:space="preserve"> URL: [OFFEN: Demo-URL] – Demo-Zugang mit der Rolle Interessent (Lesen und Simulation gemäss Matrix 8.1.2) und einem Konto je Rolle für den Vergleich der Berechtigungen; Zugangsdaten in der Begleitnotiz zum Angebot. Die Demo zeigt den Stand [OFFEN: Freeze-Datum und Version der Demo] anhand synthetischer Beispieldaten (Datensatz «SLIM Demo»): Neun fiktive Schiessplätze, Empfangspunkte, Zustände und Nutzungen sind generiert und enthalten keine echten Kunden-, Schiessplatz- oder Personendaten. Die Demo ist während der Evaluation eingefroren (kein Deployment, tägliche Rücksetzung der Daten) und läuft auf Schweizer Infrastruktur. Das Konzept ist ohne Aufruf der Demo vollständig bewertbar.</w:t>
+        <w:t xml:space="preserve"> URL: [OFFEN: Demo-URL] – Demo-Zugang in der Rolle Schiessplatz-Verantwortlicher, beschränkt auf die diesem Benutzer zugeordneten Schiessplätze (Lesen, Schusszahlenerfassung und Simulation gemäss Matrix 8.1.2); für die übrigen Rollen liegt je ein Konto bei; Zugangsdaten in der Begleitnotiz zum Angebot. Die Demo zeigt den Stand [OFFEN: Freeze-Datum und Version der Demo] anhand synthetischer Beispieldaten (Datensatz «SLIM Demo»): Neun fiktive Schiessplätze, Empfangspunkte, Zustände und Nutzungen sind generiert und enthalten keine echten Kunden-, Schiessplatz- oder Personendaten. Die Demo ist während der Evaluation eingefroren (kein Deployment, tägliche Rücksetzung der Daten) und läuft auf Schweizer Infrastruktur. Das Konzept ist ohne Aufruf der Demo vollständig bewertbar.</w:t>
       </w:r>
     </w:p>
     <w:p>
@@ -3775,7 +3820,7 @@
                 <w:sz w:val="17"/>
                 <w:szCs w:val="17"/>
               </w:rPr>
-              <w:t xml:space="preserve">P (Viewer, Layer, PDF-/Bild-Export, Vollansicht; Server-Druck ausstehend, weitere Layer LP5)</w:t>
+              <w:t xml:space="preserve">T (Viewer, Layer, PDF-/Bild-Export, Vollansicht umgesetzt; serverseitiger Druck ausstehend, weitere Layer LP5)</w:t>
             </w:r>
           </w:p>
         </w:tc>
@@ -8288,51 +8333,51 @@
                 <w:sz w:val="17"/>
                 <w:szCs w:val="17"/>
               </w:rPr>
-              <w:t xml:space="preserve">Deutsche Bezeichnungen der DB-Objekte</w:t>
-            </w:r>
-          </w:p>
-        </w:tc>
-        <w:tc>
-          <w:tcPr>
-            <w:tcMar>
-              <w:top w:type="dxa" w:w="20"/>
-              <w:left w:type="dxa" w:w="60"/>
-              <w:bottom w:type="dxa" w:w="20"/>
-              <w:right w:type="dxa" w:w="60"/>
-            </w:tcMar>
-          </w:tcPr>
-          <w:p>
-            <w:pPr>
-              <w:spacing w:after="0"/>
-            </w:pPr>
-            <w:r>
-              <w:rPr>
-                <w:sz w:val="17"/>
-                <w:szCs w:val="17"/>
-              </w:rPr>
-              <w:t xml:space="preserve">2.3</w:t>
-            </w:r>
-          </w:p>
-        </w:tc>
-        <w:tc>
-          <w:tcPr>
-            <w:tcMar>
-              <w:top w:type="dxa" w:w="20"/>
-              <w:left w:type="dxa" w:w="60"/>
-              <w:bottom w:type="dxa" w:w="20"/>
-              <w:right w:type="dxa" w:w="60"/>
-            </w:tcMar>
-          </w:tcPr>
-          <w:p>
-            <w:pPr>
-              <w:spacing w:after="0"/>
-            </w:pPr>
-            <w:r>
-              <w:rPr>
-                <w:sz w:val="17"/>
-                <w:szCs w:val="17"/>
-              </w:rPr>
-              <w:t xml:space="preserve">T (Tabellen, Teil der Spalten; übrige Spalten ausstehend)</w:t>
+              <w:t xml:space="preserve">Mehrsprachigkeit DE/FR/IT, lokalisierte Formate; deutsche Bezeichnungen der DB-Objekte</w:t>
+            </w:r>
+          </w:p>
+        </w:tc>
+        <w:tc>
+          <w:tcPr>
+            <w:tcMar>
+              <w:top w:type="dxa" w:w="20"/>
+              <w:left w:type="dxa" w:w="60"/>
+              <w:bottom w:type="dxa" w:w="20"/>
+              <w:right w:type="dxa" w:w="60"/>
+            </w:tcMar>
+          </w:tcPr>
+          <w:p>
+            <w:pPr>
+              <w:spacing w:after="0"/>
+            </w:pPr>
+            <w:r>
+              <w:rPr>
+                <w:sz w:val="17"/>
+                <w:szCs w:val="17"/>
+              </w:rPr>
+              <w:t xml:space="preserve">2.3, 5.4</w:t>
+            </w:r>
+          </w:p>
+        </w:tc>
+        <w:tc>
+          <w:tcPr>
+            <w:tcMar>
+              <w:top w:type="dxa" w:w="20"/>
+              <w:left w:type="dxa" w:w="60"/>
+              <w:bottom w:type="dxa" w:w="20"/>
+              <w:right w:type="dxa" w:w="60"/>
+            </w:tcMar>
+          </w:tcPr>
+          <w:p>
+            <w:pPr>
+              <w:spacing w:after="0"/>
+            </w:pPr>
+            <w:r>
+              <w:rPr>
+                <w:sz w:val="17"/>
+                <w:szCs w:val="17"/>
+              </w:rPr>
+              <w:t xml:space="preserve">T (Oberfläche in DE/FR/IT/EN umgesetzt; DB-Bezeichnungen: Tabellen und ein Teil der Spalten deutsch)</w:t>
             </w:r>
           </w:p>
         </w:tc>
@@ -8518,7 +8563,7 @@
                 <w:sz w:val="17"/>
                 <w:szCs w:val="17"/>
               </w:rPr>
-              <w:t xml:space="preserve">P (Hilfe je Seite, F1, Online-Hilfe; Handbuch-Inhalt ausstehend)</w:t>
+              <w:t xml:space="preserve">T (Hilfe je Seite, F1, Online-Hilfe umgesetzt; Inhalt des Handbuchs ausstehend)</w:t>
             </w:r>
           </w:p>
         </w:tc>

</xml_diff>

<commit_message>
Update content in solution concept and implementation status documents to reflect new import rules, data validation processes, and project milestones; enhance structure for clarity across chapters.
</commit_message>
<xml_diff>
--- a/docs/anforderungskatalog/C2-Loesungskonzept-SLIM.docx
+++ b/docs/anforderungskatalog/C2-Loesungskonzept-SLIM.docx
@@ -744,7 +744,7 @@
         <w:t xml:space="preserve">Zustände</w:t>
       </w:r>
       <w:r>
-        <w:t xml:space="preserve"> (ZustandsID, Referenzjahr, Baujahr-Klasse) mit Quellen, Empfangspunkten und WLR-Werten je Empfangspunkt × Quelle; genau ein Zustand je Schiessplatz ist «aktuell gültig» und genau einer «Stand MGDM» (Datenbank-Constraint). Nutzungen sind davon entkoppelt (Herkunft manuell/ELO/Import, Soft-Delete, Änderungshistorie im Logbuch); Mengen sind Dezimalzahlen mit Einheit (Stück oder kg Sprengstoff, B1 6.2/11.2.3) und werden ohne Rundungsverlust durch Erfassung, Schnittstelle, Import, Verteilung und Export geführt. Externe Identifikatoren (Koordinationsabschnitt-Nr., ZustandsID, QuellenID, sonARMS_ID) bleiben als eigene Attribute erhalten; interne Schlüssel sind UUIDs. Physische Datenbankobjekte sind deutsch benannt (B1 12.2, slm 51); die englischen Klassennamen des Codes sind logische Namen.</w:t>
+        <w:t xml:space="preserve"> (ZustandsID, Referenzjahr, Baujahr-Klasse) mit Quellen, Empfangspunkten und WLR-Werten je Empfangspunkt × Quelle; höchstens ein Zustand je Schiessplatz ist «aktuell gültig» und höchstens einer «Stand MGDM» (Unique-Index); der Zeiger wechselt in einer Transaktion von einem Zustand auf den anderen, ein Schiessplatz ohne Zustand gilt als «Keine Berechnungsgrundlage» (slm 4). Nutzungen sind davon entkoppelt (Herkunft manuell/ELO/Import, Soft-Delete, Änderungshistorie im Logbuch); Mengen sind Dezimalzahlen mit Einheit (Stück oder kg Sprengstoff, B1 6.2/11.2.3) und werden ohne Rundungsverlust durch Erfassung, Schnittstelle, Import, Verteilung und Export geführt. Externe Identifikatoren (Koordinationsabschnitt-Nr., ZustandsID, QuellenID, sonARMS_ID) bleiben als eigene Attribute erhalten; interne Schlüssel sind UUIDs. Physische Datenbankobjekte sind deutsch benannt (B1 12.2, slm 51); die englischen Klassennamen des Codes sind logische Namen.</w:t>
       </w:r>
     </w:p>
     <w:p>
@@ -801,7 +801,7 @@
         <w:t xml:space="preserve">Prototyp:</w:t>
       </w:r>
       <w:r>
-        <w:t xml:space="preserve"> Das Modell nach B1 Kapitel 10 (Abbildung 43) ist umgesetzt: Referenzstruktur, zustandsunabhängige Nutzungen mit n Positionen, Zustandsebene (Immissionsberechnung → Zustand → Anlageteile, Schusslinien mit Quelldaten Anhang 9/7, Immissionspunkte, Gebäude, WLR je Zeitgruppe, weitere FGDB-Objekte); zusammengesetzte Fremdschlüssel verhindern Verknüpfungen über Zustände hinweg, Unique-Indizes erzwingen genau einen aktuellen und einen MGDM-Zustand; der Berechnungsstand (Kopie der Nutzungen, Referenz-Snapshot, Kernversion, Prüfsumme) ist umgesetzt. Tabellen sind deutsch benannt, Spalten deutsch in Zustandsebene und Berechnungslauf; die Spalten der Referenzstruktur und der Nutzungen werden in LP1 umbenannt. Geometrien liegen im Prototyp als Text (WKT) vor, im Zielsystem als PostGIS-Geometrien.</w:t>
+        <w:t xml:space="preserve"> Das Modell nach B1 Kapitel 10 (Abbildung 43) ist umgesetzt: Referenzstruktur, zustandsunabhängige Nutzungen mit n Positionen, Zustandsebene (Immissionsberechnung → Zustand → Anlageteile, Schusslinien mit Quelldaten Anhang 9/7, Immissionspunkte, Gebäude, WLR je Zeitgruppe, weitere FGDB-Objekte); zusammengesetzte Fremdschlüssel verhindern Verknüpfungen über Zustände hinweg, Unique-Indizes lassen je Schiessplatz höchstens einen aktuellen und einen MGDM-Zustand zu, der Zeigerwechsel läuft in einer Transaktion; der Berechnungsstand (Kopie der Nutzungen, Referenz-Snapshot, Kernversion, Prüfsumme) ist umgesetzt. Tabellen sind deutsch benannt, Spalten deutsch in Zustandsebene und Berechnungslauf; die Spalten der Referenzstruktur und der Nutzungen werden in LP1 umbenannt. Geometrien liegen im Prototyp als Text (WKT) vor, im Zielsystem als PostGIS-Geometrien.</w:t>
       </w:r>
     </w:p>
     <w:p>
@@ -1156,7 +1156,7 @@
         <w:t xml:space="preserve">Schusszahlen (slm 37):</w:t>
       </w:r>
       <w:r>
-        <w:t xml:space="preserve"> Der Excel-Import nach der Vorlage B1.6 (B1 9.3) liest die erfassten Schiessblöcke, Zeitkategorien und Tagesanteile ein und ordnet sie den Betriebsdatenfenstern von SLIM zu, mit denselben Regeln wie Maske 5.11 und ELO; Zeilen mit unbekanntem Stellungsraum oder unzulässiger Kombination werden abgewiesen und im Bericht ausgewiesen. Jeder Importlauf trägt eine eindeutige Import-ID. Ein korrigierter Nachimport löscht nicht alle Daten des Schiessplatzes, sondern ersetzt gezielt die Datensätze dieser Import-ID oder des angegebenen Zeitraums nach einer mit KOMZ Lärm abgestimmten Ersatzregel.</w:t>
+        <w:t xml:space="preserve"> Der Excel-Import nach der Vorlage B1.6 (B1 9.3) liest die erfassten Schiessblöcke, Zeitkategorien und Tagesanteile ein und ordnet sie den Betriebsdatenfenstern von SLIM zu, mit denselben Regeln wie Maske 5.11 und ELO; Zeilen mit unbekanntem Stellungsraum oder unzulässiger Kombination werden abgewiesen und im Bericht ausgewiesen. Jeder Importlauf trägt eine eindeutige Import-ID. Ein korrigierter Nachimport ersetzt ausschliesslich die ausdrücklich ausgewählten Importdatensätze; manuelle Nutzungen, ELO-Meldungen und andere Importbestände bleiben unverändert. Wiederholungen desselben Imports erzeugen keine zusätzlichen Datensätze. Die Detailregeln für aggregierte Excel-Daten, Wiederholungsimporte und die Behandlung unvollständiger Erfassung werden vor Umsetzung mit KOMZ Lärm festgelegt und als Abnahmekriterien dokumentiert.</w:t>
       </w:r>
     </w:p>
     <w:p>
@@ -1186,7 +1186,7 @@
         <w:t xml:space="preserve">fachlich</w:t>
       </w:r>
       <w:r>
-        <w:t xml:space="preserve"> validiert (ausserhalb von SLIM); SLIM prüft beim Import Struktur und Zuordnung. SLIM liest und schreibt die FGDB (Anlagenteile, Empfangspunkte, WLR-DAY/WLR-NIGHT, Betriebsdaten A9/A7) direkt über die GDAL-Bibliotheken (OGR, Treiber OpenFileGDB); die Lese- und Schreibfähigkeit wird zu Projektbeginn mit den Testdaten von KOMZ Lärm validiert, das endgültige Schema gemäss FAQ 99 gemeinsam festgelegt. Die Daten werden in Staging geladen und geprüft: Quellen-IDs müssen auf bekannte Stellungsräume und Waffen abbilden, Empfangspunkte brauchen ES und EGID und werden über die sonARMS_ID abgeglichen, WLR-Werte müssen vollständig sein. Erst dann entsteht ein neuer </w:t>
+        <w:t xml:space="preserve"> validiert (ausserhalb von SLIM); SLIM prüft beim Import Struktur und Zuordnung. SLIM liest und schreibt die FGDB (Anlagenteile, Empfangspunkte, WLR-DAY/WLR-NIGHT, Betriebsdaten A9/A7) direkt über die GDAL-Bibliotheken (OGR, Treiber OpenFileGDB); die Lese- und Schreibfähigkeit wird zu Projektbeginn mit den Testdaten von KOMZ Lärm validiert, das endgültige Schema gemäss FAQ 99 gemeinsam festgelegt. Die Daten werden in Staging geladen und geprüft: Quellen-IDs müssen auf bekannte Stellungsräume und Waffen abbilden, Empfangspunkte brauchen ES und EGID und werden über die sonARMS_ID abgeglichen. Vorgeschlagener Ablauf, mit KOMZ Lärm zu bestätigen: (1) Eine fehlerhafte Datei oder nicht auflösbare Referenzen (Stellungsraum, Waffe/Kaliber, Empfangspunkt, Quelle) brechen die betreffende Importtransaktion ab; nichts wird übernommen. (2) Steht eine ergänzende WLR- oder Betriebsdaten-Datei noch aus (B1 5.19), bleibt der neue </w:t>
       </w:r>
       <w:r>
         <w:rPr>
@@ -1196,7 +1196,7 @@
         <w:t xml:space="preserve">Zustand</w:t>
       </w:r>
       <w:r>
-        <w:t xml:space="preserve">; frühere Zustände bleiben erhalten. </w:t>
+        <w:t xml:space="preserve"> ein unvollständiger Entwurf und nimmt die Nachlieferung auf. (3) Die Freigabe als «aktuell gültig» oder «Stand MGDM» setzt vollständige, konsistente WLR-Werte, erforderliche Betriebsdaten und auflösbare Quellenzuordnungen voraus. (4) Fehlende Pegel werden nie durch Nullwerte ersetzt; die betroffene Beurteilung gilt als «nicht beurteilbar». Frühere Zustände bleiben erhalten. </w:t>
       </w:r>
       <w:r>
         <w:rPr>
@@ -1206,7 +1206,7 @@
         <w:t xml:space="preserve">Prototyp:</w:t>
       </w:r>
       <w:r>
-        <w:t xml:space="preserve"> Import 5.19 umgesetzt: Staging, Validierung ohne Schreiben (Befunde, Warnungen, Zähler), Abbruch bei unbekanntem Stellungsraum oder doppeltem Anlageteil, ohne einen Datensatz zu schreiben (slm 45), Übernahme in einer Transaktion als neuer Zustand; WLR- und Betriebsdaten-Dateien je Zeitgruppe werden direkt gelesen. Die Berechnungsdatei selbst liest und schreibt der Prototyp als JSON derselben Struktur (FME-Export); die GDAL-Anbindung ersetzt diesen Schritt, die Prüfungen bleiben unverändert.</w:t>
+        <w:t xml:space="preserve"> Import 5.19 umgesetzt: Staging, Validierung ohne Schreiben (Befunde, Warnungen, Zähler), Abbruch bei unbekanntem Stellungsraum, doppelter Kennung (Anlageteil, Quelle, Empfangspunkt, WLR-Zeile), WLR-Zeile ohne Empfangspunkt oder Quelle der Lieferung oder widersprüchlicher Anhang-7-Kategorie, ohne einen Datensatz zu schreiben (slm 45); als Warnung im Prüf- und Importbericht stehen heute ein Waffensystem ohne zugeordnete Kombination (im Ziel ein Abbruch) und fehlende Tag- oder Abend-Pegel je Empfangspunkt × Quelle (die betroffenen Schüsse sind dort «nicht beurteilbar», die Abend-Pegel lassen sich als WLR NIGHT nachladen); die Vollständigkeitsprüfung bei der Freigabe fehlt noch; Übernahme in einer Transaktion als neuer Zustand; WLR- und Betriebsdaten-Dateien je Zeitgruppe werden direkt gelesen. Die Berechnungsdatei selbst liest und schreibt der Prototyp als JSON derselben Struktur (FME-Export); die GDAL-Anbindung ersetzt diesen Schritt; die Prüfmechanik bleibt, die fachlichen Abbruch- und Freigaberegeln werden an den bestätigten Ablauf angepasst.</w:t>
       </w:r>
     </w:p>
     <w:p>
@@ -1265,7 +1265,7 @@
         <w:t xml:space="preserve">Prototyp:</w:t>
       </w:r>
       <w:r>
-        <w:t xml:space="preserve"> Tabellen-Export als Excel (fester Kopfblock mit Titel, Auswahl, Filter, Exportdatum und Benutzer) und als CSV in der Übersicht der Schiessplätze und in den Schusszahlen, Excel-Export des Logbuchs und der Waffen-Stammdaten, Zustände als wieder importierbares Bündel (5.20), Schusszahlen als CSV. In LP1 folgen der Export in den übrigen Tabellen, das Format B1.6, die MPV-Statistik, die GeoDB und die Views.</w:t>
+        <w:t xml:space="preserve"> Tabellen-Export als Excel (fester Kopfblock mit Titel, Auswahl, Filter, Exportdatum und Benutzer) und als CSV in den Tabellen der Schiessplatz-Masken (Übersicht, 5.10–5.13), der Datenverwaltung (5.14–5.18, 5.21, Waffen, Auswahllisten) und der Benutzerverwaltung, Excel-Export des Logbuchs und der Waffen-Stammdaten, Zustände als wieder importierbares JSON-Bündel (5.20), Schusszahlen als CSV. In LP1 folgen das Format B1.6, die MPV-Statistik, die GeoDB und die Views.</w:t>
       </w:r>
     </w:p>
     <w:p>
@@ -1981,7 +1981,17 @@
         <w:t xml:space="preserve">Teiljahre und unterjährige Inbetriebnahme:</w:t>
       </w:r>
       <w:r>
-        <w:t xml:space="preserve"> Schusszahlen werden nicht hochgerechnet. SLIM unterscheidet erfasste Nullnutzung, fehlende Erfassung und verkürzte Betriebsphasen. Der Nenner des Jahresmittels ist die Anzahl der gewählten Kalenderjahre und wird nicht um Zeiten ohne Erfassung gekürzt; er steht mit den Jahren im Berechnungsstand.</w:t>
+        <w:t xml:space="preserve"> Schusszahlen werden nicht hochgerechnet. SLIM unterscheidet erfasste Nullnutzung, fehlende Erfassung und verkürzte Betriebsphasen; Kennzeichnung und Freigaberegeln dafür gehören zu den Detailregeln nach Kapitel 3.2. Der Nenner des Jahresmittels ist die Anzahl der gewählten Kalenderjahre und wird nicht um Zeiten ohne Erfassung gekürzt; er steht mit den Jahren im Berechnungsstand. </w:t>
+      </w:r>
+      <w:r>
+        <w:rPr>
+          <w:i/>
+          <w:iCs/>
+        </w:rPr>
+        <w:t xml:space="preserve">Prototyp:</w:t>
+      </w:r>
+      <w:r>
+        <w:t xml:space="preserve"> keine Hochrechnung, Nenner im Berechnungsstand; für fehlende Nutzungen gibt es heute nur die graue Ampel «keine Nutzungen erfasst», erfasste Nullnutzung und Betriebsphasen sind als Daten noch nicht vorhanden.</w:t>
       </w:r>
     </w:p>
     <w:p>
@@ -2022,7 +2032,7 @@
         <w:spacing w:after="120"/>
       </w:pPr>
       <w:r>
-        <w:t xml:space="preserve">Verbindliche Umsetzungsvorlage sind gemäss FAQ 19 und 98 die Formelblätter A9X und A7X der Beilage B1.4. Der Berechnungskern (Version 1.4.0) rechnet standardmässig nach diesen Formelblättern; die automatisierten Tests prüfen in jedem Build alle zwölf Empfangspunkte je Anhang gegen die hinterlegten Referenzwerte (Anhang 9: LAE1/LAE2 auf zwei Dezimalen, Lr auf eine; Anhang 7: Lr auf eine Dezimale; dazu einzelne ungerundete Kontrollwerte). Eine Übereinstimmung aller Excel-Zwischenwerte innerhalb 10⁻⁶ dB wird damit nicht behauptet. Auszug:</w:t>
+        <w:t xml:space="preserve">Verbindliche Umsetzungsvorlage sind gemäss FAQ 19 und 98 die Formelblätter A9X und A7X der Beilage B1.4. Der Berechnungskern (Version 1.5.0) rechnet standardmässig nach diesen Formelblättern; die automatisierten Tests prüfen in jedem Build alle zwölf Empfangspunkte je Anhang gegen die hinterlegten Referenzwerte (Anhang 9: LAE1/LAE2 auf zwei Dezimalen, Lr auf eine; Anhang 7: Lr auf eine Dezimale; dazu einzelne ungerundete Kontrollwerte). Eine Übereinstimmung aller Excel-Zwischenwerte innerhalb 10⁻⁶ dB wird damit nicht behauptet. Auszug:</w:t>
       </w:r>
     </w:p>
     <w:tbl>
@@ -2679,7 +2689,7 @@
         <w:t xml:space="preserve">Prototyp:</w:t>
       </w:r>
       <w:r>
-        <w:t xml:space="preserve"> Sortierung, Suche und Filter in den Tabellen, Mehrfachselektion in den Schusszahlen; Excel-Export mit festem Kopfblock und CSV-Export der angezeigten oder markierten Zeilen in der Übersicht der Schiessplätze und in den Schusszahlen, jeder Export im Logbuch. Export in den übrigen Tabellen, Filter je Spalte mit Operatoren, Spaltenauswahl und persistente Filter folgen in der gemeinsamen Komponente.</w:t>
+        <w:t xml:space="preserve"> Sortierung, Suche und Filter in den Tabellen; Mehrfachselektion (auch mit Umschalt-Klick) sowie Excel-Export mit festem Kopfblock und CSV-Export der angezeigten oder markierten Zeilen in den Tabellen der Schiessplatz-Masken, der Datenverwaltung und der Benutzerverwaltung (Details 5.12 ohne Selektion, Logbuch mit eigenem Excel-Export), jeder Export im Logbuch. Filter je Spalte mit Operatoren, Spaltenauswahl und persistente Filter folgen in der gemeinsamen Komponente.</w:t>
       </w:r>
     </w:p>
     <w:p>
@@ -2863,7 +2873,7 @@
         <w:spacing w:after="120"/>
       </w:pPr>
       <w:r>
-        <w:t xml:space="preserve">Monorepo mit getrennten Modulen (Stammdaten, Nutzungen, Berechnung, Datenverwaltung, Import/Export, Benutzer/Rollen, Logbuch), generiertem API-Vertrag und automatisch dokumentiertem Datenmodell; Fachparameter (Rollen, Rechte, Auswahllisten, Grenzwerte, Ampelschwellen, Rundung, Sperrdatum, Feiertage, Kartenlayer) sind Konfiguration ohne Rekompilierung; neue Masken entstehen aus Design System, Facade und generiertem Client. Qualitätssicherung in jedem Build (Stand 02.10.2026, alle bestanden): Lint; 433 API-Tests (Berechnungskern gegen B1.4, Rechenfälle, Service- und HTTP-Tests je Controller mit Rechtematrix); 260 Oberflächen-Tests; 27 Tests der Kartenbibliothek; dazu End-to-End-Fälle (Playwright) für Anmeldung, Startseite, Schiessplatz-Masken und Datenverwaltung sowie Kriterien-Fälle je B1-Anforderung als Skelett mit Prüfschritten, die mit der jeweiligen Maske automatisiert werden. </w:t>
+        <w:t xml:space="preserve">Monorepo mit getrennten Modulen (Stammdaten, Nutzungen, Berechnung, Datenverwaltung, Import/Export, Benutzer/Rollen, Logbuch), generiertem API-Vertrag und automatisch dokumentiertem Datenmodell; Fachparameter (Rollen, Rechte, Auswahllisten, Grenzwerte, Ampelschwellen, Rundung, Sperrdatum, Feiertage, Kartenlayer) sind Konfiguration ohne Rekompilierung; neue Masken entstehen aus Design System, Facade und generiertem Client. Qualitätssicherung in jedem Build (Stand 02.10.2026, alle bestanden): Lint; 434 API-Tests (Berechnungskern gegen B1.4, Rechenfälle, Service- und HTTP-Tests je Controller mit Rechtematrix); 296 Oberflächen-Tests; 27 Tests der Kartenbibliothek; dazu End-to-End-Fälle (Playwright) für Anmeldung, Startseite, Schiessplatz-Masken, Datenverwaltung und Tabellenfunktionen sowie Kriterien-Fälle je B1-Anforderung als Skelett mit Prüfschritten, die mit der jeweiligen Maske automatisiert werden. </w:t>
       </w:r>
       <w:r>
         <w:rPr>
@@ -3913,7 +3923,7 @@
                 <w:sz w:val="17"/>
                 <w:szCs w:val="17"/>
               </w:rPr>
-              <w:t xml:space="preserve">T (Excel/CSV mit Kopfblock in zwei Tabellen; übrige Tabellen, Spaltenfilter ausstehend)</w:t>
+              <w:t xml:space="preserve">T (Sortierung, Mehrfachselektion, Excel/CSV mit Kopfblock in den Fachtabellen; Spaltenfilter, Spaltenauswahl, persistente Filter ausstehend)</w:t>
             </w:r>
           </w:p>
         </w:tc>
@@ -6517,7 +6527,7 @@
                 <w:sz w:val="17"/>
                 <w:szCs w:val="17"/>
               </w:rPr>
-              <w:t xml:space="preserve">P</w:t>
+              <w:t xml:space="preserve">P (Kern und Service mit Feiertagskalender je Schiessplatz; Pflege des Kalenders in der Maske ausstehend)</w:t>
             </w:r>
           </w:p>
         </w:tc>
@@ -6703,7 +6713,7 @@
                 <w:sz w:val="17"/>
                 <w:szCs w:val="17"/>
               </w:rPr>
-              <w:t xml:space="preserve">P (nach A9X/A7X, Kernversion 1.4.0)</w:t>
+              <w:t xml:space="preserve">P (nach A9X/A7X, Kernversion 1.5.0)</w:t>
             </w:r>
           </w:p>
         </w:tc>
@@ -7261,7 +7271,7 @@
                 <w:sz w:val="17"/>
                 <w:szCs w:val="17"/>
               </w:rPr>
-              <w:t xml:space="preserve">T (einzelne Exporte; übrige ausstehend)</w:t>
+              <w:t xml:space="preserve">T (Tabellen-Exporte als Excel und CSV; Logbuch nur Excel; Exporte slm 40/41 ausstehend)</w:t>
             </w:r>
           </w:p>
         </w:tc>
@@ -7726,7 +7736,7 @@
                 <w:sz w:val="17"/>
                 <w:szCs w:val="17"/>
               </w:rPr>
-              <w:t xml:space="preserve">P</w:t>
+              <w:t xml:space="preserve">P (Zustand und Zeitraum in der Maske wählbar; repräsentative Einzeljahre in der API, Auswahl in der Maske ausstehend)</w:t>
             </w:r>
           </w:p>
         </w:tc>

</xml_diff>

<commit_message>
Document hosting provider decision: updated SLIM solution concept and requirements checklist to reflect usage of Infomaniak Network SA with supporting notes on data residency, compliance, and operational details.
</commit_message>
<xml_diff>
--- a/docs/anforderungskatalog/C2-Loesungskonzept-SLIM.docx
+++ b/docs/anforderungskatalog/C2-Loesungskonzept-SLIM.docx
@@ -26,7 +26,7 @@
           <w:sz w:val="23"/>
           <w:szCs w:val="23"/>
         </w:rPr>
-        <w:t xml:space="preserve">Stand 2.10.2026</w:t>
+        <w:t xml:space="preserve">Stand 3.10.2026</w:t>
       </w:r>
     </w:p>
     <w:p>
@@ -972,7 +972,7 @@
         <w:spacing w:after="120"/>
       </w:pPr>
       <w:r>
-        <w:t xml:space="preserve">[PLATZHALTER FIRMA] betreibt SLIM auf der Infrastruktur von [OFFEN: Hosting-Anbieter] in Schweizer Rechenzentren (reiner Infrastrukturanbieter gemäss FAQ 132, 140 und 180; Anforderungen: ISO 27001, IT-Grundschutz Si001). Sämtliche Applikations- und Projektdaten – alle Umgebungen, Sicherungen, Protokolle, Quellcode und Entwicklungsdaten – werden zu 100 % in der Schweiz gespeichert und bearbeitet; keine Kopie verlässt die Schweiz, auch nicht zu Sicherungszwecken (E1; Nachweis je System im Datenhaltungskonzept). Ein Wechsel des Hosting-Anbieters wird der Auftraggeberin zur Genehmigung vorgelegt. Drei getrennte Umgebungen (Entwicklung, Akzeptanz, Produktion) mit identischen Container-Images; NGINX terminiert TLS (≥ 1.2), liefert den Angular-Build und leitet </w:t>
+        <w:t xml:space="preserve">[PLATZHALTER FIRMA] betreibt SLIM auf der Infrastruktur der Infomaniak Network SA in deren eigenen Rechenzentren in Genf, Schweiz (reiner Infrastrukturanbieter gemäss FAQ 132, 140 und 180; Anforderungen: ISO 27001, IT-Grundschutz Si001). Sämtliche Applikations- und Projektdaten – alle Umgebungen, Sicherungen, Protokolle, Quellcode und Entwicklungsdaten – werden zu 100 % in der Schweiz gespeichert und bearbeitet; keine Kopie verlässt die Schweiz, auch nicht zu Sicherungszwecken (E1; Nachweis je System im Datenhaltungskonzept). Ein Wechsel des Hosting-Anbieters wird der Auftraggeberin zur Genehmigung vorgelegt. Drei getrennte Umgebungen (Entwicklung, Akzeptanz, Produktion) mit identischen Container-Images; NGINX terminiert TLS (≥ 1.2), liefert den Angular-Build und leitet </w:t>
       </w:r>
       <w:r>
         <w:rPr>

</xml_diff>